<commit_message>
chore: remove unused file configurations and associated implementation code
</commit_message>
<xml_diff>
--- a/大作业文档.docx
+++ b/大作业文档.docx
@@ -1,13 +1,13 @@
 
 <file path=word/document.xml><?xml version="1.0" encoding="utf-8"?>
-<w:document xmlns:wpc="http://schemas.microsoft.com/office/word/2010/wordprocessingCanvas" xmlns:mc="http://schemas.openxmlformats.org/markup-compatibility/2006" xmlns:o="urn:schemas-microsoft-com:office:office" xmlns:r="http://schemas.openxmlformats.org/officeDocument/2006/relationships" xmlns:m="http://schemas.openxmlformats.org/officeDocument/2006/math" xmlns:v="urn:schemas-microsoft-com:vml" xmlns:wp14="http://schemas.microsoft.com/office/word/2010/wordprocessingDrawing" xmlns:wp="http://schemas.openxmlformats.org/drawingml/2006/wordprocessingDrawing" xmlns:w="http://schemas.openxmlformats.org/wordprocessingml/2006/main" xmlns:w14="http://schemas.microsoft.com/office/word/2010/wordml" xmlns:w10="urn:schemas-microsoft-com:office:word" xmlns:w15="http://schemas.microsoft.com/office/word/2012/wordml" xmlns:wpg="http://schemas.microsoft.com/office/word/2010/wordprocessingGroup" xmlns:wpi="http://schemas.microsoft.com/office/word/2010/wordprocessingInk" xmlns:wne="http://schemas.microsoft.com/office/word/2006/wordml" xmlns:wps="http://schemas.microsoft.com/office/word/2010/wordprocessingShape" xmlns:wpsCustomData="http://www.wps.cn/officeDocument/2013/wpsCustomData" mc:Ignorable="w14 w15 wp14">
+<w:document xmlns:wpc="http://schemas.microsoft.com/office/word/2010/wordprocessingCanvas" xmlns:cx="http://schemas.microsoft.com/office/drawing/2014/chartex" xmlns:cx1="http://schemas.microsoft.com/office/drawing/2015/9/8/chartex" xmlns:cx2="http://schemas.microsoft.com/office/drawing/2015/10/21/chartex" xmlns:cx3="http://schemas.microsoft.com/office/drawing/2016/5/9/chartex" xmlns:cx4="http://schemas.microsoft.com/office/drawing/2016/5/10/chartex" xmlns:cx5="http://schemas.microsoft.com/office/drawing/2016/5/11/chartex" xmlns:cx6="http://schemas.microsoft.com/office/drawing/2016/5/12/chartex" xmlns:cx7="http://schemas.microsoft.com/office/drawing/2016/5/13/chartex" xmlns:cx8="http://schemas.microsoft.com/office/drawing/2016/5/14/chartex" xmlns:mc="http://schemas.openxmlformats.org/markup-compatibility/2006" xmlns:aink="http://schemas.microsoft.com/office/drawing/2016/ink" xmlns:am3d="http://schemas.microsoft.com/office/drawing/2017/model3d" xmlns:o="urn:schemas-microsoft-com:office:office" xmlns:oel="http://schemas.microsoft.com/office/2019/extlst" xmlns:r="http://schemas.openxmlformats.org/officeDocument/2006/relationships" xmlns:m="http://schemas.openxmlformats.org/officeDocument/2006/math" xmlns:v="urn:schemas-microsoft-com:vml" xmlns:wp14="http://schemas.microsoft.com/office/word/2010/wordprocessingDrawing" xmlns:wp="http://schemas.openxmlformats.org/drawingml/2006/wordprocessingDrawing" xmlns:w10="urn:schemas-microsoft-com:office:word" xmlns:w="http://schemas.openxmlformats.org/wordprocessingml/2006/main" xmlns:w14="http://schemas.microsoft.com/office/word/2010/wordml" xmlns:w15="http://schemas.microsoft.com/office/word/2012/wordml" xmlns:w16cex="http://schemas.microsoft.com/office/word/2018/wordml/cex" xmlns:w16cid="http://schemas.microsoft.com/office/word/2016/wordml/cid" xmlns:w16="http://schemas.microsoft.com/office/word/2018/wordml" xmlns:w16du="http://schemas.microsoft.com/office/word/2023/wordml/word16du" xmlns:w16sdtdh="http://schemas.microsoft.com/office/word/2020/wordml/sdtdatahash" xmlns:w16sdtfl="http://schemas.microsoft.com/office/word/2024/wordml/sdtformatlock" xmlns:w16se="http://schemas.microsoft.com/office/word/2015/wordml/symex" xmlns:wpg="http://schemas.microsoft.com/office/word/2010/wordprocessingGroup" xmlns:wpi="http://schemas.microsoft.com/office/word/2010/wordprocessingInk" xmlns:wne="http://schemas.microsoft.com/office/word/2006/wordml" xmlns:wps="http://schemas.microsoft.com/office/word/2010/wordprocessingShape" mc:Ignorable="w14 w15 w16se w16cid w16 w16cex w16sdtdh w16sdtfl w16du wp14">
   <w:body>
     <w:p>
       <w:pPr>
         <w:widowControl/>
         <w:jc w:val="left"/>
         <w:rPr>
-          <w:rFonts w:ascii="Times New Roman" w:hAnsi="Times New Roman" w:eastAsia="宋体"/>
+          <w:rFonts w:ascii="Times New Roman" w:eastAsia="宋体" w:hAnsi="Times New Roman" w:hint="eastAsia"/>
         </w:rPr>
       </w:pPr>
     </w:p>
@@ -16,7 +16,7 @@
         <w:widowControl/>
         <w:jc w:val="left"/>
         <w:rPr>
-          <w:rFonts w:ascii="Times New Roman" w:hAnsi="Times New Roman" w:eastAsia="宋体"/>
+          <w:rFonts w:ascii="Times New Roman" w:eastAsia="宋体" w:hAnsi="Times New Roman"/>
         </w:rPr>
       </w:pPr>
     </w:p>
@@ -25,7 +25,7 @@
         <w:spacing w:line="960" w:lineRule="auto"/>
         <w:jc w:val="center"/>
         <w:rPr>
-          <w:rFonts w:ascii="Times New Roman" w:hAnsi="Times New Roman" w:eastAsia="宋体" w:cs="Times New Roman"/>
+          <w:rFonts w:ascii="Times New Roman" w:eastAsia="宋体" w:hAnsi="Times New Roman" w:cs="Times New Roman"/>
           <w:b/>
           <w:bCs/>
           <w:spacing w:val="100"/>
@@ -35,171 +35,297 @@
       </w:pPr>
       <w:r>
         <w:rPr>
-          <w:rFonts w:ascii="Times New Roman" w:hAnsi="Times New Roman" w:eastAsia="宋体" w:cs="Times New Roman"/>
+          <w:rFonts w:ascii="Times New Roman" w:eastAsia="宋体" w:hAnsi="Times New Roman" w:cs="Times New Roman"/>
           <w:szCs w:val="24"/>
         </w:rPr>
         <w:fldChar w:fldCharType="begin"/>
       </w:r>
       <w:r>
         <w:rPr>
-          <w:rFonts w:hint="eastAsia" w:ascii="Times New Roman" w:hAnsi="Times New Roman" w:eastAsia="宋体" w:cs="Times New Roman"/>
-          <w:szCs w:val="24"/>
-        </w:rPr>
-        <w:instrText xml:space="preserve"> INCLUDEPICTURE "D:\\backup\\实践管理科\\JNDX_M.GIF" \* MERGEFORMAT </w:instrText>
-      </w:r>
-      <w:r>
-        <w:rPr>
-          <w:rFonts w:ascii="Times New Roman" w:hAnsi="Times New Roman" w:eastAsia="宋体" w:cs="Times New Roman"/>
+          <w:rFonts w:ascii="Times New Roman" w:eastAsia="宋体" w:hAnsi="Times New Roman" w:cs="Times New Roman" w:hint="eastAsia"/>
+          <w:szCs w:val="24"/>
+        </w:rPr>
+        <w:instrText xml:space="preserve"> INCLUDEPICTURE "D:\\backup\\</w:instrText>
+      </w:r>
+      <w:r>
+        <w:rPr>
+          <w:rFonts w:ascii="Times New Roman" w:eastAsia="宋体" w:hAnsi="Times New Roman" w:cs="Times New Roman" w:hint="eastAsia"/>
+          <w:szCs w:val="24"/>
+        </w:rPr>
+        <w:instrText>实践管理科</w:instrText>
+      </w:r>
+      <w:r>
+        <w:rPr>
+          <w:rFonts w:ascii="Times New Roman" w:eastAsia="宋体" w:hAnsi="Times New Roman" w:cs="Times New Roman" w:hint="eastAsia"/>
+          <w:szCs w:val="24"/>
+        </w:rPr>
+        <w:instrText xml:space="preserve">\\JNDX_M.GIF" \* MERGEFORMAT </w:instrText>
+      </w:r>
+      <w:r>
+        <w:rPr>
+          <w:rFonts w:ascii="Times New Roman" w:eastAsia="宋体" w:hAnsi="Times New Roman" w:cs="Times New Roman"/>
           <w:szCs w:val="24"/>
         </w:rPr>
         <w:fldChar w:fldCharType="separate"/>
       </w:r>
       <w:r>
         <w:rPr>
-          <w:rFonts w:ascii="Times New Roman" w:hAnsi="Times New Roman" w:eastAsia="宋体" w:cs="Times New Roman"/>
+          <w:rFonts w:ascii="Times New Roman" w:eastAsia="宋体" w:hAnsi="Times New Roman" w:cs="Times New Roman"/>
           <w:szCs w:val="24"/>
         </w:rPr>
         <w:fldChar w:fldCharType="begin"/>
       </w:r>
       <w:r>
         <w:rPr>
-          <w:rFonts w:ascii="Times New Roman" w:hAnsi="Times New Roman" w:eastAsia="宋体" w:cs="Times New Roman"/>
+          <w:rFonts w:ascii="Times New Roman" w:eastAsia="宋体" w:hAnsi="Times New Roman" w:cs="Times New Roman"/>
           <w:szCs w:val="24"/>
         </w:rPr>
         <w:instrText xml:space="preserve"> </w:instrText>
       </w:r>
       <w:r>
         <w:rPr>
-          <w:rFonts w:hint="eastAsia" w:ascii="Times New Roman" w:hAnsi="Times New Roman" w:eastAsia="宋体" w:cs="Times New Roman"/>
-          <w:szCs w:val="24"/>
-        </w:rPr>
-        <w:instrText xml:space="preserve">INCLUDEPICTURE  "D:\\backup\\实践管理科\\JNDX_M.GIF" \* MERGEFORMATINET</w:instrText>
-      </w:r>
-      <w:r>
-        <w:rPr>
-          <w:rFonts w:ascii="Times New Roman" w:hAnsi="Times New Roman" w:eastAsia="宋体" w:cs="Times New Roman"/>
+          <w:rFonts w:ascii="Times New Roman" w:eastAsia="宋体" w:hAnsi="Times New Roman" w:cs="Times New Roman" w:hint="eastAsia"/>
+          <w:szCs w:val="24"/>
+        </w:rPr>
+        <w:instrText>INCLUDEPICTURE  "D:\\backup\\</w:instrText>
+      </w:r>
+      <w:r>
+        <w:rPr>
+          <w:rFonts w:ascii="Times New Roman" w:eastAsia="宋体" w:hAnsi="Times New Roman" w:cs="Times New Roman" w:hint="eastAsia"/>
+          <w:szCs w:val="24"/>
+        </w:rPr>
+        <w:instrText>实践管理科</w:instrText>
+      </w:r>
+      <w:r>
+        <w:rPr>
+          <w:rFonts w:ascii="Times New Roman" w:eastAsia="宋体" w:hAnsi="Times New Roman" w:cs="Times New Roman" w:hint="eastAsia"/>
+          <w:szCs w:val="24"/>
+        </w:rPr>
+        <w:instrText>\\JNDX_M.GIF" \* MERGEFORMATINET</w:instrText>
+      </w:r>
+      <w:r>
+        <w:rPr>
+          <w:rFonts w:ascii="Times New Roman" w:eastAsia="宋体" w:hAnsi="Times New Roman" w:cs="Times New Roman"/>
           <w:szCs w:val="24"/>
         </w:rPr>
         <w:instrText xml:space="preserve"> </w:instrText>
       </w:r>
       <w:r>
         <w:rPr>
-          <w:rFonts w:ascii="Times New Roman" w:hAnsi="Times New Roman" w:eastAsia="宋体" w:cs="Times New Roman"/>
+          <w:rFonts w:ascii="Times New Roman" w:eastAsia="宋体" w:hAnsi="Times New Roman" w:cs="Times New Roman"/>
           <w:szCs w:val="24"/>
         </w:rPr>
         <w:fldChar w:fldCharType="separate"/>
       </w:r>
       <w:r>
         <w:rPr>
-          <w:rFonts w:ascii="Times New Roman" w:hAnsi="Times New Roman" w:eastAsia="宋体" w:cs="Times New Roman"/>
+          <w:rFonts w:ascii="Times New Roman" w:eastAsia="宋体" w:hAnsi="Times New Roman" w:cs="Times New Roman"/>
           <w:szCs w:val="24"/>
         </w:rPr>
         <w:fldChar w:fldCharType="begin"/>
       </w:r>
       <w:r>
         <w:rPr>
-          <w:rFonts w:ascii="Times New Roman" w:hAnsi="Times New Roman" w:eastAsia="宋体" w:cs="Times New Roman"/>
+          <w:rFonts w:ascii="Times New Roman" w:eastAsia="宋体" w:hAnsi="Times New Roman" w:cs="Times New Roman"/>
           <w:szCs w:val="24"/>
         </w:rPr>
         <w:instrText xml:space="preserve"> </w:instrText>
       </w:r>
       <w:r>
         <w:rPr>
-          <w:rFonts w:hint="eastAsia" w:ascii="Times New Roman" w:hAnsi="Times New Roman" w:eastAsia="宋体" w:cs="Times New Roman"/>
-          <w:szCs w:val="24"/>
-        </w:rPr>
-        <w:instrText xml:space="preserve">INCLUDEPICTURE  "D:\\backup\\实践管理科\\JNDX_M.GIF" \* MERGEFORMATINET</w:instrText>
-      </w:r>
-      <w:r>
-        <w:rPr>
-          <w:rFonts w:ascii="Times New Roman" w:hAnsi="Times New Roman" w:eastAsia="宋体" w:cs="Times New Roman"/>
+          <w:rFonts w:ascii="Times New Roman" w:eastAsia="宋体" w:hAnsi="Times New Roman" w:cs="Times New Roman" w:hint="eastAsia"/>
+          <w:szCs w:val="24"/>
+        </w:rPr>
+        <w:instrText>INCLUDEPICTURE  "D:\\backup\\</w:instrText>
+      </w:r>
+      <w:r>
+        <w:rPr>
+          <w:rFonts w:ascii="Times New Roman" w:eastAsia="宋体" w:hAnsi="Times New Roman" w:cs="Times New Roman" w:hint="eastAsia"/>
+          <w:szCs w:val="24"/>
+        </w:rPr>
+        <w:instrText>实践管理科</w:instrText>
+      </w:r>
+      <w:r>
+        <w:rPr>
+          <w:rFonts w:ascii="Times New Roman" w:eastAsia="宋体" w:hAnsi="Times New Roman" w:cs="Times New Roman" w:hint="eastAsia"/>
+          <w:szCs w:val="24"/>
+        </w:rPr>
+        <w:instrText>\\JNDX_M.GIF" \* MERGEFORMATINET</w:instrText>
+      </w:r>
+      <w:r>
+        <w:rPr>
+          <w:rFonts w:ascii="Times New Roman" w:eastAsia="宋体" w:hAnsi="Times New Roman" w:cs="Times New Roman"/>
           <w:szCs w:val="24"/>
         </w:rPr>
         <w:instrText xml:space="preserve"> </w:instrText>
       </w:r>
       <w:r>
         <w:rPr>
-          <w:rFonts w:ascii="Times New Roman" w:hAnsi="Times New Roman" w:eastAsia="宋体" w:cs="Times New Roman"/>
+          <w:rFonts w:ascii="Times New Roman" w:eastAsia="宋体" w:hAnsi="Times New Roman" w:cs="Times New Roman"/>
           <w:szCs w:val="24"/>
         </w:rPr>
         <w:fldChar w:fldCharType="separate"/>
       </w:r>
       <w:r>
         <w:rPr>
-          <w:rFonts w:ascii="Times New Roman" w:hAnsi="Times New Roman" w:eastAsia="宋体" w:cs="Times New Roman"/>
+          <w:rFonts w:ascii="Times New Roman" w:eastAsia="宋体" w:hAnsi="Times New Roman" w:cs="Times New Roman"/>
           <w:szCs w:val="24"/>
         </w:rPr>
         <w:fldChar w:fldCharType="begin"/>
       </w:r>
       <w:r>
         <w:rPr>
-          <w:rFonts w:ascii="Times New Roman" w:hAnsi="Times New Roman" w:eastAsia="宋体" w:cs="Times New Roman"/>
+          <w:rFonts w:ascii="Times New Roman" w:eastAsia="宋体" w:hAnsi="Times New Roman" w:cs="Times New Roman"/>
           <w:szCs w:val="24"/>
         </w:rPr>
         <w:instrText xml:space="preserve"> </w:instrText>
       </w:r>
       <w:r>
         <w:rPr>
-          <w:rFonts w:hint="eastAsia" w:ascii="Times New Roman" w:hAnsi="Times New Roman" w:eastAsia="宋体" w:cs="Times New Roman"/>
-          <w:szCs w:val="24"/>
-        </w:rPr>
-        <w:instrText xml:space="preserve">INCLUDEPICTURE  "D:\\实践管理科\\JNDX_M.GIF" \* MERGEFORMATINET</w:instrText>
-      </w:r>
-      <w:r>
-        <w:rPr>
-          <w:rFonts w:ascii="Times New Roman" w:hAnsi="Times New Roman" w:eastAsia="宋体" w:cs="Times New Roman"/>
+          <w:rFonts w:ascii="Times New Roman" w:eastAsia="宋体" w:hAnsi="Times New Roman" w:cs="Times New Roman" w:hint="eastAsia"/>
+          <w:szCs w:val="24"/>
+        </w:rPr>
+        <w:instrText>INCLUDEPICTURE  "D:\\</w:instrText>
+      </w:r>
+      <w:r>
+        <w:rPr>
+          <w:rFonts w:ascii="Times New Roman" w:eastAsia="宋体" w:hAnsi="Times New Roman" w:cs="Times New Roman" w:hint="eastAsia"/>
+          <w:szCs w:val="24"/>
+        </w:rPr>
+        <w:instrText>实践管理科</w:instrText>
+      </w:r>
+      <w:r>
+        <w:rPr>
+          <w:rFonts w:ascii="Times New Roman" w:eastAsia="宋体" w:hAnsi="Times New Roman" w:cs="Times New Roman" w:hint="eastAsia"/>
+          <w:szCs w:val="24"/>
+        </w:rPr>
+        <w:instrText>\\JNDX_M.GIF" \* MERGEFORMATINET</w:instrText>
+      </w:r>
+      <w:r>
+        <w:rPr>
+          <w:rFonts w:ascii="Times New Roman" w:eastAsia="宋体" w:hAnsi="Times New Roman" w:cs="Times New Roman"/>
           <w:szCs w:val="24"/>
         </w:rPr>
         <w:instrText xml:space="preserve"> </w:instrText>
       </w:r>
       <w:r>
         <w:rPr>
-          <w:rFonts w:ascii="Times New Roman" w:hAnsi="Times New Roman" w:eastAsia="宋体" w:cs="Times New Roman"/>
+          <w:rFonts w:ascii="Times New Roman" w:eastAsia="宋体" w:hAnsi="Times New Roman" w:cs="Times New Roman"/>
           <w:szCs w:val="24"/>
         </w:rPr>
         <w:fldChar w:fldCharType="separate"/>
       </w:r>
       <w:r>
         <w:rPr>
-          <w:rFonts w:ascii="Times New Roman" w:hAnsi="Times New Roman" w:eastAsia="宋体" w:cs="Times New Roman"/>
+          <w:rFonts w:ascii="Times New Roman" w:eastAsia="宋体" w:hAnsi="Times New Roman" w:cs="Times New Roman"/>
+          <w:szCs w:val="24"/>
+        </w:rPr>
+        <w:fldChar w:fldCharType="begin"/>
+      </w:r>
+      <w:r>
+        <w:rPr>
+          <w:rFonts w:ascii="Times New Roman" w:eastAsia="宋体" w:hAnsi="Times New Roman" w:cs="Times New Roman"/>
+          <w:szCs w:val="24"/>
+        </w:rPr>
+        <w:instrText xml:space="preserve"> </w:instrText>
+      </w:r>
+      <w:r>
+        <w:rPr>
+          <w:rFonts w:ascii="Times New Roman" w:eastAsia="宋体" w:hAnsi="Times New Roman" w:cs="Times New Roman" w:hint="eastAsia"/>
+          <w:szCs w:val="24"/>
+        </w:rPr>
+        <w:instrText>INCLUDEPICTURE  "/Users/../</w:instrText>
+      </w:r>
+      <w:r>
+        <w:rPr>
+          <w:rFonts w:ascii="Times New Roman" w:eastAsia="宋体" w:hAnsi="Times New Roman" w:cs="Times New Roman" w:hint="eastAsia"/>
+          <w:szCs w:val="24"/>
+        </w:rPr>
+        <w:instrText>实践管理科</w:instrText>
+      </w:r>
+      <w:r>
+        <w:rPr>
+          <w:rFonts w:ascii="Times New Roman" w:eastAsia="宋体" w:hAnsi="Times New Roman" w:cs="Times New Roman" w:hint="eastAsia"/>
+          <w:szCs w:val="24"/>
+        </w:rPr>
+        <w:instrText>/JNDX_M.GIF" \* MERGEFORMATINET</w:instrText>
+      </w:r>
+      <w:r>
+        <w:rPr>
+          <w:rFonts w:ascii="Times New Roman" w:eastAsia="宋体" w:hAnsi="Times New Roman" w:cs="Times New Roman"/>
+          <w:szCs w:val="24"/>
+        </w:rPr>
+        <w:instrText xml:space="preserve"> </w:instrText>
+      </w:r>
+      <w:r>
+        <w:rPr>
+          <w:rFonts w:ascii="Times New Roman" w:eastAsia="宋体" w:hAnsi="Times New Roman" w:cs="Times New Roman"/>
+          <w:szCs w:val="24"/>
+        </w:rPr>
+        <w:fldChar w:fldCharType="separate"/>
+      </w:r>
+      <w:r>
+        <w:rPr>
+          <w:rFonts w:ascii="Times New Roman" w:eastAsia="宋体" w:hAnsi="Times New Roman" w:cs="Times New Roman"/>
+          <w:noProof/>
           <w:szCs w:val="24"/>
         </w:rPr>
         <w:pict>
-          <v:shape id="_x0000_i1025" o:spt="75" type="#_x0000_t75" style="height:58.2pt;width:173.95pt;" filled="f" o:preferrelative="t" stroked="f" coordsize="21600,21600">
-            <v:path/>
-            <v:fill on="f" focussize="0,0"/>
-            <v:stroke on="f" joinstyle="miter"/>
-            <v:imagedata r:id="rId7" r:href="rId8" o:title=""/>
+          <v:shapetype id="_x0000_t75" coordsize="21600,21600" o:spt="75" o:preferrelative="t" path="m@4@5l@4@11@9@11@9@5xe" filled="f" stroked="f">
+            <v:stroke joinstyle="miter"/>
+            <v:formulas>
+              <v:f eqn="if lineDrawn pixelLineWidth 0"/>
+              <v:f eqn="sum @0 1 0"/>
+              <v:f eqn="sum 0 0 @1"/>
+              <v:f eqn="prod @2 1 2"/>
+              <v:f eqn="prod @3 21600 pixelWidth"/>
+              <v:f eqn="prod @3 21600 pixelHeight"/>
+              <v:f eqn="sum @0 0 1"/>
+              <v:f eqn="prod @6 1 2"/>
+              <v:f eqn="prod @7 21600 pixelWidth"/>
+              <v:f eqn="sum @8 21600 0"/>
+              <v:f eqn="prod @7 21600 pixelHeight"/>
+              <v:f eqn="sum @10 21600 0"/>
+            </v:formulas>
+            <v:path o:extrusionok="f" gradientshapeok="t" o:connecttype="rect"/>
             <o:lock v:ext="edit" aspectratio="t"/>
-            <w10:wrap type="none"/>
-            <w10:anchorlock/>
+          </v:shapetype>
+          <v:shape id="_x0000_i1025" type="#_x0000_t75" alt="" style="width:173.75pt;height:58.15pt;mso-width-percent:0;mso-height-percent:0;mso-width-percent:0;mso-height-percent:0">
+            <v:imagedata r:id="rId8" r:href="rId9"/>
           </v:shape>
         </w:pict>
       </w:r>
       <w:r>
         <w:rPr>
-          <w:rFonts w:ascii="Times New Roman" w:hAnsi="Times New Roman" w:eastAsia="宋体" w:cs="Times New Roman"/>
+          <w:rFonts w:ascii="Times New Roman" w:eastAsia="宋体" w:hAnsi="Times New Roman" w:cs="Times New Roman"/>
           <w:szCs w:val="24"/>
         </w:rPr>
         <w:fldChar w:fldCharType="end"/>
       </w:r>
       <w:r>
         <w:rPr>
-          <w:rFonts w:ascii="Times New Roman" w:hAnsi="Times New Roman" w:eastAsia="宋体" w:cs="Times New Roman"/>
+          <w:rFonts w:ascii="Times New Roman" w:eastAsia="宋体" w:hAnsi="Times New Roman" w:cs="Times New Roman"/>
           <w:szCs w:val="24"/>
         </w:rPr>
         <w:fldChar w:fldCharType="end"/>
       </w:r>
       <w:r>
         <w:rPr>
-          <w:rFonts w:ascii="Times New Roman" w:hAnsi="Times New Roman" w:eastAsia="宋体" w:cs="Times New Roman"/>
+          <w:rFonts w:ascii="Times New Roman" w:eastAsia="宋体" w:hAnsi="Times New Roman" w:cs="Times New Roman"/>
           <w:szCs w:val="24"/>
         </w:rPr>
         <w:fldChar w:fldCharType="end"/>
       </w:r>
       <w:r>
         <w:rPr>
-          <w:rFonts w:ascii="Times New Roman" w:hAnsi="Times New Roman" w:eastAsia="宋体" w:cs="Times New Roman"/>
+          <w:rFonts w:ascii="Times New Roman" w:eastAsia="宋体" w:hAnsi="Times New Roman" w:cs="Times New Roman"/>
+          <w:szCs w:val="24"/>
+        </w:rPr>
+        <w:fldChar w:fldCharType="end"/>
+      </w:r>
+      <w:r>
+        <w:rPr>
+          <w:rFonts w:ascii="Times New Roman" w:eastAsia="宋体" w:hAnsi="Times New Roman" w:cs="Times New Roman"/>
           <w:szCs w:val="24"/>
         </w:rPr>
         <w:fldChar w:fldCharType="end"/>
@@ -210,7 +336,7 @@
         <w:spacing w:line="480" w:lineRule="auto"/>
         <w:jc w:val="center"/>
         <w:rPr>
-          <w:rFonts w:ascii="Times New Roman" w:hAnsi="Times New Roman" w:eastAsia="宋体" w:cs="Times New Roman"/>
+          <w:rFonts w:ascii="Times New Roman" w:eastAsia="宋体" w:hAnsi="Times New Roman" w:cs="Times New Roman"/>
           <w:b/>
           <w:bCs/>
           <w:spacing w:val="60"/>
@@ -221,7 +347,7 @@
       </w:pPr>
       <w:r>
         <w:rPr>
-          <w:rFonts w:hint="eastAsia" w:ascii="Times New Roman" w:hAnsi="Times New Roman" w:eastAsia="宋体" w:cs="Times New Roman"/>
+          <w:rFonts w:ascii="Times New Roman" w:eastAsia="宋体" w:hAnsi="Times New Roman" w:cs="Times New Roman" w:hint="eastAsia"/>
           <w:b/>
           <w:bCs/>
           <w:spacing w:val="60"/>
@@ -237,7 +363,7 @@
         <w:spacing w:line="480" w:lineRule="auto"/>
         <w:jc w:val="center"/>
         <w:rPr>
-          <w:rFonts w:ascii="Times New Roman" w:hAnsi="Times New Roman" w:eastAsia="宋体" w:cs="Times New Roman"/>
+          <w:rFonts w:ascii="Times New Roman" w:eastAsia="宋体" w:hAnsi="Times New Roman" w:cs="Times New Roman"/>
           <w:b/>
           <w:bCs/>
           <w:spacing w:val="60"/>
@@ -248,7 +374,7 @@
       </w:pPr>
       <w:r>
         <w:rPr>
-          <w:rFonts w:hint="eastAsia" w:ascii="Times New Roman" w:hAnsi="Times New Roman" w:eastAsia="宋体" w:cs="Times New Roman"/>
+          <w:rFonts w:ascii="Times New Roman" w:eastAsia="宋体" w:hAnsi="Times New Roman" w:cs="Times New Roman" w:hint="eastAsia"/>
           <w:b/>
           <w:bCs/>
           <w:spacing w:val="60"/>
@@ -264,7 +390,7 @@
         <w:spacing w:line="480" w:lineRule="auto"/>
         <w:jc w:val="center"/>
         <w:rPr>
-          <w:rFonts w:ascii="Times New Roman" w:hAnsi="Times New Roman" w:eastAsia="宋体" w:cs="Times New Roman"/>
+          <w:rFonts w:ascii="Times New Roman" w:eastAsia="宋体" w:hAnsi="Times New Roman" w:cs="Times New Roman"/>
           <w:b/>
           <w:bCs/>
           <w:spacing w:val="60"/>
@@ -279,7 +405,7 @@
         <w:spacing w:line="480" w:lineRule="auto"/>
         <w:jc w:val="center"/>
         <w:rPr>
-          <w:rFonts w:ascii="Times New Roman" w:hAnsi="Times New Roman" w:eastAsia="宋体" w:cs="Times New Roman"/>
+          <w:rFonts w:ascii="Times New Roman" w:eastAsia="宋体" w:hAnsi="Times New Roman" w:cs="Times New Roman"/>
           <w:b/>
           <w:bCs/>
           <w:spacing w:val="60"/>
@@ -294,7 +420,7 @@
         <w:spacing w:line="480" w:lineRule="auto"/>
         <w:jc w:val="center"/>
         <w:rPr>
-          <w:rFonts w:ascii="Times New Roman" w:hAnsi="Times New Roman" w:eastAsia="宋体" w:cs="Times New Roman"/>
+          <w:rFonts w:ascii="Times New Roman" w:eastAsia="宋体" w:hAnsi="Times New Roman" w:cs="Times New Roman"/>
           <w:spacing w:val="60"/>
           <w:kern w:val="0"/>
           <w:sz w:val="52"/>
@@ -307,7 +433,7 @@
         <w:spacing w:line="480" w:lineRule="auto"/>
         <w:jc w:val="center"/>
         <w:rPr>
-          <w:rFonts w:ascii="Times New Roman" w:hAnsi="Times New Roman" w:eastAsia="宋体" w:cs="Times New Roman"/>
+          <w:rFonts w:ascii="Times New Roman" w:eastAsia="宋体" w:hAnsi="Times New Roman" w:cs="Times New Roman"/>
           <w:b/>
           <w:bCs/>
           <w:spacing w:val="60"/>
@@ -320,9 +446,9 @@
     <w:p>
       <w:pPr>
         <w:spacing w:line="480" w:lineRule="auto"/>
-        <w:ind w:firstLine="179" w:firstLineChars="56"/>
-        <w:rPr>
-          <w:rFonts w:ascii="Times New Roman" w:hAnsi="Times New Roman" w:eastAsia="宋体" w:cs="Times New Roman"/>
+        <w:ind w:firstLineChars="56" w:firstLine="179"/>
+        <w:rPr>
+          <w:rFonts w:ascii="Times New Roman" w:eastAsia="宋体" w:hAnsi="Times New Roman" w:cs="Times New Roman"/>
           <w:b/>
           <w:bCs/>
           <w:kern w:val="0"/>
@@ -332,55 +458,86 @@
       </w:pPr>
       <w:r>
         <w:rPr>
-          <w:rFonts w:hint="eastAsia" w:ascii="Times New Roman" w:hAnsi="Times New Roman" w:eastAsia="宋体" w:cs="Times New Roman"/>
+          <w:rFonts w:ascii="Times New Roman" w:eastAsia="宋体" w:hAnsi="Times New Roman" w:cs="Times New Roman" w:hint="eastAsia"/>
           <w:kern w:val="0"/>
           <w:sz w:val="32"/>
           <w:szCs w:val="24"/>
           <w:u w:val="single"/>
         </w:rPr>
-        <w:t xml:space="preserve">人工智能与计算机  </w:t>
-      </w:r>
-      <w:r>
-        <w:rPr>
-          <w:rFonts w:hint="eastAsia" w:ascii="Times New Roman" w:hAnsi="Times New Roman" w:eastAsia="宋体" w:cs="Times New Roman"/>
+        <w:t>人工智能与计算机</w:t>
+      </w:r>
+      <w:r>
+        <w:rPr>
+          <w:rFonts w:ascii="Times New Roman" w:eastAsia="宋体" w:hAnsi="Times New Roman" w:cs="Times New Roman" w:hint="eastAsia"/>
+          <w:kern w:val="0"/>
+          <w:sz w:val="32"/>
+          <w:szCs w:val="24"/>
+          <w:u w:val="single"/>
+        </w:rPr>
+        <w:t xml:space="preserve">  </w:t>
+      </w:r>
+      <w:r>
+        <w:rPr>
+          <w:rFonts w:ascii="Times New Roman" w:eastAsia="宋体" w:hAnsi="Times New Roman" w:cs="Times New Roman" w:hint="eastAsia"/>
           <w:b/>
           <w:bCs/>
           <w:kern w:val="0"/>
           <w:sz w:val="30"/>
           <w:szCs w:val="24"/>
         </w:rPr>
-        <w:t xml:space="preserve">学院 </w:t>
-      </w:r>
-      <w:r>
-        <w:rPr>
-          <w:rFonts w:hint="eastAsia" w:ascii="Times New Roman" w:hAnsi="Times New Roman" w:eastAsia="宋体" w:cs="Times New Roman"/>
+        <w:t>学院</w:t>
+      </w:r>
+      <w:r>
+        <w:rPr>
+          <w:rFonts w:ascii="Times New Roman" w:eastAsia="宋体" w:hAnsi="Times New Roman" w:cs="Times New Roman" w:hint="eastAsia"/>
           <w:b/>
           <w:bCs/>
           <w:kern w:val="0"/>
           <w:sz w:val="30"/>
           <w:szCs w:val="24"/>
-          <w:u w:val="single"/>
-        </w:rPr>
-        <w:t xml:space="preserve">    </w:t>
-      </w:r>
-      <w:r>
-        <w:rPr>
-          <w:rFonts w:hint="eastAsia" w:ascii="Times New Roman" w:hAnsi="Times New Roman" w:eastAsia="宋体" w:cs="Times New Roman"/>
-          <w:kern w:val="0"/>
-          <w:sz w:val="32"/>
-          <w:szCs w:val="24"/>
-          <w:u w:val="single"/>
-        </w:rPr>
-        <w:t xml:space="preserve">计算机科学与技术    </w:t>
-      </w:r>
-      <w:r>
-        <w:rPr>
-          <w:rFonts w:hint="eastAsia" w:ascii="Times New Roman" w:hAnsi="Times New Roman" w:eastAsia="宋体" w:cs="Times New Roman"/>
+        </w:rPr>
+        <w:t xml:space="preserve"> </w:t>
+      </w:r>
+      <w:r>
+        <w:rPr>
+          <w:rFonts w:ascii="Times New Roman" w:eastAsia="宋体" w:hAnsi="Times New Roman" w:cs="Times New Roman" w:hint="eastAsia"/>
           <w:b/>
           <w:bCs/>
           <w:kern w:val="0"/>
           <w:sz w:val="30"/>
           <w:szCs w:val="24"/>
+          <w:u w:val="single"/>
+        </w:rPr>
+        <w:t xml:space="preserve">    </w:t>
+      </w:r>
+      <w:r>
+        <w:rPr>
+          <w:rFonts w:ascii="Times New Roman" w:eastAsia="宋体" w:hAnsi="Times New Roman" w:cs="Times New Roman" w:hint="eastAsia"/>
+          <w:kern w:val="0"/>
+          <w:sz w:val="32"/>
+          <w:szCs w:val="24"/>
+          <w:u w:val="single"/>
+        </w:rPr>
+        <w:t>计算机科学与技术</w:t>
+      </w:r>
+      <w:r>
+        <w:rPr>
+          <w:rFonts w:ascii="Times New Roman" w:eastAsia="宋体" w:hAnsi="Times New Roman" w:cs="Times New Roman" w:hint="eastAsia"/>
+          <w:kern w:val="0"/>
+          <w:sz w:val="32"/>
+          <w:szCs w:val="24"/>
+          <w:u w:val="single"/>
+        </w:rPr>
+        <w:t xml:space="preserve">    </w:t>
+      </w:r>
+      <w:r>
+        <w:rPr>
+          <w:rFonts w:ascii="Times New Roman" w:eastAsia="宋体" w:hAnsi="Times New Roman" w:cs="Times New Roman" w:hint="eastAsia"/>
+          <w:b/>
+          <w:bCs/>
+          <w:kern w:val="0"/>
+          <w:sz w:val="30"/>
+          <w:szCs w:val="24"/>
         </w:rPr>
         <w:t>专业</w:t>
       </w:r>
@@ -390,7 +547,7 @@
         <w:spacing w:line="480" w:lineRule="auto"/>
         <w:jc w:val="center"/>
         <w:rPr>
-          <w:rFonts w:ascii="Times New Roman" w:hAnsi="Times New Roman" w:eastAsia="宋体" w:cs="Times New Roman"/>
+          <w:rFonts w:ascii="Times New Roman" w:eastAsia="宋体" w:hAnsi="Times New Roman" w:cs="Times New Roman"/>
           <w:b/>
           <w:bCs/>
           <w:spacing w:val="60"/>
@@ -405,7 +562,7 @@
         <w:spacing w:line="480" w:lineRule="auto"/>
         <w:jc w:val="center"/>
         <w:rPr>
-          <w:rFonts w:ascii="Times New Roman" w:hAnsi="Times New Roman" w:eastAsia="宋体" w:cs="Times New Roman"/>
+          <w:rFonts w:ascii="Times New Roman" w:eastAsia="宋体" w:hAnsi="Times New Roman" w:cs="Times New Roman"/>
           <w:b/>
           <w:bCs/>
           <w:spacing w:val="60"/>
@@ -420,7 +577,7 @@
         <w:spacing w:line="480" w:lineRule="auto"/>
         <w:jc w:val="center"/>
         <w:rPr>
-          <w:rFonts w:hint="eastAsia" w:ascii="Times New Roman" w:hAnsi="Times New Roman" w:eastAsia="宋体" w:cs="Times New Roman"/>
+          <w:rFonts w:ascii="Times New Roman" w:eastAsia="宋体" w:hAnsi="Times New Roman" w:cs="Times New Roman"/>
           <w:b/>
           <w:bCs/>
           <w:spacing w:val="60"/>
@@ -433,9 +590,9 @@
     <w:p>
       <w:pPr>
         <w:spacing w:line="600" w:lineRule="auto"/>
-        <w:ind w:firstLine="1080" w:firstLineChars="300"/>
-        <w:rPr>
-          <w:rFonts w:ascii="Times New Roman" w:hAnsi="Times New Roman" w:eastAsia="宋体" w:cs="Times New Roman"/>
+        <w:ind w:firstLineChars="300" w:firstLine="1080"/>
+        <w:rPr>
+          <w:rFonts w:ascii="Times New Roman" w:eastAsia="宋体" w:hAnsi="Times New Roman" w:cs="Times New Roman"/>
           <w:b/>
           <w:bCs/>
           <w:spacing w:val="60"/>
@@ -446,23 +603,31 @@
       </w:pPr>
       <w:r>
         <w:rPr>
-          <w:rFonts w:hint="eastAsia" w:ascii="Times New Roman" w:hAnsi="Times New Roman" w:eastAsia="宋体" w:cs="Times New Roman"/>
+          <w:rFonts w:ascii="Times New Roman" w:eastAsia="宋体" w:hAnsi="Times New Roman" w:cs="Times New Roman" w:hint="eastAsia"/>
           <w:sz w:val="36"/>
           <w:szCs w:val="24"/>
         </w:rPr>
-        <w:t xml:space="preserve">组 </w:t>
-      </w:r>
-      <w:r>
-        <w:rPr>
-          <w:rFonts w:ascii="Times New Roman" w:hAnsi="Times New Roman" w:eastAsia="宋体" w:cs="Times New Roman"/>
+        <w:t>组</w:t>
+      </w:r>
+      <w:r>
+        <w:rPr>
+          <w:rFonts w:ascii="Times New Roman" w:eastAsia="宋体" w:hAnsi="Times New Roman" w:cs="Times New Roman" w:hint="eastAsia"/>
           <w:sz w:val="36"/>
           <w:szCs w:val="24"/>
         </w:rPr>
+        <w:t xml:space="preserve"> </w:t>
+      </w:r>
+      <w:r>
+        <w:rPr>
+          <w:rFonts w:ascii="Times New Roman" w:eastAsia="宋体" w:hAnsi="Times New Roman" w:cs="Times New Roman"/>
+          <w:sz w:val="36"/>
+          <w:szCs w:val="24"/>
+        </w:rPr>
         <w:t xml:space="preserve">   </w:t>
       </w:r>
       <w:r>
         <w:rPr>
-          <w:rFonts w:hint="eastAsia" w:ascii="Times New Roman" w:hAnsi="Times New Roman" w:eastAsia="宋体" w:cs="Times New Roman"/>
+          <w:rFonts w:ascii="Times New Roman" w:eastAsia="宋体" w:hAnsi="Times New Roman" w:cs="Times New Roman" w:hint="eastAsia"/>
           <w:sz w:val="36"/>
           <w:szCs w:val="24"/>
         </w:rPr>
@@ -470,7 +635,7 @@
       </w:r>
       <w:r>
         <w:rPr>
-          <w:rFonts w:hint="eastAsia" w:ascii="Times New Roman" w:hAnsi="Times New Roman" w:eastAsia="宋体" w:cs="Times New Roman"/>
+          <w:rFonts w:ascii="Times New Roman" w:eastAsia="宋体" w:hAnsi="Times New Roman" w:cs="Times New Roman" w:hint="eastAsia"/>
           <w:sz w:val="36"/>
           <w:szCs w:val="24"/>
           <w:u w:val="single"/>
@@ -479,30 +644,29 @@
       </w:r>
       <w:r>
         <w:rPr>
-          <w:rFonts w:hint="eastAsia" w:ascii="Times New Roman" w:hAnsi="Times New Roman" w:eastAsia="宋体" w:cs="Times New Roman"/>
+          <w:rFonts w:ascii="Times New Roman" w:eastAsia="宋体" w:hAnsi="Times New Roman" w:cs="Times New Roman" w:hint="eastAsia"/>
           <w:sz w:val="36"/>
           <w:szCs w:val="24"/>
           <w:u w:val="single"/>
-          <w:lang w:val="en-US" w:eastAsia="zh-CN"/>
-        </w:rPr>
-        <w:t>Simultaneously</w:t>
-      </w:r>
-      <w:r>
-        <w:rPr>
-          <w:rFonts w:hint="eastAsia" w:ascii="Times New Roman" w:hAnsi="Times New Roman" w:eastAsia="宋体" w:cs="Times New Roman"/>
+        </w:rPr>
+        <w:t xml:space="preserve">  </w:t>
+      </w:r>
+      <w:r>
+        <w:rPr>
+          <w:rFonts w:ascii="Times New Roman" w:eastAsia="宋体" w:hAnsi="Times New Roman" w:cs="Times New Roman" w:hint="eastAsia"/>
           <w:sz w:val="36"/>
           <w:szCs w:val="24"/>
           <w:u w:val="single"/>
         </w:rPr>
-        <w:t xml:space="preserve">        </w:t>
+        <w:t xml:space="preserve">Simultaneously     </w:t>
       </w:r>
     </w:p>
     <w:p>
       <w:pPr>
         <w:spacing w:line="600" w:lineRule="auto"/>
-        <w:ind w:firstLine="1080" w:firstLineChars="300"/>
-        <w:rPr>
-          <w:rFonts w:ascii="Times New Roman" w:hAnsi="Times New Roman" w:eastAsia="宋体" w:cs="Times New Roman"/>
+        <w:ind w:firstLineChars="300" w:firstLine="1080"/>
+        <w:rPr>
+          <w:rFonts w:ascii="Times New Roman" w:eastAsia="宋体" w:hAnsi="Times New Roman" w:cs="Times New Roman"/>
           <w:sz w:val="36"/>
           <w:szCs w:val="24"/>
           <w:u w:val="single"/>
@@ -510,7 +674,7 @@
       </w:pPr>
       <w:r>
         <w:rPr>
-          <w:rFonts w:hint="eastAsia" w:ascii="Times New Roman" w:hAnsi="Times New Roman" w:eastAsia="宋体" w:cs="Times New Roman"/>
+          <w:rFonts w:ascii="Times New Roman" w:eastAsia="宋体" w:hAnsi="Times New Roman" w:cs="Times New Roman" w:hint="eastAsia"/>
           <w:sz w:val="36"/>
           <w:szCs w:val="24"/>
         </w:rPr>
@@ -518,31 +682,56 @@
       </w:r>
       <w:r>
         <w:rPr>
-          <w:rFonts w:hint="eastAsia" w:ascii="Times New Roman" w:hAnsi="Times New Roman" w:eastAsia="宋体" w:cs="Times New Roman"/>
+          <w:rFonts w:ascii="Times New Roman" w:eastAsia="宋体" w:hAnsi="Times New Roman" w:cs="Times New Roman" w:hint="eastAsia"/>
           <w:sz w:val="36"/>
           <w:szCs w:val="24"/>
           <w:u w:val="single"/>
         </w:rPr>
-        <w:t xml:space="preserve">              </w:t>
-      </w:r>
-      <w:bookmarkStart w:id="0" w:name="_GoBack"/>
-      <w:bookmarkEnd w:id="0"/>
-      <w:r>
-        <w:rPr>
-          <w:rFonts w:hint="eastAsia" w:ascii="Times New Roman" w:hAnsi="Times New Roman" w:eastAsia="宋体" w:cs="Times New Roman"/>
+        <w:t xml:space="preserve">      </w:t>
+      </w:r>
+      <w:r>
+        <w:rPr>
+          <w:rFonts w:ascii="Times New Roman" w:eastAsia="宋体" w:hAnsi="Times New Roman" w:cs="Times New Roman" w:hint="eastAsia"/>
           <w:sz w:val="36"/>
           <w:szCs w:val="24"/>
           <w:u w:val="single"/>
         </w:rPr>
+        <w:t xml:space="preserve"> </w:t>
+      </w:r>
+      <w:r>
+        <w:rPr>
+          <w:rFonts w:ascii="Times New Roman" w:eastAsia="宋体" w:hAnsi="Times New Roman" w:cs="Times New Roman" w:hint="eastAsia"/>
+          <w:sz w:val="36"/>
+          <w:szCs w:val="24"/>
+          <w:u w:val="single"/>
+        </w:rPr>
+        <w:t xml:space="preserve"> </w:t>
+      </w:r>
+      <w:r>
+        <w:rPr>
+          <w:rFonts w:ascii="Times New Roman" w:eastAsia="宋体" w:hAnsi="Times New Roman" w:cs="Times New Roman" w:hint="eastAsia"/>
+          <w:sz w:val="36"/>
+          <w:szCs w:val="24"/>
+          <w:u w:val="single"/>
+        </w:rPr>
+        <w:t>陆辰睿</w:t>
+      </w:r>
+      <w:r>
+        <w:rPr>
+          <w:rFonts w:ascii="Times New Roman" w:eastAsia="宋体" w:hAnsi="Times New Roman" w:cs="Times New Roman" w:hint="eastAsia"/>
+          <w:sz w:val="36"/>
+          <w:szCs w:val="24"/>
+          <w:u w:val="single"/>
+        </w:rPr>
         <w:t xml:space="preserve">         </w:t>
       </w:r>
     </w:p>
     <w:p>
       <w:pPr>
         <w:spacing w:line="600" w:lineRule="auto"/>
-        <w:ind w:firstLine="1080" w:firstLineChars="300"/>
-        <w:rPr>
-          <w:rFonts w:ascii="Times New Roman" w:hAnsi="Times New Roman" w:eastAsia="宋体" w:cs="Times New Roman"/>
+        <w:ind w:firstLineChars="300" w:firstLine="1080"/>
+        <w:rPr>
+          <w:rFonts w:ascii="Times New Roman" w:eastAsia="宋体" w:hAnsi="Times New Roman" w:cs="Times New Roman"/>
           <w:sz w:val="36"/>
           <w:szCs w:val="24"/>
           <w:u w:val="single"/>
@@ -550,7 +739,7 @@
       </w:pPr>
       <w:r>
         <w:rPr>
-          <w:rFonts w:hint="eastAsia" w:ascii="Times New Roman" w:hAnsi="Times New Roman" w:eastAsia="宋体" w:cs="Times New Roman"/>
+          <w:rFonts w:ascii="Times New Roman" w:eastAsia="宋体" w:hAnsi="Times New Roman" w:cs="Times New Roman" w:hint="eastAsia"/>
           <w:sz w:val="36"/>
           <w:szCs w:val="24"/>
         </w:rPr>
@@ -558,19 +747,37 @@
       </w:r>
       <w:r>
         <w:rPr>
-          <w:rFonts w:hint="eastAsia" w:ascii="Times New Roman" w:hAnsi="Times New Roman" w:eastAsia="宋体" w:cs="Times New Roman"/>
+          <w:rFonts w:ascii="Times New Roman" w:eastAsia="宋体" w:hAnsi="Times New Roman" w:cs="Times New Roman" w:hint="eastAsia"/>
           <w:sz w:val="36"/>
           <w:szCs w:val="24"/>
           <w:u w:val="single"/>
         </w:rPr>
-        <w:t xml:space="preserve">                       </w:t>
-      </w:r>
-    </w:p>
-    <w:p>
-      <w:pPr>
-        <w:ind w:firstLine="2891" w:firstLineChars="800"/>
-        <w:rPr>
-          <w:rFonts w:ascii="Times New Roman" w:hAnsi="Times New Roman" w:eastAsia="宋体" w:cs="Times New Roman"/>
+        <w:t xml:space="preserve">      </w:t>
+      </w:r>
+      <w:r>
+        <w:rPr>
+          <w:rFonts w:ascii="Times New Roman" w:eastAsia="宋体" w:hAnsi="Times New Roman" w:cs="Times New Roman" w:hint="eastAsia"/>
+          <w:sz w:val="36"/>
+          <w:szCs w:val="24"/>
+          <w:u w:val="single"/>
+        </w:rPr>
+        <w:t>1190325118</w:t>
+      </w:r>
+      <w:r>
+        <w:rPr>
+          <w:rFonts w:ascii="Times New Roman" w:eastAsia="宋体" w:hAnsi="Times New Roman" w:cs="Times New Roman" w:hint="eastAsia"/>
+          <w:sz w:val="36"/>
+          <w:szCs w:val="24"/>
+          <w:u w:val="single"/>
+        </w:rPr>
+        <w:t xml:space="preserve">       </w:t>
+      </w:r>
+    </w:p>
+    <w:p>
+      <w:pPr>
+        <w:ind w:firstLineChars="800" w:firstLine="2891"/>
+        <w:rPr>
+          <w:rFonts w:ascii="Times New Roman" w:eastAsia="宋体" w:hAnsi="Times New Roman" w:cs="Times New Roman"/>
           <w:b/>
           <w:bCs/>
           <w:sz w:val="36"/>
@@ -580,9 +787,9 @@
     </w:p>
     <w:p>
       <w:pPr>
-        <w:ind w:firstLine="2891" w:firstLineChars="800"/>
-        <w:rPr>
-          <w:rFonts w:hint="eastAsia" w:ascii="Times New Roman" w:hAnsi="Times New Roman" w:eastAsia="宋体" w:cs="Times New Roman"/>
+        <w:ind w:firstLineChars="800" w:firstLine="2891"/>
+        <w:rPr>
+          <w:rFonts w:ascii="Times New Roman" w:eastAsia="宋体" w:hAnsi="Times New Roman" w:cs="Times New Roman"/>
           <w:b/>
           <w:bCs/>
           <w:sz w:val="36"/>
@@ -594,13 +801,13 @@
       <w:pPr>
         <w:jc w:val="center"/>
         <w:rPr>
-          <w:rFonts w:ascii="Times New Roman" w:hAnsi="Times New Roman" w:eastAsia="宋体" w:cs="Times New Roman"/>
-          <w:szCs w:val="24"/>
-        </w:rPr>
-      </w:pPr>
-      <w:r>
-        <w:rPr>
-          <w:rFonts w:hint="eastAsia" w:ascii="Times New Roman" w:hAnsi="Times New Roman" w:eastAsia="宋体" w:cs="Times New Roman"/>
+          <w:rFonts w:ascii="Times New Roman" w:eastAsia="宋体" w:hAnsi="Times New Roman" w:cs="Times New Roman"/>
+          <w:szCs w:val="24"/>
+        </w:rPr>
+      </w:pPr>
+      <w:r>
+        <w:rPr>
+          <w:rFonts w:ascii="Times New Roman" w:eastAsia="宋体" w:hAnsi="Times New Roman" w:cs="Times New Roman" w:hint="eastAsia"/>
           <w:b/>
           <w:bCs/>
           <w:sz w:val="36"/>
@@ -610,7 +817,7 @@
       </w:r>
       <w:r>
         <w:rPr>
-          <w:rFonts w:ascii="Times New Roman" w:hAnsi="Times New Roman" w:eastAsia="宋体" w:cs="Times New Roman"/>
+          <w:rFonts w:ascii="Times New Roman" w:eastAsia="宋体" w:hAnsi="Times New Roman" w:cs="Times New Roman"/>
           <w:b/>
           <w:bCs/>
           <w:sz w:val="36"/>
@@ -620,30 +827,49 @@
       </w:r>
       <w:r>
         <w:rPr>
-          <w:rFonts w:ascii="Times New Roman" w:hAnsi="Times New Roman" w:eastAsia="宋体" w:cs="Times New Roman"/>
+          <w:rFonts w:ascii="Times New Roman" w:eastAsia="宋体" w:hAnsi="Times New Roman" w:cs="Times New Roman" w:hint="eastAsia"/>
           <w:b/>
           <w:bCs/>
           <w:sz w:val="36"/>
           <w:szCs w:val="24"/>
-          <w:u w:val="single"/>
-        </w:rPr>
-        <w:t xml:space="preserve">  </w:t>
-      </w:r>
-      <w:r>
-        <w:rPr>
-          <w:rFonts w:hint="eastAsia" w:ascii="Times New Roman" w:hAnsi="Times New Roman" w:eastAsia="宋体" w:cs="Times New Roman"/>
+        </w:rPr>
+        <w:t>6</w:t>
+      </w:r>
+      <w:r>
+        <w:rPr>
+          <w:rFonts w:ascii="Times New Roman" w:eastAsia="宋体" w:hAnsi="Times New Roman" w:cs="Times New Roman" w:hint="eastAsia"/>
           <w:b/>
           <w:bCs/>
           <w:sz w:val="36"/>
           <w:szCs w:val="24"/>
         </w:rPr>
-        <w:t>年 6月</w:t>
-      </w:r>
-    </w:p>
-    <w:p>
-      <w:pPr>
-        <w:rPr>
-          <w:rFonts w:ascii="Times New Roman" w:hAnsi="Times New Roman" w:eastAsia="宋体" w:cs="Times New Roman"/>
+        <w:t>年</w:t>
+      </w:r>
+      <w:r>
+        <w:rPr>
+          <w:rFonts w:ascii="Times New Roman" w:eastAsia="宋体" w:hAnsi="Times New Roman" w:cs="Times New Roman" w:hint="eastAsia"/>
+          <w:b/>
+          <w:bCs/>
+          <w:sz w:val="36"/>
+          <w:szCs w:val="24"/>
+        </w:rPr>
+        <w:t xml:space="preserve"> 6</w:t>
+      </w:r>
+      <w:r>
+        <w:rPr>
+          <w:rFonts w:ascii="Times New Roman" w:eastAsia="宋体" w:hAnsi="Times New Roman" w:cs="Times New Roman" w:hint="eastAsia"/>
+          <w:b/>
+          <w:bCs/>
+          <w:sz w:val="36"/>
+          <w:szCs w:val="24"/>
+        </w:rPr>
+        <w:t>月</w:t>
+      </w:r>
+    </w:p>
+    <w:p>
+      <w:pPr>
+        <w:rPr>
+          <w:rFonts w:ascii="Times New Roman" w:eastAsia="宋体" w:hAnsi="Times New Roman" w:cs="Times New Roman"/>
           <w:szCs w:val="24"/>
         </w:rPr>
       </w:pPr>
@@ -653,21 +879,21 @@
         <w:widowControl/>
         <w:jc w:val="left"/>
         <w:rPr>
-          <w:rFonts w:ascii="Times New Roman" w:hAnsi="Times New Roman" w:eastAsia="宋体"/>
-        </w:rPr>
-      </w:pPr>
-    </w:p>
-    <w:p>
-      <w:pPr>
-        <w:rPr>
-          <w:rFonts w:ascii="Times New Roman" w:hAnsi="Times New Roman" w:eastAsia="宋体"/>
+          <w:rFonts w:ascii="Times New Roman" w:eastAsia="宋体" w:hAnsi="Times New Roman"/>
+        </w:rPr>
+      </w:pPr>
+    </w:p>
+    <w:p>
+      <w:pPr>
+        <w:rPr>
+          <w:rFonts w:ascii="Times New Roman" w:eastAsia="宋体" w:hAnsi="Times New Roman"/>
         </w:rPr>
         <w:sectPr>
-          <w:footerReference r:id="rId3" w:type="default"/>
+          <w:footerReference w:type="default" r:id="rId10"/>
           <w:pgSz w:w="11906" w:h="16838"/>
           <w:pgMar w:top="1440" w:right="1800" w:bottom="1440" w:left="1800" w:header="851" w:footer="992" w:gutter="0"/>
-          <w:cols w:space="425" w:num="1"/>
-          <w:docGrid w:type="lines" w:linePitch="312" w:charSpace="0"/>
+          <w:cols w:space="425"/>
+          <w:docGrid w:type="lines" w:linePitch="312"/>
         </w:sectPr>
       </w:pPr>
     </w:p>
@@ -679,33 +905,34 @@
           <w:numId w:val="1"/>
         </w:numPr>
         <w:rPr>
-          <w:rFonts w:ascii="Times New Roman" w:hAnsi="Times New Roman" w:eastAsia="宋体"/>
+          <w:rFonts w:ascii="Times New Roman" w:eastAsia="宋体" w:hAnsi="Times New Roman"/>
           <w:sz w:val="28"/>
           <w:szCs w:val="28"/>
         </w:rPr>
       </w:pPr>
       <w:r>
         <w:rPr>
-          <w:rFonts w:hint="eastAsia" w:ascii="Times New Roman" w:hAnsi="Times New Roman" w:eastAsia="宋体"/>
+          <w:rFonts w:ascii="Times New Roman" w:eastAsia="宋体" w:hAnsi="Times New Roman" w:hint="eastAsia"/>
           <w:sz w:val="28"/>
           <w:szCs w:val="28"/>
         </w:rPr>
+        <w:lastRenderedPageBreak/>
         <w:t>项目简介</w:t>
       </w:r>
     </w:p>
     <w:p>
       <w:pPr>
         <w:spacing w:line="300" w:lineRule="auto"/>
-        <w:ind w:firstLine="480" w:firstLineChars="200"/>
-        <w:rPr>
-          <w:rFonts w:hint="eastAsia" w:ascii="Times New Roman" w:hAnsi="Times New Roman" w:eastAsia="宋体"/>
-          <w:sz w:val="24"/>
-          <w:szCs w:val="24"/>
-        </w:rPr>
-      </w:pPr>
-      <w:r>
-        <w:rPr>
-          <w:rFonts w:hint="eastAsia" w:ascii="Times New Roman" w:hAnsi="Times New Roman" w:eastAsia="宋体"/>
+        <w:ind w:firstLineChars="200" w:firstLine="480"/>
+        <w:rPr>
+          <w:rFonts w:ascii="Times New Roman" w:eastAsia="宋体" w:hAnsi="Times New Roman"/>
+          <w:sz w:val="24"/>
+          <w:szCs w:val="24"/>
+        </w:rPr>
+      </w:pPr>
+      <w:r>
+        <w:rPr>
+          <w:rFonts w:ascii="Times New Roman" w:eastAsia="宋体" w:hAnsi="Times New Roman" w:hint="eastAsia"/>
           <w:sz w:val="24"/>
           <w:szCs w:val="24"/>
         </w:rPr>
@@ -715,16 +942,16 @@
     <w:p>
       <w:pPr>
         <w:spacing w:line="300" w:lineRule="auto"/>
-        <w:ind w:firstLine="480" w:firstLineChars="200"/>
-        <w:rPr>
-          <w:rFonts w:hint="eastAsia" w:ascii="Times New Roman" w:hAnsi="Times New Roman" w:eastAsia="宋体"/>
-          <w:sz w:val="24"/>
-          <w:szCs w:val="24"/>
-        </w:rPr>
-      </w:pPr>
-      <w:r>
-        <w:rPr>
-          <w:rFonts w:hint="eastAsia" w:ascii="Times New Roman" w:hAnsi="Times New Roman" w:eastAsia="宋体"/>
+        <w:ind w:firstLineChars="200" w:firstLine="480"/>
+        <w:rPr>
+          <w:rFonts w:ascii="Times New Roman" w:eastAsia="宋体" w:hAnsi="Times New Roman"/>
+          <w:sz w:val="24"/>
+          <w:szCs w:val="24"/>
+        </w:rPr>
+      </w:pPr>
+      <w:r>
+        <w:rPr>
+          <w:rFonts w:ascii="Times New Roman" w:eastAsia="宋体" w:hAnsi="Times New Roman" w:hint="eastAsia"/>
           <w:sz w:val="24"/>
           <w:szCs w:val="24"/>
         </w:rPr>
@@ -732,7 +959,7 @@
       </w:r>
       <w:r>
         <w:rPr>
-          <w:rFonts w:ascii="Times New Roman" w:hAnsi="Times New Roman" w:eastAsia="宋体"/>
+          <w:rFonts w:ascii="Times New Roman" w:eastAsia="宋体" w:hAnsi="Times New Roman"/>
           <w:sz w:val="24"/>
           <w:szCs w:val="24"/>
         </w:rPr>
@@ -740,15 +967,23 @@
       </w:r>
       <w:r>
         <w:rPr>
-          <w:rFonts w:hint="eastAsia" w:ascii="Times New Roman" w:hAnsi="Times New Roman" w:eastAsia="宋体"/>
-          <w:sz w:val="24"/>
-          <w:szCs w:val="24"/>
-        </w:rPr>
-        <w:t>，行间距为1</w:t>
-      </w:r>
-      <w:r>
-        <w:rPr>
-          <w:rFonts w:ascii="Times New Roman" w:hAnsi="Times New Roman" w:eastAsia="宋体"/>
+          <w:rFonts w:ascii="Times New Roman" w:eastAsia="宋体" w:hAnsi="Times New Roman" w:hint="eastAsia"/>
+          <w:sz w:val="24"/>
+          <w:szCs w:val="24"/>
+        </w:rPr>
+        <w:t>，行间距为</w:t>
+      </w:r>
+      <w:r>
+        <w:rPr>
+          <w:rFonts w:ascii="Times New Roman" w:eastAsia="宋体" w:hAnsi="Times New Roman" w:hint="eastAsia"/>
+          <w:sz w:val="24"/>
+          <w:szCs w:val="24"/>
+        </w:rPr>
+        <w:t>1</w:t>
+      </w:r>
+      <w:r>
+        <w:rPr>
+          <w:rFonts w:ascii="Times New Roman" w:eastAsia="宋体" w:hAnsi="Times New Roman"/>
           <w:sz w:val="24"/>
           <w:szCs w:val="24"/>
         </w:rPr>
@@ -756,11 +991,27 @@
       </w:r>
       <w:r>
         <w:rPr>
-          <w:rFonts w:hint="eastAsia" w:ascii="Times New Roman" w:hAnsi="Times New Roman" w:eastAsia="宋体"/>
-          <w:sz w:val="24"/>
-          <w:szCs w:val="24"/>
-        </w:rPr>
-        <w:t>倍行距，首行缩进2字符。</w:t>
+          <w:rFonts w:ascii="Times New Roman" w:eastAsia="宋体" w:hAnsi="Times New Roman" w:hint="eastAsia"/>
+          <w:sz w:val="24"/>
+          <w:szCs w:val="24"/>
+        </w:rPr>
+        <w:t>倍行距，首行缩进</w:t>
+      </w:r>
+      <w:r>
+        <w:rPr>
+          <w:rFonts w:ascii="Times New Roman" w:eastAsia="宋体" w:hAnsi="Times New Roman" w:hint="eastAsia"/>
+          <w:sz w:val="24"/>
+          <w:szCs w:val="24"/>
+        </w:rPr>
+        <w:t>2</w:t>
+      </w:r>
+      <w:r>
+        <w:rPr>
+          <w:rFonts w:ascii="Times New Roman" w:eastAsia="宋体" w:hAnsi="Times New Roman" w:hint="eastAsia"/>
+          <w:sz w:val="24"/>
+          <w:szCs w:val="24"/>
+        </w:rPr>
+        <w:t>字符。</w:t>
       </w:r>
     </w:p>
     <w:p>
@@ -771,14 +1022,14 @@
           <w:numId w:val="1"/>
         </w:numPr>
         <w:rPr>
-          <w:rFonts w:ascii="Times New Roman" w:hAnsi="Times New Roman" w:eastAsia="宋体"/>
+          <w:rFonts w:ascii="Times New Roman" w:eastAsia="宋体" w:hAnsi="Times New Roman"/>
           <w:sz w:val="28"/>
           <w:szCs w:val="28"/>
         </w:rPr>
       </w:pPr>
       <w:r>
         <w:rPr>
-          <w:rFonts w:hint="eastAsia" w:ascii="Times New Roman" w:hAnsi="Times New Roman" w:eastAsia="宋体"/>
+          <w:rFonts w:ascii="Times New Roman" w:eastAsia="宋体" w:hAnsi="Times New Roman" w:hint="eastAsia"/>
           <w:sz w:val="28"/>
           <w:szCs w:val="28"/>
         </w:rPr>
@@ -787,18 +1038,18 @@
     </w:p>
     <w:p>
       <w:pPr>
-        <w:pStyle w:val="3"/>
+        <w:pStyle w:val="a3"/>
         <w:keepNext/>
         <w:jc w:val="center"/>
         <w:rPr>
-          <w:rFonts w:ascii="宋体" w:hAnsi="宋体" w:eastAsia="宋体"/>
-          <w:sz w:val="24"/>
-          <w:szCs w:val="24"/>
-        </w:rPr>
-      </w:pPr>
-      <w:r>
-        <w:rPr>
-          <w:rFonts w:ascii="宋体" w:hAnsi="宋体" w:eastAsia="宋体"/>
+          <w:rFonts w:ascii="宋体" w:eastAsia="宋体" w:hAnsi="宋体"/>
+          <w:sz w:val="24"/>
+          <w:szCs w:val="24"/>
+        </w:rPr>
+      </w:pPr>
+      <w:r>
+        <w:rPr>
+          <w:rFonts w:ascii="宋体" w:eastAsia="宋体" w:hAnsi="宋体"/>
           <w:sz w:val="24"/>
           <w:szCs w:val="24"/>
         </w:rPr>
@@ -806,7 +1057,7 @@
       </w:r>
       <w:r>
         <w:rPr>
-          <w:rFonts w:ascii="宋体" w:hAnsi="宋体" w:eastAsia="宋体"/>
+          <w:rFonts w:ascii="宋体" w:eastAsia="宋体" w:hAnsi="宋体"/>
           <w:sz w:val="24"/>
           <w:szCs w:val="24"/>
         </w:rPr>
@@ -814,7 +1065,7 @@
       </w:r>
       <w:r>
         <w:rPr>
-          <w:rFonts w:ascii="宋体" w:hAnsi="宋体" w:eastAsia="宋体"/>
+          <w:rFonts w:ascii="宋体" w:eastAsia="宋体" w:hAnsi="宋体"/>
           <w:sz w:val="24"/>
           <w:szCs w:val="24"/>
         </w:rPr>
@@ -822,7 +1073,7 @@
       </w:r>
       <w:r>
         <w:rPr>
-          <w:rFonts w:ascii="宋体" w:hAnsi="宋体" w:eastAsia="宋体"/>
+          <w:rFonts w:ascii="宋体" w:eastAsia="宋体" w:hAnsi="宋体"/>
           <w:sz w:val="24"/>
           <w:szCs w:val="24"/>
         </w:rPr>
@@ -830,7 +1081,7 @@
       </w:r>
       <w:r>
         <w:rPr>
-          <w:rFonts w:ascii="宋体" w:hAnsi="宋体" w:eastAsia="宋体"/>
+          <w:rFonts w:ascii="宋体" w:eastAsia="宋体" w:hAnsi="宋体"/>
           <w:sz w:val="24"/>
           <w:szCs w:val="24"/>
         </w:rPr>
@@ -838,7 +1089,7 @@
       </w:r>
       <w:r>
         <w:rPr>
-          <w:rFonts w:ascii="宋体" w:hAnsi="宋体" w:eastAsia="宋体"/>
+          <w:rFonts w:ascii="宋体" w:eastAsia="宋体" w:hAnsi="宋体"/>
           <w:sz w:val="24"/>
           <w:szCs w:val="24"/>
         </w:rPr>
@@ -846,7 +1097,7 @@
       </w:r>
       <w:r>
         <w:rPr>
-          <w:rFonts w:ascii="宋体" w:hAnsi="宋体" w:eastAsia="宋体"/>
+          <w:rFonts w:ascii="宋体" w:eastAsia="宋体" w:hAnsi="宋体"/>
           <w:sz w:val="24"/>
           <w:szCs w:val="24"/>
         </w:rPr>
@@ -854,7 +1105,7 @@
       </w:r>
       <w:r>
         <w:rPr>
-          <w:rFonts w:hint="eastAsia" w:ascii="宋体" w:hAnsi="宋体" w:eastAsia="宋体"/>
+          <w:rFonts w:ascii="宋体" w:eastAsia="宋体" w:hAnsi="宋体" w:hint="eastAsia"/>
           <w:sz w:val="24"/>
           <w:szCs w:val="24"/>
         </w:rPr>
@@ -863,24 +1114,9 @@
     </w:p>
     <w:tbl>
       <w:tblPr>
-        <w:tblStyle w:val="7"/>
+        <w:tblStyle w:val="a8"/>
         <w:tblW w:w="0" w:type="auto"/>
-        <w:tblInd w:w="0" w:type="dxa"/>
-        <w:tblBorders>
-          <w:top w:val="single" w:color="auto" w:sz="4" w:space="0"/>
-          <w:left w:val="single" w:color="auto" w:sz="4" w:space="0"/>
-          <w:bottom w:val="single" w:color="auto" w:sz="4" w:space="0"/>
-          <w:right w:val="single" w:color="auto" w:sz="4" w:space="0"/>
-          <w:insideH w:val="single" w:color="auto" w:sz="4" w:space="0"/>
-          <w:insideV w:val="single" w:color="auto" w:sz="4" w:space="0"/>
-        </w:tblBorders>
-        <w:tblLayout w:type="autofit"/>
-        <w:tblCellMar>
-          <w:top w:w="0" w:type="dxa"/>
-          <w:left w:w="108" w:type="dxa"/>
-          <w:bottom w:w="0" w:type="dxa"/>
-          <w:right w:w="108" w:type="dxa"/>
-        </w:tblCellMar>
+        <w:tblLook w:val="04A0" w:firstRow="1" w:lastRow="0" w:firstColumn="1" w:lastColumn="0" w:noHBand="0" w:noVBand="1"/>
       </w:tblPr>
       <w:tblGrid>
         <w:gridCol w:w="1555"/>
@@ -888,22 +1124,6 @@
         <w:gridCol w:w="4757"/>
       </w:tblGrid>
       <w:tr>
-        <w:tblPrEx>
-          <w:tblBorders>
-            <w:top w:val="single" w:color="auto" w:sz="4" w:space="0"/>
-            <w:left w:val="single" w:color="auto" w:sz="4" w:space="0"/>
-            <w:bottom w:val="single" w:color="auto" w:sz="4" w:space="0"/>
-            <w:right w:val="single" w:color="auto" w:sz="4" w:space="0"/>
-            <w:insideH w:val="single" w:color="auto" w:sz="4" w:space="0"/>
-            <w:insideV w:val="single" w:color="auto" w:sz="4" w:space="0"/>
-          </w:tblBorders>
-          <w:tblCellMar>
-            <w:top w:w="0" w:type="dxa"/>
-            <w:left w:w="108" w:type="dxa"/>
-            <w:bottom w:w="0" w:type="dxa"/>
-            <w:right w:w="108" w:type="dxa"/>
-          </w:tblCellMar>
-        </w:tblPrEx>
         <w:tc>
           <w:tcPr>
             <w:tcW w:w="1555" w:type="dxa"/>
@@ -913,7 +1133,7 @@
               <w:spacing w:line="300" w:lineRule="auto"/>
               <w:jc w:val="center"/>
               <w:rPr>
-                <w:rFonts w:hint="eastAsia" w:ascii="Times New Roman" w:hAnsi="Times New Roman" w:eastAsia="宋体"/>
+                <w:rFonts w:ascii="Times New Roman" w:eastAsia="宋体" w:hAnsi="Times New Roman"/>
                 <w:b/>
                 <w:bCs/>
                 <w:sz w:val="24"/>
@@ -922,7 +1142,7 @@
             </w:pPr>
             <w:r>
               <w:rPr>
-                <w:rFonts w:hint="eastAsia" w:ascii="Times New Roman" w:hAnsi="Times New Roman" w:eastAsia="宋体"/>
+                <w:rFonts w:ascii="Times New Roman" w:eastAsia="宋体" w:hAnsi="Times New Roman" w:hint="eastAsia"/>
                 <w:b/>
                 <w:bCs/>
                 <w:sz w:val="24"/>
@@ -941,7 +1161,7 @@
               <w:spacing w:line="300" w:lineRule="auto"/>
               <w:jc w:val="center"/>
               <w:rPr>
-                <w:rFonts w:hint="eastAsia" w:ascii="Times New Roman" w:hAnsi="Times New Roman" w:eastAsia="宋体"/>
+                <w:rFonts w:ascii="Times New Roman" w:eastAsia="宋体" w:hAnsi="Times New Roman"/>
                 <w:b/>
                 <w:bCs/>
                 <w:sz w:val="24"/>
@@ -950,7 +1170,7 @@
             </w:pPr>
             <w:r>
               <w:rPr>
-                <w:rFonts w:hint="eastAsia" w:ascii="Times New Roman" w:hAnsi="Times New Roman" w:eastAsia="宋体"/>
+                <w:rFonts w:ascii="Times New Roman" w:eastAsia="宋体" w:hAnsi="Times New Roman" w:hint="eastAsia"/>
                 <w:b/>
                 <w:bCs/>
                 <w:sz w:val="24"/>
@@ -969,7 +1189,7 @@
               <w:spacing w:line="300" w:lineRule="auto"/>
               <w:jc w:val="center"/>
               <w:rPr>
-                <w:rFonts w:hint="eastAsia" w:ascii="Times New Roman" w:hAnsi="Times New Roman" w:eastAsia="宋体"/>
+                <w:rFonts w:ascii="Times New Roman" w:eastAsia="宋体" w:hAnsi="Times New Roman"/>
                 <w:b/>
                 <w:bCs/>
                 <w:sz w:val="24"/>
@@ -978,7 +1198,7 @@
             </w:pPr>
             <w:r>
               <w:rPr>
-                <w:rFonts w:hint="eastAsia" w:ascii="Times New Roman" w:hAnsi="Times New Roman" w:eastAsia="宋体"/>
+                <w:rFonts w:ascii="Times New Roman" w:eastAsia="宋体" w:hAnsi="Times New Roman" w:hint="eastAsia"/>
                 <w:b/>
                 <w:bCs/>
                 <w:sz w:val="24"/>
@@ -990,22 +1210,6 @@
         </w:tc>
       </w:tr>
       <w:tr>
-        <w:tblPrEx>
-          <w:tblBorders>
-            <w:top w:val="single" w:color="auto" w:sz="4" w:space="0"/>
-            <w:left w:val="single" w:color="auto" w:sz="4" w:space="0"/>
-            <w:bottom w:val="single" w:color="auto" w:sz="4" w:space="0"/>
-            <w:right w:val="single" w:color="auto" w:sz="4" w:space="0"/>
-            <w:insideH w:val="single" w:color="auto" w:sz="4" w:space="0"/>
-            <w:insideV w:val="single" w:color="auto" w:sz="4" w:space="0"/>
-          </w:tblBorders>
-          <w:tblCellMar>
-            <w:top w:w="0" w:type="dxa"/>
-            <w:left w:w="108" w:type="dxa"/>
-            <w:bottom w:w="0" w:type="dxa"/>
-            <w:right w:w="108" w:type="dxa"/>
-          </w:tblCellMar>
-        </w:tblPrEx>
         <w:tc>
           <w:tcPr>
             <w:tcW w:w="1555" w:type="dxa"/>
@@ -1014,7 +1218,7 @@
             <w:pPr>
               <w:spacing w:line="300" w:lineRule="auto"/>
               <w:rPr>
-                <w:rFonts w:hint="eastAsia" w:ascii="Times New Roman" w:hAnsi="Times New Roman" w:eastAsia="宋体"/>
+                <w:rFonts w:ascii="Times New Roman" w:eastAsia="宋体" w:hAnsi="Times New Roman"/>
                 <w:sz w:val="24"/>
                 <w:szCs w:val="24"/>
               </w:rPr>
@@ -1029,7 +1233,7 @@
             <w:pPr>
               <w:spacing w:line="300" w:lineRule="auto"/>
               <w:rPr>
-                <w:rFonts w:hint="eastAsia" w:ascii="Times New Roman" w:hAnsi="Times New Roman" w:eastAsia="宋体"/>
+                <w:rFonts w:ascii="Times New Roman" w:eastAsia="宋体" w:hAnsi="Times New Roman"/>
                 <w:sz w:val="24"/>
                 <w:szCs w:val="24"/>
               </w:rPr>
@@ -1044,7 +1248,7 @@
             <w:pPr>
               <w:spacing w:line="300" w:lineRule="auto"/>
               <w:rPr>
-                <w:rFonts w:hint="eastAsia" w:ascii="Times New Roman" w:hAnsi="Times New Roman" w:eastAsia="宋体"/>
+                <w:rFonts w:ascii="Times New Roman" w:eastAsia="宋体" w:hAnsi="Times New Roman"/>
                 <w:sz w:val="24"/>
                 <w:szCs w:val="24"/>
               </w:rPr>
@@ -1053,22 +1257,6 @@
         </w:tc>
       </w:tr>
       <w:tr>
-        <w:tblPrEx>
-          <w:tblBorders>
-            <w:top w:val="single" w:color="auto" w:sz="4" w:space="0"/>
-            <w:left w:val="single" w:color="auto" w:sz="4" w:space="0"/>
-            <w:bottom w:val="single" w:color="auto" w:sz="4" w:space="0"/>
-            <w:right w:val="single" w:color="auto" w:sz="4" w:space="0"/>
-            <w:insideH w:val="single" w:color="auto" w:sz="4" w:space="0"/>
-            <w:insideV w:val="single" w:color="auto" w:sz="4" w:space="0"/>
-          </w:tblBorders>
-          <w:tblCellMar>
-            <w:top w:w="0" w:type="dxa"/>
-            <w:left w:w="108" w:type="dxa"/>
-            <w:bottom w:w="0" w:type="dxa"/>
-            <w:right w:w="108" w:type="dxa"/>
-          </w:tblCellMar>
-        </w:tblPrEx>
         <w:tc>
           <w:tcPr>
             <w:tcW w:w="1555" w:type="dxa"/>
@@ -1077,7 +1265,7 @@
             <w:pPr>
               <w:spacing w:line="300" w:lineRule="auto"/>
               <w:rPr>
-                <w:rFonts w:hint="eastAsia" w:ascii="Times New Roman" w:hAnsi="Times New Roman" w:eastAsia="宋体"/>
+                <w:rFonts w:ascii="Times New Roman" w:eastAsia="宋体" w:hAnsi="Times New Roman"/>
                 <w:sz w:val="24"/>
                 <w:szCs w:val="24"/>
               </w:rPr>
@@ -1092,7 +1280,7 @@
             <w:pPr>
               <w:spacing w:line="300" w:lineRule="auto"/>
               <w:rPr>
-                <w:rFonts w:hint="eastAsia" w:ascii="Times New Roman" w:hAnsi="Times New Roman" w:eastAsia="宋体"/>
+                <w:rFonts w:ascii="Times New Roman" w:eastAsia="宋体" w:hAnsi="Times New Roman"/>
                 <w:sz w:val="24"/>
                 <w:szCs w:val="24"/>
               </w:rPr>
@@ -1107,7 +1295,7 @@
             <w:pPr>
               <w:spacing w:line="300" w:lineRule="auto"/>
               <w:rPr>
-                <w:rFonts w:hint="eastAsia" w:ascii="Times New Roman" w:hAnsi="Times New Roman" w:eastAsia="宋体"/>
+                <w:rFonts w:ascii="Times New Roman" w:eastAsia="宋体" w:hAnsi="Times New Roman"/>
                 <w:sz w:val="24"/>
                 <w:szCs w:val="24"/>
               </w:rPr>
@@ -1116,22 +1304,6 @@
         </w:tc>
       </w:tr>
       <w:tr>
-        <w:tblPrEx>
-          <w:tblBorders>
-            <w:top w:val="single" w:color="auto" w:sz="4" w:space="0"/>
-            <w:left w:val="single" w:color="auto" w:sz="4" w:space="0"/>
-            <w:bottom w:val="single" w:color="auto" w:sz="4" w:space="0"/>
-            <w:right w:val="single" w:color="auto" w:sz="4" w:space="0"/>
-            <w:insideH w:val="single" w:color="auto" w:sz="4" w:space="0"/>
-            <w:insideV w:val="single" w:color="auto" w:sz="4" w:space="0"/>
-          </w:tblBorders>
-          <w:tblCellMar>
-            <w:top w:w="0" w:type="dxa"/>
-            <w:left w:w="108" w:type="dxa"/>
-            <w:bottom w:w="0" w:type="dxa"/>
-            <w:right w:w="108" w:type="dxa"/>
-          </w:tblCellMar>
-        </w:tblPrEx>
         <w:tc>
           <w:tcPr>
             <w:tcW w:w="1555" w:type="dxa"/>
@@ -1140,7 +1312,7 @@
             <w:pPr>
               <w:spacing w:line="300" w:lineRule="auto"/>
               <w:rPr>
-                <w:rFonts w:hint="eastAsia" w:ascii="Times New Roman" w:hAnsi="Times New Roman" w:eastAsia="宋体"/>
+                <w:rFonts w:ascii="Times New Roman" w:eastAsia="宋体" w:hAnsi="Times New Roman"/>
                 <w:sz w:val="24"/>
                 <w:szCs w:val="24"/>
               </w:rPr>
@@ -1155,7 +1327,7 @@
             <w:pPr>
               <w:spacing w:line="300" w:lineRule="auto"/>
               <w:rPr>
-                <w:rFonts w:hint="eastAsia" w:ascii="Times New Roman" w:hAnsi="Times New Roman" w:eastAsia="宋体"/>
+                <w:rFonts w:ascii="Times New Roman" w:eastAsia="宋体" w:hAnsi="Times New Roman"/>
                 <w:sz w:val="24"/>
                 <w:szCs w:val="24"/>
               </w:rPr>
@@ -1170,7 +1342,7 @@
             <w:pPr>
               <w:spacing w:line="300" w:lineRule="auto"/>
               <w:rPr>
-                <w:rFonts w:hint="eastAsia" w:ascii="Times New Roman" w:hAnsi="Times New Roman" w:eastAsia="宋体"/>
+                <w:rFonts w:ascii="Times New Roman" w:eastAsia="宋体" w:hAnsi="Times New Roman"/>
                 <w:sz w:val="24"/>
                 <w:szCs w:val="24"/>
               </w:rPr>
@@ -1179,22 +1351,6 @@
         </w:tc>
       </w:tr>
       <w:tr>
-        <w:tblPrEx>
-          <w:tblBorders>
-            <w:top w:val="single" w:color="auto" w:sz="4" w:space="0"/>
-            <w:left w:val="single" w:color="auto" w:sz="4" w:space="0"/>
-            <w:bottom w:val="single" w:color="auto" w:sz="4" w:space="0"/>
-            <w:right w:val="single" w:color="auto" w:sz="4" w:space="0"/>
-            <w:insideH w:val="single" w:color="auto" w:sz="4" w:space="0"/>
-            <w:insideV w:val="single" w:color="auto" w:sz="4" w:space="0"/>
-          </w:tblBorders>
-          <w:tblCellMar>
-            <w:top w:w="0" w:type="dxa"/>
-            <w:left w:w="108" w:type="dxa"/>
-            <w:bottom w:w="0" w:type="dxa"/>
-            <w:right w:w="108" w:type="dxa"/>
-          </w:tblCellMar>
-        </w:tblPrEx>
         <w:tc>
           <w:tcPr>
             <w:tcW w:w="1555" w:type="dxa"/>
@@ -1203,7 +1359,7 @@
             <w:pPr>
               <w:spacing w:line="300" w:lineRule="auto"/>
               <w:rPr>
-                <w:rFonts w:hint="eastAsia" w:ascii="Times New Roman" w:hAnsi="Times New Roman" w:eastAsia="宋体"/>
+                <w:rFonts w:ascii="Times New Roman" w:eastAsia="宋体" w:hAnsi="Times New Roman"/>
                 <w:sz w:val="24"/>
                 <w:szCs w:val="24"/>
               </w:rPr>
@@ -1218,7 +1374,7 @@
             <w:pPr>
               <w:spacing w:line="300" w:lineRule="auto"/>
               <w:rPr>
-                <w:rFonts w:hint="eastAsia" w:ascii="Times New Roman" w:hAnsi="Times New Roman" w:eastAsia="宋体"/>
+                <w:rFonts w:ascii="Times New Roman" w:eastAsia="宋体" w:hAnsi="Times New Roman"/>
                 <w:sz w:val="24"/>
                 <w:szCs w:val="24"/>
               </w:rPr>
@@ -1233,7 +1389,7 @@
             <w:pPr>
               <w:spacing w:line="300" w:lineRule="auto"/>
               <w:rPr>
-                <w:rFonts w:hint="eastAsia" w:ascii="Times New Roman" w:hAnsi="Times New Roman" w:eastAsia="宋体"/>
+                <w:rFonts w:ascii="Times New Roman" w:eastAsia="宋体" w:hAnsi="Times New Roman"/>
                 <w:sz w:val="24"/>
                 <w:szCs w:val="24"/>
               </w:rPr>
@@ -1245,9 +1401,9 @@
     <w:p>
       <w:pPr>
         <w:spacing w:line="300" w:lineRule="auto"/>
-        <w:ind w:firstLine="480" w:firstLineChars="200"/>
-        <w:rPr>
-          <w:rFonts w:hint="eastAsia" w:ascii="Times New Roman" w:hAnsi="Times New Roman" w:eastAsia="宋体"/>
+        <w:ind w:firstLineChars="200" w:firstLine="480"/>
+        <w:rPr>
+          <w:rFonts w:ascii="Times New Roman" w:eastAsia="宋体" w:hAnsi="Times New Roman"/>
           <w:sz w:val="24"/>
           <w:szCs w:val="24"/>
         </w:rPr>
@@ -1261,14 +1417,14 @@
           <w:numId w:val="1"/>
         </w:numPr>
         <w:rPr>
-          <w:rFonts w:ascii="Times New Roman" w:hAnsi="Times New Roman" w:eastAsia="宋体"/>
+          <w:rFonts w:ascii="Times New Roman" w:eastAsia="宋体" w:hAnsi="Times New Roman"/>
           <w:sz w:val="28"/>
           <w:szCs w:val="28"/>
         </w:rPr>
       </w:pPr>
       <w:r>
         <w:rPr>
-          <w:rFonts w:hint="eastAsia" w:ascii="Times New Roman" w:hAnsi="Times New Roman" w:eastAsia="宋体"/>
+          <w:rFonts w:ascii="Times New Roman" w:eastAsia="宋体" w:hAnsi="Times New Roman" w:hint="eastAsia"/>
           <w:sz w:val="28"/>
           <w:szCs w:val="28"/>
         </w:rPr>
@@ -1278,16 +1434,16 @@
     <w:p>
       <w:pPr>
         <w:spacing w:line="300" w:lineRule="auto"/>
-        <w:ind w:firstLine="480" w:firstLineChars="200"/>
-        <w:rPr>
-          <w:rFonts w:ascii="Times New Roman" w:hAnsi="Times New Roman" w:eastAsia="宋体"/>
-          <w:sz w:val="24"/>
-          <w:szCs w:val="24"/>
-        </w:rPr>
-      </w:pPr>
-      <w:r>
-        <w:rPr>
-          <w:rFonts w:hint="eastAsia" w:ascii="Times New Roman" w:hAnsi="Times New Roman" w:eastAsia="宋体"/>
+        <w:ind w:firstLineChars="200" w:firstLine="480"/>
+        <w:rPr>
+          <w:rFonts w:ascii="Times New Roman" w:eastAsia="宋体" w:hAnsi="Times New Roman"/>
+          <w:sz w:val="24"/>
+          <w:szCs w:val="24"/>
+        </w:rPr>
+      </w:pPr>
+      <w:r>
+        <w:rPr>
+          <w:rFonts w:ascii="Times New Roman" w:eastAsia="宋体" w:hAnsi="Times New Roman" w:hint="eastAsia"/>
           <w:sz w:val="24"/>
           <w:szCs w:val="24"/>
         </w:rPr>
@@ -1297,28 +1453,28 @@
     <w:p>
       <w:pPr>
         <w:spacing w:line="300" w:lineRule="auto"/>
-        <w:ind w:firstLine="480" w:firstLineChars="200"/>
-        <w:rPr>
-          <w:rFonts w:hint="eastAsia" w:ascii="Times New Roman" w:hAnsi="Times New Roman" w:eastAsia="宋体"/>
-          <w:sz w:val="24"/>
-          <w:szCs w:val="24"/>
-        </w:rPr>
-      </w:pPr>
-    </w:p>
-    <w:p>
-      <w:pPr>
-        <w:pStyle w:val="3"/>
+        <w:ind w:firstLineChars="200" w:firstLine="480"/>
+        <w:rPr>
+          <w:rFonts w:ascii="Times New Roman" w:eastAsia="宋体" w:hAnsi="Times New Roman"/>
+          <w:sz w:val="24"/>
+          <w:szCs w:val="24"/>
+        </w:rPr>
+      </w:pPr>
+    </w:p>
+    <w:p>
+      <w:pPr>
+        <w:pStyle w:val="a3"/>
         <w:keepNext/>
         <w:jc w:val="center"/>
         <w:rPr>
-          <w:rFonts w:ascii="宋体" w:hAnsi="宋体" w:eastAsia="宋体"/>
-          <w:sz w:val="24"/>
-          <w:szCs w:val="24"/>
-        </w:rPr>
-      </w:pPr>
-      <w:r>
-        <w:rPr>
-          <w:rFonts w:ascii="宋体" w:hAnsi="宋体" w:eastAsia="宋体"/>
+          <w:rFonts w:ascii="宋体" w:eastAsia="宋体" w:hAnsi="宋体"/>
+          <w:sz w:val="24"/>
+          <w:szCs w:val="24"/>
+        </w:rPr>
+      </w:pPr>
+      <w:r>
+        <w:rPr>
+          <w:rFonts w:ascii="宋体" w:eastAsia="宋体" w:hAnsi="宋体"/>
           <w:sz w:val="24"/>
           <w:szCs w:val="24"/>
         </w:rPr>
@@ -1326,7 +1482,7 @@
       </w:r>
       <w:r>
         <w:rPr>
-          <w:rFonts w:ascii="宋体" w:hAnsi="宋体" w:eastAsia="宋体"/>
+          <w:rFonts w:ascii="宋体" w:eastAsia="宋体" w:hAnsi="宋体"/>
           <w:sz w:val="24"/>
           <w:szCs w:val="24"/>
         </w:rPr>
@@ -1334,7 +1490,7 @@
       </w:r>
       <w:r>
         <w:rPr>
-          <w:rFonts w:ascii="宋体" w:hAnsi="宋体" w:eastAsia="宋体"/>
+          <w:rFonts w:ascii="宋体" w:eastAsia="宋体" w:hAnsi="宋体"/>
           <w:sz w:val="24"/>
           <w:szCs w:val="24"/>
         </w:rPr>
@@ -1342,7 +1498,7 @@
       </w:r>
       <w:r>
         <w:rPr>
-          <w:rFonts w:ascii="宋体" w:hAnsi="宋体" w:eastAsia="宋体"/>
+          <w:rFonts w:ascii="宋体" w:eastAsia="宋体" w:hAnsi="宋体"/>
           <w:sz w:val="24"/>
           <w:szCs w:val="24"/>
         </w:rPr>
@@ -1350,7 +1506,7 @@
       </w:r>
       <w:r>
         <w:rPr>
-          <w:rFonts w:ascii="宋体" w:hAnsi="宋体" w:eastAsia="宋体"/>
+          <w:rFonts w:ascii="宋体" w:eastAsia="宋体" w:hAnsi="宋体"/>
           <w:sz w:val="24"/>
           <w:szCs w:val="24"/>
         </w:rPr>
@@ -1358,7 +1514,7 @@
       </w:r>
       <w:r>
         <w:rPr>
-          <w:rFonts w:ascii="宋体" w:hAnsi="宋体" w:eastAsia="宋体"/>
+          <w:rFonts w:ascii="宋体" w:eastAsia="宋体" w:hAnsi="宋体"/>
           <w:sz w:val="24"/>
           <w:szCs w:val="24"/>
         </w:rPr>
@@ -1366,7 +1522,7 @@
       </w:r>
       <w:r>
         <w:rPr>
-          <w:rFonts w:ascii="宋体" w:hAnsi="宋体" w:eastAsia="宋体"/>
+          <w:rFonts w:ascii="宋体" w:eastAsia="宋体" w:hAnsi="宋体"/>
           <w:sz w:val="24"/>
           <w:szCs w:val="24"/>
         </w:rPr>
@@ -1374,7 +1530,7 @@
       </w:r>
       <w:r>
         <w:rPr>
-          <w:rFonts w:hint="eastAsia" w:ascii="宋体" w:hAnsi="宋体" w:eastAsia="宋体"/>
+          <w:rFonts w:ascii="宋体" w:eastAsia="宋体" w:hAnsi="宋体" w:hint="eastAsia"/>
           <w:sz w:val="24"/>
           <w:szCs w:val="24"/>
         </w:rPr>
@@ -1383,24 +1539,9 @@
     </w:p>
     <w:tbl>
       <w:tblPr>
-        <w:tblStyle w:val="7"/>
+        <w:tblStyle w:val="a8"/>
         <w:tblW w:w="0" w:type="auto"/>
-        <w:tblInd w:w="0" w:type="dxa"/>
-        <w:tblBorders>
-          <w:top w:val="single" w:color="auto" w:sz="4" w:space="0"/>
-          <w:left w:val="single" w:color="auto" w:sz="4" w:space="0"/>
-          <w:bottom w:val="single" w:color="auto" w:sz="4" w:space="0"/>
-          <w:right w:val="single" w:color="auto" w:sz="4" w:space="0"/>
-          <w:insideH w:val="single" w:color="auto" w:sz="4" w:space="0"/>
-          <w:insideV w:val="single" w:color="auto" w:sz="4" w:space="0"/>
-        </w:tblBorders>
-        <w:tblLayout w:type="autofit"/>
-        <w:tblCellMar>
-          <w:top w:w="0" w:type="dxa"/>
-          <w:left w:w="108" w:type="dxa"/>
-          <w:bottom w:w="0" w:type="dxa"/>
-          <w:right w:w="108" w:type="dxa"/>
-        </w:tblCellMar>
+        <w:tblLook w:val="04A0" w:firstRow="1" w:lastRow="0" w:firstColumn="1" w:lastColumn="0" w:noHBand="0" w:noVBand="1"/>
       </w:tblPr>
       <w:tblGrid>
         <w:gridCol w:w="791"/>
@@ -1411,22 +1552,6 @@
         <w:gridCol w:w="2205"/>
       </w:tblGrid>
       <w:tr>
-        <w:tblPrEx>
-          <w:tblBorders>
-            <w:top w:val="single" w:color="auto" w:sz="4" w:space="0"/>
-            <w:left w:val="single" w:color="auto" w:sz="4" w:space="0"/>
-            <w:bottom w:val="single" w:color="auto" w:sz="4" w:space="0"/>
-            <w:right w:val="single" w:color="auto" w:sz="4" w:space="0"/>
-            <w:insideH w:val="single" w:color="auto" w:sz="4" w:space="0"/>
-            <w:insideV w:val="single" w:color="auto" w:sz="4" w:space="0"/>
-          </w:tblBorders>
-          <w:tblCellMar>
-            <w:top w:w="0" w:type="dxa"/>
-            <w:left w:w="108" w:type="dxa"/>
-            <w:bottom w:w="0" w:type="dxa"/>
-            <w:right w:w="108" w:type="dxa"/>
-          </w:tblCellMar>
-        </w:tblPrEx>
         <w:tc>
           <w:tcPr>
             <w:tcW w:w="791" w:type="dxa"/>
@@ -1437,7 +1562,7 @@
               <w:spacing w:line="300" w:lineRule="auto"/>
               <w:jc w:val="center"/>
               <w:rPr>
-                <w:rFonts w:hint="eastAsia" w:ascii="Times New Roman" w:hAnsi="Times New Roman" w:eastAsia="宋体"/>
+                <w:rFonts w:ascii="Times New Roman" w:eastAsia="宋体" w:hAnsi="Times New Roman"/>
                 <w:b/>
                 <w:bCs/>
                 <w:sz w:val="24"/>
@@ -1446,7 +1571,7 @@
             </w:pPr>
             <w:r>
               <w:rPr>
-                <w:rFonts w:hint="eastAsia" w:ascii="Times New Roman" w:hAnsi="Times New Roman" w:eastAsia="宋体"/>
+                <w:rFonts w:ascii="Times New Roman" w:eastAsia="宋体" w:hAnsi="Times New Roman" w:hint="eastAsia"/>
                 <w:b/>
                 <w:bCs/>
                 <w:sz w:val="24"/>
@@ -1466,7 +1591,7 @@
               <w:spacing w:line="300" w:lineRule="auto"/>
               <w:jc w:val="center"/>
               <w:rPr>
-                <w:rFonts w:hint="eastAsia" w:ascii="Times New Roman" w:hAnsi="Times New Roman" w:eastAsia="宋体"/>
+                <w:rFonts w:ascii="Times New Roman" w:eastAsia="宋体" w:hAnsi="Times New Roman"/>
                 <w:b/>
                 <w:bCs/>
                 <w:sz w:val="24"/>
@@ -1475,7 +1600,7 @@
             </w:pPr>
             <w:r>
               <w:rPr>
-                <w:rFonts w:hint="eastAsia" w:ascii="Times New Roman" w:hAnsi="Times New Roman" w:eastAsia="宋体"/>
+                <w:rFonts w:ascii="Times New Roman" w:eastAsia="宋体" w:hAnsi="Times New Roman" w:hint="eastAsia"/>
                 <w:b/>
                 <w:bCs/>
                 <w:sz w:val="24"/>
@@ -1495,7 +1620,7 @@
               <w:spacing w:line="300" w:lineRule="auto"/>
               <w:jc w:val="center"/>
               <w:rPr>
-                <w:rFonts w:hint="eastAsia" w:ascii="Times New Roman" w:hAnsi="Times New Roman" w:eastAsia="宋体"/>
+                <w:rFonts w:ascii="Times New Roman" w:eastAsia="宋体" w:hAnsi="Times New Roman"/>
                 <w:b/>
                 <w:bCs/>
                 <w:sz w:val="24"/>
@@ -1504,7 +1629,7 @@
             </w:pPr>
             <w:r>
               <w:rPr>
-                <w:rFonts w:hint="eastAsia" w:ascii="Times New Roman" w:hAnsi="Times New Roman" w:eastAsia="宋体"/>
+                <w:rFonts w:ascii="Times New Roman" w:eastAsia="宋体" w:hAnsi="Times New Roman" w:hint="eastAsia"/>
                 <w:b/>
                 <w:bCs/>
                 <w:sz w:val="24"/>
@@ -1524,7 +1649,7 @@
               <w:spacing w:line="300" w:lineRule="auto"/>
               <w:jc w:val="center"/>
               <w:rPr>
-                <w:rFonts w:hint="eastAsia" w:ascii="Times New Roman" w:hAnsi="Times New Roman" w:eastAsia="宋体"/>
+                <w:rFonts w:ascii="Times New Roman" w:eastAsia="宋体" w:hAnsi="Times New Roman"/>
                 <w:b/>
                 <w:bCs/>
                 <w:sz w:val="24"/>
@@ -1533,7 +1658,7 @@
             </w:pPr>
             <w:r>
               <w:rPr>
-                <w:rFonts w:hint="eastAsia" w:ascii="Times New Roman" w:hAnsi="Times New Roman" w:eastAsia="宋体"/>
+                <w:rFonts w:ascii="Times New Roman" w:eastAsia="宋体" w:hAnsi="Times New Roman" w:hint="eastAsia"/>
                 <w:b/>
                 <w:bCs/>
                 <w:sz w:val="24"/>
@@ -1553,7 +1678,7 @@
               <w:spacing w:line="300" w:lineRule="auto"/>
               <w:jc w:val="center"/>
               <w:rPr>
-                <w:rFonts w:hint="eastAsia" w:ascii="Times New Roman" w:hAnsi="Times New Roman" w:eastAsia="宋体"/>
+                <w:rFonts w:ascii="Times New Roman" w:eastAsia="宋体" w:hAnsi="Times New Roman"/>
                 <w:b/>
                 <w:bCs/>
                 <w:sz w:val="24"/>
@@ -1562,7 +1687,7 @@
             </w:pPr>
             <w:r>
               <w:rPr>
-                <w:rFonts w:hint="eastAsia" w:ascii="Times New Roman" w:hAnsi="Times New Roman" w:eastAsia="宋体"/>
+                <w:rFonts w:ascii="Times New Roman" w:eastAsia="宋体" w:hAnsi="Times New Roman" w:hint="eastAsia"/>
                 <w:b/>
                 <w:bCs/>
                 <w:sz w:val="24"/>
@@ -1582,7 +1707,7 @@
               <w:spacing w:line="300" w:lineRule="auto"/>
               <w:jc w:val="center"/>
               <w:rPr>
-                <w:rFonts w:hint="eastAsia" w:ascii="Times New Roman" w:hAnsi="Times New Roman" w:eastAsia="宋体"/>
+                <w:rFonts w:ascii="Times New Roman" w:eastAsia="宋体" w:hAnsi="Times New Roman"/>
                 <w:b/>
                 <w:bCs/>
                 <w:sz w:val="24"/>
@@ -1591,7 +1716,7 @@
             </w:pPr>
             <w:r>
               <w:rPr>
-                <w:rFonts w:hint="eastAsia" w:ascii="Times New Roman" w:hAnsi="Times New Roman" w:eastAsia="宋体"/>
+                <w:rFonts w:ascii="Times New Roman" w:eastAsia="宋体" w:hAnsi="Times New Roman" w:hint="eastAsia"/>
                 <w:b/>
                 <w:bCs/>
                 <w:sz w:val="24"/>
@@ -1603,22 +1728,6 @@
         </w:tc>
       </w:tr>
       <w:tr>
-        <w:tblPrEx>
-          <w:tblBorders>
-            <w:top w:val="single" w:color="auto" w:sz="4" w:space="0"/>
-            <w:left w:val="single" w:color="auto" w:sz="4" w:space="0"/>
-            <w:bottom w:val="single" w:color="auto" w:sz="4" w:space="0"/>
-            <w:right w:val="single" w:color="auto" w:sz="4" w:space="0"/>
-            <w:insideH w:val="single" w:color="auto" w:sz="4" w:space="0"/>
-            <w:insideV w:val="single" w:color="auto" w:sz="4" w:space="0"/>
-          </w:tblBorders>
-          <w:tblCellMar>
-            <w:top w:w="0" w:type="dxa"/>
-            <w:left w:w="108" w:type="dxa"/>
-            <w:bottom w:w="0" w:type="dxa"/>
-            <w:right w:w="108" w:type="dxa"/>
-          </w:tblCellMar>
-        </w:tblPrEx>
         <w:tc>
           <w:tcPr>
             <w:tcW w:w="791" w:type="dxa"/>
@@ -1629,14 +1738,14 @@
               <w:spacing w:line="300" w:lineRule="auto"/>
               <w:jc w:val="center"/>
               <w:rPr>
-                <w:rFonts w:hint="eastAsia" w:ascii="Times New Roman" w:hAnsi="Times New Roman" w:eastAsia="宋体"/>
+                <w:rFonts w:ascii="Times New Roman" w:eastAsia="宋体" w:hAnsi="Times New Roman"/>
                 <w:sz w:val="24"/>
                 <w:szCs w:val="24"/>
               </w:rPr>
             </w:pPr>
             <w:r>
               <w:rPr>
-                <w:rFonts w:hint="eastAsia" w:ascii="Times New Roman" w:hAnsi="Times New Roman" w:eastAsia="宋体"/>
+                <w:rFonts w:ascii="Times New Roman" w:eastAsia="宋体" w:hAnsi="Times New Roman" w:hint="eastAsia"/>
                 <w:sz w:val="24"/>
                 <w:szCs w:val="24"/>
               </w:rPr>
@@ -1654,14 +1763,14 @@
               <w:spacing w:line="300" w:lineRule="auto"/>
               <w:jc w:val="center"/>
               <w:rPr>
-                <w:rFonts w:hint="eastAsia" w:ascii="Times New Roman" w:hAnsi="Times New Roman" w:eastAsia="宋体"/>
+                <w:rFonts w:ascii="Times New Roman" w:eastAsia="宋体" w:hAnsi="Times New Roman"/>
                 <w:sz w:val="24"/>
                 <w:szCs w:val="24"/>
               </w:rPr>
             </w:pPr>
             <w:r>
               <w:rPr>
-                <w:rFonts w:hint="eastAsia" w:ascii="Times New Roman" w:hAnsi="Times New Roman" w:eastAsia="宋体"/>
+                <w:rFonts w:ascii="Times New Roman" w:eastAsia="宋体" w:hAnsi="Times New Roman" w:hint="eastAsia"/>
                 <w:sz w:val="24"/>
                 <w:szCs w:val="24"/>
               </w:rPr>
@@ -1677,7 +1786,7 @@
             <w:pPr>
               <w:spacing w:line="300" w:lineRule="auto"/>
               <w:rPr>
-                <w:rFonts w:hint="eastAsia" w:ascii="Times New Roman" w:hAnsi="Times New Roman" w:eastAsia="宋体"/>
+                <w:rFonts w:ascii="Times New Roman" w:eastAsia="宋体" w:hAnsi="Times New Roman"/>
                 <w:sz w:val="24"/>
                 <w:szCs w:val="24"/>
               </w:rPr>
@@ -1692,7 +1801,7 @@
             <w:pPr>
               <w:spacing w:line="300" w:lineRule="auto"/>
               <w:rPr>
-                <w:rFonts w:hint="eastAsia" w:ascii="Times New Roman" w:hAnsi="Times New Roman" w:eastAsia="宋体"/>
+                <w:rFonts w:ascii="Times New Roman" w:eastAsia="宋体" w:hAnsi="Times New Roman"/>
                 <w:sz w:val="24"/>
                 <w:szCs w:val="24"/>
               </w:rPr>
@@ -1707,7 +1816,7 @@
             <w:pPr>
               <w:spacing w:line="300" w:lineRule="auto"/>
               <w:rPr>
-                <w:rFonts w:hint="eastAsia" w:ascii="Times New Roman" w:hAnsi="Times New Roman" w:eastAsia="宋体"/>
+                <w:rFonts w:ascii="Times New Roman" w:eastAsia="宋体" w:hAnsi="Times New Roman"/>
                 <w:sz w:val="24"/>
                 <w:szCs w:val="24"/>
               </w:rPr>
@@ -1722,7 +1831,7 @@
             <w:pPr>
               <w:spacing w:line="300" w:lineRule="auto"/>
               <w:rPr>
-                <w:rFonts w:hint="eastAsia" w:ascii="Times New Roman" w:hAnsi="Times New Roman" w:eastAsia="宋体"/>
+                <w:rFonts w:ascii="Times New Roman" w:eastAsia="宋体" w:hAnsi="Times New Roman"/>
                 <w:sz w:val="24"/>
                 <w:szCs w:val="24"/>
               </w:rPr>
@@ -1731,22 +1840,6 @@
         </w:tc>
       </w:tr>
       <w:tr>
-        <w:tblPrEx>
-          <w:tblBorders>
-            <w:top w:val="single" w:color="auto" w:sz="4" w:space="0"/>
-            <w:left w:val="single" w:color="auto" w:sz="4" w:space="0"/>
-            <w:bottom w:val="single" w:color="auto" w:sz="4" w:space="0"/>
-            <w:right w:val="single" w:color="auto" w:sz="4" w:space="0"/>
-            <w:insideH w:val="single" w:color="auto" w:sz="4" w:space="0"/>
-            <w:insideV w:val="single" w:color="auto" w:sz="4" w:space="0"/>
-          </w:tblBorders>
-          <w:tblCellMar>
-            <w:top w:w="0" w:type="dxa"/>
-            <w:left w:w="108" w:type="dxa"/>
-            <w:bottom w:w="0" w:type="dxa"/>
-            <w:right w:w="108" w:type="dxa"/>
-          </w:tblCellMar>
-        </w:tblPrEx>
         <w:tc>
           <w:tcPr>
             <w:tcW w:w="791" w:type="dxa"/>
@@ -1757,14 +1850,14 @@
               <w:spacing w:line="300" w:lineRule="auto"/>
               <w:jc w:val="center"/>
               <w:rPr>
-                <w:rFonts w:hint="eastAsia" w:ascii="Times New Roman" w:hAnsi="Times New Roman" w:eastAsia="宋体"/>
+                <w:rFonts w:ascii="Times New Roman" w:eastAsia="宋体" w:hAnsi="Times New Roman"/>
                 <w:sz w:val="24"/>
                 <w:szCs w:val="24"/>
               </w:rPr>
             </w:pPr>
             <w:r>
               <w:rPr>
-                <w:rFonts w:hint="eastAsia" w:ascii="Times New Roman" w:hAnsi="Times New Roman" w:eastAsia="宋体"/>
+                <w:rFonts w:ascii="Times New Roman" w:eastAsia="宋体" w:hAnsi="Times New Roman" w:hint="eastAsia"/>
                 <w:sz w:val="24"/>
                 <w:szCs w:val="24"/>
               </w:rPr>
@@ -1782,14 +1875,14 @@
               <w:spacing w:line="300" w:lineRule="auto"/>
               <w:jc w:val="center"/>
               <w:rPr>
-                <w:rFonts w:hint="eastAsia" w:ascii="Times New Roman" w:hAnsi="Times New Roman" w:eastAsia="宋体"/>
+                <w:rFonts w:ascii="Times New Roman" w:eastAsia="宋体" w:hAnsi="Times New Roman"/>
                 <w:sz w:val="24"/>
                 <w:szCs w:val="24"/>
               </w:rPr>
             </w:pPr>
             <w:r>
               <w:rPr>
-                <w:rFonts w:hint="eastAsia" w:ascii="Times New Roman" w:hAnsi="Times New Roman" w:eastAsia="宋体"/>
+                <w:rFonts w:ascii="Times New Roman" w:eastAsia="宋体" w:hAnsi="Times New Roman" w:hint="eastAsia"/>
                 <w:sz w:val="24"/>
                 <w:szCs w:val="24"/>
               </w:rPr>
@@ -1805,7 +1898,7 @@
             <w:pPr>
               <w:spacing w:line="300" w:lineRule="auto"/>
               <w:rPr>
-                <w:rFonts w:hint="eastAsia" w:ascii="Times New Roman" w:hAnsi="Times New Roman" w:eastAsia="宋体"/>
+                <w:rFonts w:ascii="Times New Roman" w:eastAsia="宋体" w:hAnsi="Times New Roman"/>
                 <w:sz w:val="24"/>
                 <w:szCs w:val="24"/>
               </w:rPr>
@@ -1820,7 +1913,7 @@
             <w:pPr>
               <w:spacing w:line="300" w:lineRule="auto"/>
               <w:rPr>
-                <w:rFonts w:hint="eastAsia" w:ascii="Times New Roman" w:hAnsi="Times New Roman" w:eastAsia="宋体"/>
+                <w:rFonts w:ascii="Times New Roman" w:eastAsia="宋体" w:hAnsi="Times New Roman"/>
                 <w:sz w:val="24"/>
                 <w:szCs w:val="24"/>
               </w:rPr>
@@ -1835,7 +1928,7 @@
             <w:pPr>
               <w:spacing w:line="300" w:lineRule="auto"/>
               <w:rPr>
-                <w:rFonts w:hint="eastAsia" w:ascii="Times New Roman" w:hAnsi="Times New Roman" w:eastAsia="宋体"/>
+                <w:rFonts w:ascii="Times New Roman" w:eastAsia="宋体" w:hAnsi="Times New Roman"/>
                 <w:sz w:val="24"/>
                 <w:szCs w:val="24"/>
               </w:rPr>
@@ -1850,7 +1943,7 @@
             <w:pPr>
               <w:spacing w:line="300" w:lineRule="auto"/>
               <w:rPr>
-                <w:rFonts w:hint="eastAsia" w:ascii="Times New Roman" w:hAnsi="Times New Roman" w:eastAsia="宋体"/>
+                <w:rFonts w:ascii="Times New Roman" w:eastAsia="宋体" w:hAnsi="Times New Roman"/>
                 <w:sz w:val="24"/>
                 <w:szCs w:val="24"/>
               </w:rPr>
@@ -1859,22 +1952,6 @@
         </w:tc>
       </w:tr>
       <w:tr>
-        <w:tblPrEx>
-          <w:tblBorders>
-            <w:top w:val="single" w:color="auto" w:sz="4" w:space="0"/>
-            <w:left w:val="single" w:color="auto" w:sz="4" w:space="0"/>
-            <w:bottom w:val="single" w:color="auto" w:sz="4" w:space="0"/>
-            <w:right w:val="single" w:color="auto" w:sz="4" w:space="0"/>
-            <w:insideH w:val="single" w:color="auto" w:sz="4" w:space="0"/>
-            <w:insideV w:val="single" w:color="auto" w:sz="4" w:space="0"/>
-          </w:tblBorders>
-          <w:tblCellMar>
-            <w:top w:w="0" w:type="dxa"/>
-            <w:left w:w="108" w:type="dxa"/>
-            <w:bottom w:w="0" w:type="dxa"/>
-            <w:right w:w="108" w:type="dxa"/>
-          </w:tblCellMar>
-        </w:tblPrEx>
         <w:tc>
           <w:tcPr>
             <w:tcW w:w="791" w:type="dxa"/>
@@ -1885,14 +1962,14 @@
               <w:spacing w:line="300" w:lineRule="auto"/>
               <w:jc w:val="center"/>
               <w:rPr>
-                <w:rFonts w:hint="eastAsia" w:ascii="Times New Roman" w:hAnsi="Times New Roman" w:eastAsia="宋体"/>
+                <w:rFonts w:ascii="Times New Roman" w:eastAsia="宋体" w:hAnsi="Times New Roman"/>
                 <w:sz w:val="24"/>
                 <w:szCs w:val="24"/>
               </w:rPr>
             </w:pPr>
             <w:r>
               <w:rPr>
-                <w:rFonts w:hint="eastAsia" w:ascii="Times New Roman" w:hAnsi="Times New Roman" w:eastAsia="宋体"/>
+                <w:rFonts w:ascii="Times New Roman" w:eastAsia="宋体" w:hAnsi="Times New Roman" w:hint="eastAsia"/>
                 <w:sz w:val="24"/>
                 <w:szCs w:val="24"/>
               </w:rPr>
@@ -1910,14 +1987,14 @@
               <w:spacing w:line="300" w:lineRule="auto"/>
               <w:jc w:val="center"/>
               <w:rPr>
-                <w:rFonts w:hint="eastAsia" w:ascii="Times New Roman" w:hAnsi="Times New Roman" w:eastAsia="宋体"/>
+                <w:rFonts w:ascii="Times New Roman" w:eastAsia="宋体" w:hAnsi="Times New Roman"/>
                 <w:sz w:val="24"/>
                 <w:szCs w:val="24"/>
               </w:rPr>
             </w:pPr>
             <w:r>
               <w:rPr>
-                <w:rFonts w:hint="eastAsia" w:ascii="Times New Roman" w:hAnsi="Times New Roman" w:eastAsia="宋体"/>
+                <w:rFonts w:ascii="Times New Roman" w:eastAsia="宋体" w:hAnsi="Times New Roman" w:hint="eastAsia"/>
                 <w:sz w:val="24"/>
                 <w:szCs w:val="24"/>
               </w:rPr>
@@ -1933,7 +2010,7 @@
             <w:pPr>
               <w:spacing w:line="300" w:lineRule="auto"/>
               <w:rPr>
-                <w:rFonts w:hint="eastAsia" w:ascii="Times New Roman" w:hAnsi="Times New Roman" w:eastAsia="宋体"/>
+                <w:rFonts w:ascii="Times New Roman" w:eastAsia="宋体" w:hAnsi="Times New Roman"/>
                 <w:sz w:val="24"/>
                 <w:szCs w:val="24"/>
               </w:rPr>
@@ -1948,7 +2025,7 @@
             <w:pPr>
               <w:spacing w:line="300" w:lineRule="auto"/>
               <w:rPr>
-                <w:rFonts w:hint="eastAsia" w:ascii="Times New Roman" w:hAnsi="Times New Roman" w:eastAsia="宋体"/>
+                <w:rFonts w:ascii="Times New Roman" w:eastAsia="宋体" w:hAnsi="Times New Roman"/>
                 <w:sz w:val="24"/>
                 <w:szCs w:val="24"/>
               </w:rPr>
@@ -1963,7 +2040,7 @@
             <w:pPr>
               <w:spacing w:line="300" w:lineRule="auto"/>
               <w:rPr>
-                <w:rFonts w:hint="eastAsia" w:ascii="Times New Roman" w:hAnsi="Times New Roman" w:eastAsia="宋体"/>
+                <w:rFonts w:ascii="Times New Roman" w:eastAsia="宋体" w:hAnsi="Times New Roman"/>
                 <w:sz w:val="24"/>
                 <w:szCs w:val="24"/>
               </w:rPr>
@@ -1978,7 +2055,7 @@
             <w:pPr>
               <w:spacing w:line="300" w:lineRule="auto"/>
               <w:rPr>
-                <w:rFonts w:hint="eastAsia" w:ascii="Times New Roman" w:hAnsi="Times New Roman" w:eastAsia="宋体"/>
+                <w:rFonts w:ascii="Times New Roman" w:eastAsia="宋体" w:hAnsi="Times New Roman"/>
                 <w:sz w:val="24"/>
                 <w:szCs w:val="24"/>
               </w:rPr>
@@ -1987,22 +2064,6 @@
         </w:tc>
       </w:tr>
       <w:tr>
-        <w:tblPrEx>
-          <w:tblBorders>
-            <w:top w:val="single" w:color="auto" w:sz="4" w:space="0"/>
-            <w:left w:val="single" w:color="auto" w:sz="4" w:space="0"/>
-            <w:bottom w:val="single" w:color="auto" w:sz="4" w:space="0"/>
-            <w:right w:val="single" w:color="auto" w:sz="4" w:space="0"/>
-            <w:insideH w:val="single" w:color="auto" w:sz="4" w:space="0"/>
-            <w:insideV w:val="single" w:color="auto" w:sz="4" w:space="0"/>
-          </w:tblBorders>
-          <w:tblCellMar>
-            <w:top w:w="0" w:type="dxa"/>
-            <w:left w:w="108" w:type="dxa"/>
-            <w:bottom w:w="0" w:type="dxa"/>
-            <w:right w:w="108" w:type="dxa"/>
-          </w:tblCellMar>
-        </w:tblPrEx>
         <w:tc>
           <w:tcPr>
             <w:tcW w:w="791" w:type="dxa"/>
@@ -2013,14 +2074,14 @@
               <w:spacing w:line="300" w:lineRule="auto"/>
               <w:jc w:val="center"/>
               <w:rPr>
-                <w:rFonts w:hint="eastAsia" w:ascii="Times New Roman" w:hAnsi="Times New Roman" w:eastAsia="宋体"/>
+                <w:rFonts w:ascii="Times New Roman" w:eastAsia="宋体" w:hAnsi="Times New Roman"/>
                 <w:sz w:val="24"/>
                 <w:szCs w:val="24"/>
               </w:rPr>
             </w:pPr>
             <w:r>
               <w:rPr>
-                <w:rFonts w:hint="eastAsia" w:ascii="Times New Roman" w:hAnsi="Times New Roman" w:eastAsia="宋体"/>
+                <w:rFonts w:ascii="Times New Roman" w:eastAsia="宋体" w:hAnsi="Times New Roman" w:hint="eastAsia"/>
                 <w:sz w:val="24"/>
                 <w:szCs w:val="24"/>
               </w:rPr>
@@ -2038,14 +2099,14 @@
               <w:spacing w:line="300" w:lineRule="auto"/>
               <w:jc w:val="center"/>
               <w:rPr>
-                <w:rFonts w:hint="eastAsia" w:ascii="Times New Roman" w:hAnsi="Times New Roman" w:eastAsia="宋体"/>
+                <w:rFonts w:ascii="Times New Roman" w:eastAsia="宋体" w:hAnsi="Times New Roman"/>
                 <w:sz w:val="24"/>
                 <w:szCs w:val="24"/>
               </w:rPr>
             </w:pPr>
             <w:r>
               <w:rPr>
-                <w:rFonts w:hint="eastAsia" w:ascii="Times New Roman" w:hAnsi="Times New Roman" w:eastAsia="宋体"/>
+                <w:rFonts w:ascii="Times New Roman" w:eastAsia="宋体" w:hAnsi="Times New Roman" w:hint="eastAsia"/>
                 <w:sz w:val="24"/>
                 <w:szCs w:val="24"/>
               </w:rPr>
@@ -2061,7 +2122,7 @@
             <w:pPr>
               <w:spacing w:line="300" w:lineRule="auto"/>
               <w:rPr>
-                <w:rFonts w:hint="eastAsia" w:ascii="Times New Roman" w:hAnsi="Times New Roman" w:eastAsia="宋体"/>
+                <w:rFonts w:ascii="Times New Roman" w:eastAsia="宋体" w:hAnsi="Times New Roman"/>
                 <w:sz w:val="24"/>
                 <w:szCs w:val="24"/>
               </w:rPr>
@@ -2076,7 +2137,7 @@
             <w:pPr>
               <w:spacing w:line="300" w:lineRule="auto"/>
               <w:rPr>
-                <w:rFonts w:hint="eastAsia" w:ascii="Times New Roman" w:hAnsi="Times New Roman" w:eastAsia="宋体"/>
+                <w:rFonts w:ascii="Times New Roman" w:eastAsia="宋体" w:hAnsi="Times New Roman"/>
                 <w:sz w:val="24"/>
                 <w:szCs w:val="24"/>
               </w:rPr>
@@ -2091,7 +2152,7 @@
             <w:pPr>
               <w:spacing w:line="300" w:lineRule="auto"/>
               <w:rPr>
-                <w:rFonts w:hint="eastAsia" w:ascii="Times New Roman" w:hAnsi="Times New Roman" w:eastAsia="宋体"/>
+                <w:rFonts w:ascii="Times New Roman" w:eastAsia="宋体" w:hAnsi="Times New Roman"/>
                 <w:sz w:val="24"/>
                 <w:szCs w:val="24"/>
               </w:rPr>
@@ -2106,7 +2167,7 @@
             <w:pPr>
               <w:spacing w:line="300" w:lineRule="auto"/>
               <w:rPr>
-                <w:rFonts w:hint="eastAsia" w:ascii="Times New Roman" w:hAnsi="Times New Roman" w:eastAsia="宋体"/>
+                <w:rFonts w:ascii="Times New Roman" w:eastAsia="宋体" w:hAnsi="Times New Roman"/>
                 <w:sz w:val="24"/>
                 <w:szCs w:val="24"/>
               </w:rPr>
@@ -2122,6 +2183,10 @@
         <w:jc w:val="center"/>
       </w:pPr>
       <w:r>
+        <w:rPr>
+          <w:noProof/>
+        </w:rPr>
+        <w:lastRenderedPageBreak/>
         <w:drawing>
           <wp:inline distT="0" distB="0" distL="0" distR="0">
             <wp:extent cx="3475990" cy="2485390"/>
@@ -2140,7 +2205,7 @@
                     </pic:cNvPicPr>
                   </pic:nvPicPr>
                   <pic:blipFill>
-                    <a:blip r:embed="rId9"/>
+                    <a:blip r:embed="rId11"/>
                     <a:stretch>
                       <a:fillRect/>
                     </a:stretch>
@@ -2163,17 +2228,17 @@
     </w:p>
     <w:p>
       <w:pPr>
-        <w:pStyle w:val="3"/>
+        <w:pStyle w:val="a3"/>
         <w:jc w:val="center"/>
         <w:rPr>
-          <w:rFonts w:hint="eastAsia" w:ascii="宋体" w:hAnsi="宋体" w:eastAsia="宋体"/>
-          <w:sz w:val="24"/>
-          <w:szCs w:val="24"/>
-        </w:rPr>
-      </w:pPr>
-      <w:r>
-        <w:rPr>
-          <w:rFonts w:ascii="宋体" w:hAnsi="宋体" w:eastAsia="宋体"/>
+          <w:rFonts w:ascii="宋体" w:eastAsia="宋体" w:hAnsi="宋体"/>
+          <w:sz w:val="24"/>
+          <w:szCs w:val="24"/>
+        </w:rPr>
+      </w:pPr>
+      <w:r>
+        <w:rPr>
+          <w:rFonts w:ascii="宋体" w:eastAsia="宋体" w:hAnsi="宋体"/>
           <w:sz w:val="24"/>
           <w:szCs w:val="24"/>
         </w:rPr>
@@ -2181,7 +2246,7 @@
       </w:r>
       <w:r>
         <w:rPr>
-          <w:rFonts w:ascii="宋体" w:hAnsi="宋体" w:eastAsia="宋体"/>
+          <w:rFonts w:ascii="宋体" w:eastAsia="宋体" w:hAnsi="宋体"/>
           <w:sz w:val="24"/>
           <w:szCs w:val="24"/>
         </w:rPr>
@@ -2189,7 +2254,7 @@
       </w:r>
       <w:r>
         <w:rPr>
-          <w:rFonts w:ascii="宋体" w:hAnsi="宋体" w:eastAsia="宋体"/>
+          <w:rFonts w:ascii="宋体" w:eastAsia="宋体" w:hAnsi="宋体"/>
           <w:sz w:val="24"/>
           <w:szCs w:val="24"/>
         </w:rPr>
@@ -2197,7 +2262,7 @@
       </w:r>
       <w:r>
         <w:rPr>
-          <w:rFonts w:ascii="宋体" w:hAnsi="宋体" w:eastAsia="宋体"/>
+          <w:rFonts w:ascii="宋体" w:eastAsia="宋体" w:hAnsi="宋体"/>
           <w:sz w:val="24"/>
           <w:szCs w:val="24"/>
         </w:rPr>
@@ -2205,7 +2270,7 @@
       </w:r>
       <w:r>
         <w:rPr>
-          <w:rFonts w:ascii="宋体" w:hAnsi="宋体" w:eastAsia="宋体"/>
+          <w:rFonts w:ascii="宋体" w:eastAsia="宋体" w:hAnsi="宋体"/>
           <w:sz w:val="24"/>
           <w:szCs w:val="24"/>
         </w:rPr>
@@ -2213,7 +2278,7 @@
       </w:r>
       <w:r>
         <w:rPr>
-          <w:rFonts w:ascii="宋体" w:hAnsi="宋体" w:eastAsia="宋体"/>
+          <w:rFonts w:ascii="宋体" w:eastAsia="宋体" w:hAnsi="宋体"/>
           <w:sz w:val="24"/>
           <w:szCs w:val="24"/>
         </w:rPr>
@@ -2221,7 +2286,7 @@
       </w:r>
       <w:r>
         <w:rPr>
-          <w:rFonts w:ascii="宋体" w:hAnsi="宋体" w:eastAsia="宋体"/>
+          <w:rFonts w:ascii="宋体" w:eastAsia="宋体" w:hAnsi="宋体"/>
           <w:sz w:val="24"/>
           <w:szCs w:val="24"/>
         </w:rPr>
@@ -2229,7 +2294,7 @@
       </w:r>
       <w:r>
         <w:rPr>
-          <w:rFonts w:hint="eastAsia" w:ascii="宋体" w:hAnsi="宋体" w:eastAsia="宋体"/>
+          <w:rFonts w:ascii="宋体" w:eastAsia="宋体" w:hAnsi="宋体" w:hint="eastAsia"/>
           <w:sz w:val="24"/>
           <w:szCs w:val="24"/>
         </w:rPr>
@@ -2244,14 +2309,14 @@
           <w:numId w:val="1"/>
         </w:numPr>
         <w:rPr>
-          <w:rFonts w:ascii="Times New Roman" w:hAnsi="Times New Roman" w:eastAsia="宋体"/>
+          <w:rFonts w:ascii="Times New Roman" w:eastAsia="宋体" w:hAnsi="Times New Roman"/>
           <w:sz w:val="28"/>
           <w:szCs w:val="28"/>
         </w:rPr>
       </w:pPr>
       <w:r>
         <w:rPr>
-          <w:rFonts w:hint="eastAsia" w:ascii="Times New Roman" w:hAnsi="Times New Roman" w:eastAsia="宋体"/>
+          <w:rFonts w:ascii="Times New Roman" w:eastAsia="宋体" w:hAnsi="Times New Roman" w:hint="eastAsia"/>
           <w:sz w:val="28"/>
           <w:szCs w:val="28"/>
         </w:rPr>
@@ -2261,16 +2326,16 @@
     <w:p>
       <w:pPr>
         <w:spacing w:line="300" w:lineRule="auto"/>
-        <w:ind w:firstLine="480" w:firstLineChars="200"/>
-        <w:rPr>
-          <w:rFonts w:hint="eastAsia" w:ascii="Times New Roman" w:hAnsi="Times New Roman" w:eastAsia="宋体"/>
-          <w:sz w:val="24"/>
-          <w:szCs w:val="24"/>
-        </w:rPr>
-      </w:pPr>
-      <w:r>
-        <w:rPr>
-          <w:rFonts w:hint="eastAsia" w:ascii="Times New Roman" w:hAnsi="Times New Roman" w:eastAsia="宋体"/>
+        <w:ind w:firstLineChars="200" w:firstLine="480"/>
+        <w:rPr>
+          <w:rFonts w:ascii="Times New Roman" w:eastAsia="宋体" w:hAnsi="Times New Roman"/>
+          <w:sz w:val="24"/>
+          <w:szCs w:val="24"/>
+        </w:rPr>
+      </w:pPr>
+      <w:r>
+        <w:rPr>
+          <w:rFonts w:ascii="Times New Roman" w:eastAsia="宋体" w:hAnsi="Times New Roman" w:hint="eastAsia"/>
           <w:sz w:val="24"/>
           <w:szCs w:val="24"/>
         </w:rPr>
@@ -2285,14 +2350,14 @@
           <w:numId w:val="1"/>
         </w:numPr>
         <w:rPr>
-          <w:rFonts w:ascii="Times New Roman" w:hAnsi="Times New Roman" w:eastAsia="宋体"/>
+          <w:rFonts w:ascii="Times New Roman" w:eastAsia="宋体" w:hAnsi="Times New Roman"/>
           <w:sz w:val="28"/>
           <w:szCs w:val="28"/>
         </w:rPr>
       </w:pPr>
       <w:r>
         <w:rPr>
-          <w:rFonts w:hint="eastAsia" w:ascii="Times New Roman" w:hAnsi="Times New Roman" w:eastAsia="宋体"/>
+          <w:rFonts w:ascii="Times New Roman" w:eastAsia="宋体" w:hAnsi="Times New Roman" w:hint="eastAsia"/>
           <w:sz w:val="28"/>
           <w:szCs w:val="28"/>
         </w:rPr>
@@ -2302,16 +2367,16 @@
     <w:p>
       <w:pPr>
         <w:spacing w:line="300" w:lineRule="auto"/>
-        <w:ind w:firstLine="480" w:firstLineChars="200"/>
-        <w:rPr>
-          <w:rFonts w:hint="eastAsia" w:ascii="Times New Roman" w:hAnsi="Times New Roman" w:eastAsia="宋体"/>
-          <w:sz w:val="24"/>
-          <w:szCs w:val="24"/>
-        </w:rPr>
-      </w:pPr>
-      <w:r>
-        <w:rPr>
-          <w:rFonts w:hint="eastAsia" w:ascii="Times New Roman" w:hAnsi="Times New Roman" w:eastAsia="宋体"/>
+        <w:ind w:firstLineChars="200" w:firstLine="480"/>
+        <w:rPr>
+          <w:rFonts w:ascii="Times New Roman" w:eastAsia="宋体" w:hAnsi="Times New Roman"/>
+          <w:sz w:val="24"/>
+          <w:szCs w:val="24"/>
+        </w:rPr>
+      </w:pPr>
+      <w:r>
+        <w:rPr>
+          <w:rFonts w:ascii="Times New Roman" w:eastAsia="宋体" w:hAnsi="Times New Roman" w:hint="eastAsia"/>
           <w:sz w:val="24"/>
           <w:szCs w:val="24"/>
         </w:rPr>
@@ -2326,63 +2391,37 @@
           <w:numId w:val="1"/>
         </w:numPr>
         <w:rPr>
-          <w:rFonts w:ascii="Times New Roman" w:hAnsi="Times New Roman" w:eastAsia="宋体"/>
+          <w:rFonts w:ascii="Times New Roman" w:eastAsia="宋体" w:hAnsi="Times New Roman"/>
           <w:sz w:val="28"/>
           <w:szCs w:val="28"/>
         </w:rPr>
       </w:pPr>
       <w:r>
         <w:rPr>
-          <w:rFonts w:hint="eastAsia" w:ascii="Times New Roman" w:hAnsi="Times New Roman" w:eastAsia="宋体"/>
+          <w:rFonts w:ascii="Times New Roman" w:eastAsia="宋体" w:hAnsi="Times New Roman" w:hint="eastAsia"/>
           <w:sz w:val="28"/>
           <w:szCs w:val="28"/>
-          <w:lang w:val="en-US" w:eastAsia="zh-CN"/>
-        </w:rPr>
-        <w:t>关键功能</w:t>
-      </w:r>
-      <w:r>
-        <w:rPr>
-          <w:rFonts w:hint="eastAsia" w:ascii="Times New Roman" w:hAnsi="Times New Roman" w:eastAsia="宋体"/>
-          <w:sz w:val="28"/>
-          <w:szCs w:val="28"/>
-        </w:rPr>
-        <w:t>实现</w:t>
+        </w:rPr>
+        <w:t>关键功能实现</w:t>
       </w:r>
     </w:p>
     <w:p>
       <w:pPr>
         <w:spacing w:line="300" w:lineRule="auto"/>
-        <w:ind w:firstLine="480" w:firstLineChars="200"/>
-        <w:rPr>
-          <w:rFonts w:hint="eastAsia" w:ascii="Times New Roman" w:hAnsi="Times New Roman" w:eastAsia="宋体"/>
-          <w:sz w:val="24"/>
-          <w:szCs w:val="24"/>
-        </w:rPr>
-      </w:pPr>
-      <w:r>
-        <w:rPr>
-          <w:rFonts w:hint="eastAsia" w:ascii="Times New Roman" w:hAnsi="Times New Roman" w:eastAsia="宋体"/>
-          <w:sz w:val="24"/>
-          <w:szCs w:val="24"/>
-        </w:rPr>
-        <w:t>描述</w:t>
-      </w:r>
-      <w:r>
-        <w:rPr>
-          <w:rFonts w:hint="eastAsia" w:ascii="Times New Roman" w:hAnsi="Times New Roman" w:eastAsia="宋体"/>
-          <w:sz w:val="24"/>
-          <w:szCs w:val="24"/>
-          <w:lang w:val="en-US" w:eastAsia="zh-CN"/>
-        </w:rPr>
-        <w:t>关键功能的实现，注意说明</w:t>
-      </w:r>
-      <w:r>
-        <w:rPr>
-          <w:rFonts w:hint="eastAsia" w:ascii="Times New Roman" w:hAnsi="Times New Roman" w:eastAsia="宋体"/>
-          <w:sz w:val="24"/>
-          <w:szCs w:val="24"/>
-        </w:rPr>
-        <w:t>你是如何一步步将设计转化为实际程序的，包括开发环境搭建、关键功能的实现细节、遇到的问题与解决方法等。</w:t>
+        <w:ind w:firstLineChars="200" w:firstLine="480"/>
+        <w:rPr>
+          <w:rFonts w:ascii="Times New Roman" w:eastAsia="宋体" w:hAnsi="Times New Roman"/>
+          <w:sz w:val="24"/>
+          <w:szCs w:val="24"/>
+        </w:rPr>
+      </w:pPr>
+      <w:r>
+        <w:rPr>
+          <w:rFonts w:ascii="Times New Roman" w:eastAsia="宋体" w:hAnsi="Times New Roman" w:hint="eastAsia"/>
+          <w:sz w:val="24"/>
+          <w:szCs w:val="24"/>
+        </w:rPr>
+        <w:t>描述关键功能的实现，注意说明你是如何一步步将设计转化为实际程序的，包括开发环境搭建、关键功能的实现细节、遇到的问题与解决方法等。</w:t>
       </w:r>
     </w:p>
     <w:p>
@@ -2393,42 +2432,33 @@
           <w:numId w:val="1"/>
         </w:numPr>
         <w:rPr>
-          <w:rFonts w:ascii="Times New Roman" w:hAnsi="Times New Roman" w:eastAsia="宋体"/>
+          <w:rFonts w:ascii="Times New Roman" w:eastAsia="宋体" w:hAnsi="Times New Roman"/>
           <w:sz w:val="28"/>
           <w:szCs w:val="28"/>
         </w:rPr>
       </w:pPr>
       <w:r>
         <w:rPr>
-          <w:rFonts w:hint="eastAsia" w:ascii="Times New Roman" w:hAnsi="Times New Roman" w:eastAsia="宋体"/>
+          <w:rFonts w:ascii="Times New Roman" w:eastAsia="宋体" w:hAnsi="Times New Roman" w:hint="eastAsia"/>
           <w:sz w:val="28"/>
           <w:szCs w:val="28"/>
         </w:rPr>
-        <w:t>测试</w:t>
-      </w:r>
-      <w:r>
-        <w:rPr>
-          <w:rFonts w:hint="eastAsia" w:ascii="Times New Roman" w:hAnsi="Times New Roman" w:eastAsia="宋体"/>
-          <w:sz w:val="28"/>
-          <w:szCs w:val="28"/>
-          <w:lang w:val="en-US" w:eastAsia="zh-CN"/>
-        </w:rPr>
-        <w:t>与结果分析</w:t>
+        <w:t>测试与结果分析</w:t>
       </w:r>
     </w:p>
     <w:p>
       <w:pPr>
         <w:spacing w:line="300" w:lineRule="auto"/>
-        <w:ind w:firstLine="480" w:firstLineChars="200"/>
-        <w:rPr>
-          <w:rFonts w:hint="eastAsia" w:ascii="Times New Roman" w:hAnsi="Times New Roman" w:eastAsia="宋体"/>
-          <w:sz w:val="24"/>
-          <w:szCs w:val="24"/>
-        </w:rPr>
-      </w:pPr>
-      <w:r>
-        <w:rPr>
-          <w:rFonts w:hint="eastAsia" w:ascii="Times New Roman" w:hAnsi="Times New Roman" w:eastAsia="宋体"/>
+        <w:ind w:firstLineChars="200" w:firstLine="480"/>
+        <w:rPr>
+          <w:rFonts w:ascii="Times New Roman" w:eastAsia="宋体" w:hAnsi="Times New Roman"/>
+          <w:sz w:val="24"/>
+          <w:szCs w:val="24"/>
+        </w:rPr>
+      </w:pPr>
+      <w:r>
+        <w:rPr>
+          <w:rFonts w:ascii="Times New Roman" w:eastAsia="宋体" w:hAnsi="Times New Roman" w:hint="eastAsia"/>
           <w:sz w:val="24"/>
           <w:szCs w:val="24"/>
         </w:rPr>
@@ -2443,33 +2473,34 @@
           <w:numId w:val="1"/>
         </w:numPr>
         <w:rPr>
-          <w:rFonts w:ascii="Times New Roman" w:hAnsi="Times New Roman" w:eastAsia="宋体"/>
+          <w:rFonts w:ascii="Times New Roman" w:eastAsia="宋体" w:hAnsi="Times New Roman"/>
           <w:sz w:val="28"/>
           <w:szCs w:val="28"/>
         </w:rPr>
       </w:pPr>
       <w:r>
         <w:rPr>
-          <w:rFonts w:hint="eastAsia" w:ascii="Times New Roman" w:hAnsi="Times New Roman" w:eastAsia="宋体"/>
+          <w:rFonts w:ascii="Times New Roman" w:eastAsia="宋体" w:hAnsi="Times New Roman" w:hint="eastAsia"/>
           <w:sz w:val="28"/>
           <w:szCs w:val="28"/>
         </w:rPr>
+        <w:lastRenderedPageBreak/>
         <w:t>总结展望</w:t>
       </w:r>
     </w:p>
     <w:p>
       <w:pPr>
         <w:spacing w:line="300" w:lineRule="auto"/>
-        <w:ind w:firstLine="480" w:firstLineChars="200"/>
-        <w:rPr>
-          <w:rFonts w:hint="eastAsia" w:ascii="Times New Roman" w:hAnsi="Times New Roman" w:eastAsia="宋体"/>
-          <w:sz w:val="24"/>
-          <w:szCs w:val="24"/>
-        </w:rPr>
-      </w:pPr>
-      <w:r>
-        <w:rPr>
-          <w:rFonts w:hint="eastAsia" w:ascii="Times New Roman" w:hAnsi="Times New Roman" w:eastAsia="宋体"/>
+        <w:ind w:firstLineChars="200" w:firstLine="480"/>
+        <w:rPr>
+          <w:rFonts w:ascii="Times New Roman" w:eastAsia="宋体" w:hAnsi="Times New Roman"/>
+          <w:sz w:val="24"/>
+          <w:szCs w:val="24"/>
+        </w:rPr>
+      </w:pPr>
+      <w:r>
+        <w:rPr>
+          <w:rFonts w:ascii="Times New Roman" w:eastAsia="宋体" w:hAnsi="Times New Roman" w:hint="eastAsia"/>
           <w:sz w:val="24"/>
           <w:szCs w:val="24"/>
         </w:rPr>
@@ -2484,14 +2515,14 @@
           <w:numId w:val="1"/>
         </w:numPr>
         <w:rPr>
-          <w:rFonts w:ascii="Times New Roman" w:hAnsi="Times New Roman" w:eastAsia="宋体"/>
+          <w:rFonts w:ascii="Times New Roman" w:eastAsia="宋体" w:hAnsi="Times New Roman"/>
           <w:sz w:val="28"/>
           <w:szCs w:val="28"/>
         </w:rPr>
       </w:pPr>
       <w:r>
         <w:rPr>
-          <w:rFonts w:hint="eastAsia" w:ascii="Times New Roman" w:hAnsi="Times New Roman" w:eastAsia="宋体"/>
+          <w:rFonts w:ascii="Times New Roman" w:eastAsia="宋体" w:hAnsi="Times New Roman" w:hint="eastAsia"/>
           <w:sz w:val="28"/>
           <w:szCs w:val="28"/>
         </w:rPr>
@@ -2501,16 +2532,16 @@
     <w:p>
       <w:pPr>
         <w:spacing w:line="300" w:lineRule="auto"/>
-        <w:ind w:firstLine="480" w:firstLineChars="200"/>
-        <w:rPr>
-          <w:rFonts w:ascii="Times New Roman" w:hAnsi="Times New Roman" w:eastAsia="宋体"/>
-          <w:sz w:val="24"/>
-          <w:szCs w:val="24"/>
-        </w:rPr>
-      </w:pPr>
-      <w:r>
-        <w:rPr>
-          <w:rFonts w:hint="eastAsia" w:ascii="Times New Roman" w:hAnsi="Times New Roman" w:eastAsia="宋体"/>
+        <w:ind w:firstLineChars="200" w:firstLine="480"/>
+        <w:rPr>
+          <w:rFonts w:ascii="Times New Roman" w:eastAsia="宋体" w:hAnsi="Times New Roman"/>
+          <w:sz w:val="24"/>
+          <w:szCs w:val="24"/>
+        </w:rPr>
+      </w:pPr>
+      <w:r>
+        <w:rPr>
+          <w:rFonts w:ascii="Times New Roman" w:eastAsia="宋体" w:hAnsi="Times New Roman" w:hint="eastAsia"/>
           <w:sz w:val="24"/>
           <w:szCs w:val="24"/>
         </w:rPr>
@@ -2520,16 +2551,16 @@
     <w:p>
       <w:pPr>
         <w:spacing w:line="300" w:lineRule="auto"/>
-        <w:ind w:firstLine="480" w:firstLineChars="200"/>
-        <w:rPr>
-          <w:rFonts w:ascii="Times New Roman" w:hAnsi="Times New Roman" w:eastAsia="宋体"/>
-          <w:sz w:val="24"/>
-          <w:szCs w:val="24"/>
-        </w:rPr>
-      </w:pPr>
-      <w:r>
-        <w:rPr>
-          <w:rFonts w:hint="eastAsia" w:ascii="Times New Roman" w:hAnsi="Times New Roman" w:eastAsia="宋体"/>
+        <w:ind w:firstLineChars="200" w:firstLine="480"/>
+        <w:rPr>
+          <w:rFonts w:ascii="Times New Roman" w:eastAsia="宋体" w:hAnsi="Times New Roman"/>
+          <w:sz w:val="24"/>
+          <w:szCs w:val="24"/>
+        </w:rPr>
+      </w:pPr>
+      <w:r>
+        <w:rPr>
+          <w:rFonts w:ascii="Times New Roman" w:eastAsia="宋体" w:hAnsi="Times New Roman" w:hint="eastAsia"/>
           <w:sz w:val="24"/>
           <w:szCs w:val="24"/>
         </w:rPr>
@@ -2539,16 +2570,16 @@
     <w:p>
       <w:pPr>
         <w:spacing w:line="300" w:lineRule="auto"/>
-        <w:ind w:firstLine="480" w:firstLineChars="200"/>
-        <w:rPr>
-          <w:rFonts w:ascii="Times New Roman" w:hAnsi="Times New Roman" w:eastAsia="宋体"/>
-          <w:sz w:val="24"/>
-          <w:szCs w:val="24"/>
-        </w:rPr>
-      </w:pPr>
-      <w:r>
-        <w:rPr>
-          <w:rFonts w:hint="eastAsia" w:ascii="Times New Roman" w:hAnsi="Times New Roman" w:eastAsia="宋体"/>
+        <w:ind w:firstLineChars="200" w:firstLine="480"/>
+        <w:rPr>
+          <w:rFonts w:ascii="Times New Roman" w:eastAsia="宋体" w:hAnsi="Times New Roman"/>
+          <w:sz w:val="24"/>
+          <w:szCs w:val="24"/>
+        </w:rPr>
+      </w:pPr>
+      <w:r>
+        <w:rPr>
+          <w:rFonts w:ascii="Times New Roman" w:eastAsia="宋体" w:hAnsi="Times New Roman" w:hint="eastAsia"/>
           <w:sz w:val="24"/>
           <w:szCs w:val="24"/>
         </w:rPr>
@@ -2558,16 +2589,16 @@
     <w:p>
       <w:pPr>
         <w:spacing w:line="300" w:lineRule="auto"/>
-        <w:ind w:firstLine="480" w:firstLineChars="200"/>
-        <w:rPr>
-          <w:rFonts w:hint="eastAsia" w:ascii="Times New Roman" w:hAnsi="Times New Roman" w:eastAsia="宋体"/>
-          <w:sz w:val="24"/>
-          <w:szCs w:val="24"/>
-        </w:rPr>
-      </w:pPr>
-      <w:r>
-        <w:rPr>
-          <w:rFonts w:hint="eastAsia" w:ascii="Times New Roman" w:hAnsi="Times New Roman" w:eastAsia="宋体"/>
+        <w:ind w:firstLineChars="200" w:firstLine="480"/>
+        <w:rPr>
+          <w:rFonts w:ascii="Times New Roman" w:eastAsia="宋体" w:hAnsi="Times New Roman"/>
+          <w:sz w:val="24"/>
+          <w:szCs w:val="24"/>
+        </w:rPr>
+      </w:pPr>
+      <w:r>
+        <w:rPr>
+          <w:rFonts w:ascii="Times New Roman" w:eastAsia="宋体" w:hAnsi="Times New Roman" w:hint="eastAsia"/>
           <w:sz w:val="24"/>
           <w:szCs w:val="24"/>
         </w:rPr>
@@ -2577,16 +2608,16 @@
     <w:p>
       <w:pPr>
         <w:spacing w:line="300" w:lineRule="auto"/>
-        <w:ind w:firstLine="480" w:firstLineChars="200"/>
-        <w:rPr>
-          <w:rFonts w:ascii="Times New Roman" w:hAnsi="Times New Roman" w:eastAsia="宋体"/>
-          <w:sz w:val="24"/>
-          <w:szCs w:val="24"/>
-        </w:rPr>
-      </w:pPr>
-      <w:r>
-        <w:rPr>
-          <w:rFonts w:ascii="Times New Roman" w:hAnsi="Times New Roman" w:eastAsia="宋体"/>
+        <w:ind w:firstLineChars="200" w:firstLine="480"/>
+        <w:rPr>
+          <w:rFonts w:ascii="Times New Roman" w:eastAsia="宋体" w:hAnsi="Times New Roman"/>
+          <w:sz w:val="24"/>
+          <w:szCs w:val="24"/>
+        </w:rPr>
+      </w:pPr>
+      <w:r>
+        <w:rPr>
+          <w:rFonts w:ascii="Times New Roman" w:eastAsia="宋体" w:hAnsi="Times New Roman"/>
           <w:sz w:val="24"/>
           <w:szCs w:val="24"/>
         </w:rPr>
@@ -2596,16 +2627,16 @@
     <w:p>
       <w:pPr>
         <w:spacing w:line="300" w:lineRule="auto"/>
-        <w:ind w:firstLine="480" w:firstLineChars="200"/>
-        <w:rPr>
-          <w:rFonts w:ascii="Times New Roman" w:hAnsi="Times New Roman" w:eastAsia="宋体"/>
-          <w:sz w:val="24"/>
-          <w:szCs w:val="24"/>
-        </w:rPr>
-      </w:pPr>
-      <w:r>
-        <w:rPr>
-          <w:rFonts w:ascii="Times New Roman" w:hAnsi="Times New Roman" w:eastAsia="宋体"/>
+        <w:ind w:firstLineChars="200" w:firstLine="480"/>
+        <w:rPr>
+          <w:rFonts w:ascii="Times New Roman" w:eastAsia="宋体" w:hAnsi="Times New Roman"/>
+          <w:sz w:val="24"/>
+          <w:szCs w:val="24"/>
+        </w:rPr>
+      </w:pPr>
+      <w:r>
+        <w:rPr>
+          <w:rFonts w:ascii="Times New Roman" w:eastAsia="宋体" w:hAnsi="Times New Roman"/>
           <w:sz w:val="24"/>
           <w:szCs w:val="24"/>
         </w:rPr>
@@ -2615,35 +2646,147 @@
     <w:p>
       <w:pPr>
         <w:spacing w:line="300" w:lineRule="auto"/>
-        <w:ind w:firstLine="480" w:firstLineChars="200"/>
-        <w:rPr>
-          <w:rFonts w:ascii="Times New Roman" w:hAnsi="Times New Roman" w:eastAsia="宋体"/>
-          <w:sz w:val="24"/>
-          <w:szCs w:val="24"/>
-        </w:rPr>
-      </w:pPr>
-      <w:r>
-        <w:rPr>
-          <w:rFonts w:ascii="Times New Roman" w:hAnsi="Times New Roman" w:eastAsia="宋体"/>
-          <w:sz w:val="24"/>
-          <w:szCs w:val="24"/>
-        </w:rPr>
-        <w:t>[3] 王珊, 萨师煊, 数据库系统概论, 第5版. 北京: 高等教育出版社, 2014.</w:t>
+        <w:ind w:firstLineChars="200" w:firstLine="480"/>
+        <w:rPr>
+          <w:rFonts w:ascii="Times New Roman" w:eastAsia="宋体" w:hAnsi="Times New Roman"/>
+          <w:sz w:val="24"/>
+          <w:szCs w:val="24"/>
+        </w:rPr>
+      </w:pPr>
+      <w:r>
+        <w:rPr>
+          <w:rFonts w:ascii="Times New Roman" w:eastAsia="宋体" w:hAnsi="Times New Roman"/>
+          <w:sz w:val="24"/>
+          <w:szCs w:val="24"/>
+        </w:rPr>
+        <w:t xml:space="preserve">[3] </w:t>
+      </w:r>
+      <w:r>
+        <w:rPr>
+          <w:rFonts w:ascii="Times New Roman" w:eastAsia="宋体" w:hAnsi="Times New Roman"/>
+          <w:sz w:val="24"/>
+          <w:szCs w:val="24"/>
+        </w:rPr>
+        <w:t>王珊</w:t>
+      </w:r>
+      <w:r>
+        <w:rPr>
+          <w:rFonts w:ascii="Times New Roman" w:eastAsia="宋体" w:hAnsi="Times New Roman"/>
+          <w:sz w:val="24"/>
+          <w:szCs w:val="24"/>
+        </w:rPr>
+        <w:t xml:space="preserve">, </w:t>
+      </w:r>
+      <w:r>
+        <w:rPr>
+          <w:rFonts w:ascii="Times New Roman" w:eastAsia="宋体" w:hAnsi="Times New Roman"/>
+          <w:sz w:val="24"/>
+          <w:szCs w:val="24"/>
+        </w:rPr>
+        <w:t>萨师煊</w:t>
+      </w:r>
+      <w:r>
+        <w:rPr>
+          <w:rFonts w:ascii="Times New Roman" w:eastAsia="宋体" w:hAnsi="Times New Roman"/>
+          <w:sz w:val="24"/>
+          <w:szCs w:val="24"/>
+        </w:rPr>
+        <w:t xml:space="preserve">, </w:t>
+      </w:r>
+      <w:r>
+        <w:rPr>
+          <w:rFonts w:ascii="Times New Roman" w:eastAsia="宋体" w:hAnsi="Times New Roman"/>
+          <w:sz w:val="24"/>
+          <w:szCs w:val="24"/>
+        </w:rPr>
+        <w:t>数据库系统概论</w:t>
+      </w:r>
+      <w:r>
+        <w:rPr>
+          <w:rFonts w:ascii="Times New Roman" w:eastAsia="宋体" w:hAnsi="Times New Roman"/>
+          <w:sz w:val="24"/>
+          <w:szCs w:val="24"/>
+        </w:rPr>
+        <w:t xml:space="preserve">, </w:t>
+      </w:r>
+      <w:r>
+        <w:rPr>
+          <w:rFonts w:ascii="Times New Roman" w:eastAsia="宋体" w:hAnsi="Times New Roman"/>
+          <w:sz w:val="24"/>
+          <w:szCs w:val="24"/>
+        </w:rPr>
+        <w:t>第</w:t>
+      </w:r>
+      <w:r>
+        <w:rPr>
+          <w:rFonts w:ascii="Times New Roman" w:eastAsia="宋体" w:hAnsi="Times New Roman"/>
+          <w:sz w:val="24"/>
+          <w:szCs w:val="24"/>
+        </w:rPr>
+        <w:t>5</w:t>
+      </w:r>
+      <w:r>
+        <w:rPr>
+          <w:rFonts w:ascii="Times New Roman" w:eastAsia="宋体" w:hAnsi="Times New Roman"/>
+          <w:sz w:val="24"/>
+          <w:szCs w:val="24"/>
+        </w:rPr>
+        <w:t>版</w:t>
+      </w:r>
+      <w:r>
+        <w:rPr>
+          <w:rFonts w:ascii="Times New Roman" w:eastAsia="宋体" w:hAnsi="Times New Roman"/>
+          <w:sz w:val="24"/>
+          <w:szCs w:val="24"/>
+        </w:rPr>
+        <w:t xml:space="preserve">. </w:t>
+      </w:r>
+      <w:r>
+        <w:rPr>
+          <w:rFonts w:ascii="Times New Roman" w:eastAsia="宋体" w:hAnsi="Times New Roman"/>
+          <w:sz w:val="24"/>
+          <w:szCs w:val="24"/>
+        </w:rPr>
+        <w:t>北京</w:t>
+      </w:r>
+      <w:r>
+        <w:rPr>
+          <w:rFonts w:ascii="Times New Roman" w:eastAsia="宋体" w:hAnsi="Times New Roman"/>
+          <w:sz w:val="24"/>
+          <w:szCs w:val="24"/>
+        </w:rPr>
+        <w:t xml:space="preserve">: </w:t>
+      </w:r>
+      <w:r>
+        <w:rPr>
+          <w:rFonts w:ascii="Times New Roman" w:eastAsia="宋体" w:hAnsi="Times New Roman"/>
+          <w:sz w:val="24"/>
+          <w:szCs w:val="24"/>
+        </w:rPr>
+        <w:t>高等教育出版社</w:t>
+      </w:r>
+      <w:r>
+        <w:rPr>
+          <w:rFonts w:ascii="Times New Roman" w:eastAsia="宋体" w:hAnsi="Times New Roman"/>
+          <w:sz w:val="24"/>
+          <w:szCs w:val="24"/>
+        </w:rPr>
+        <w:t>, 2014.</w:t>
       </w:r>
     </w:p>
     <w:p>
       <w:pPr>
         <w:spacing w:line="300" w:lineRule="auto"/>
-        <w:ind w:firstLine="480" w:firstLineChars="200"/>
-        <w:rPr>
-          <w:rFonts w:ascii="Times New Roman" w:hAnsi="Times New Roman" w:eastAsia="宋体"/>
-          <w:sz w:val="24"/>
-          <w:szCs w:val="24"/>
-        </w:rPr>
-      </w:pPr>
-      <w:r>
-        <w:rPr>
-          <w:rFonts w:hint="eastAsia" w:ascii="Times New Roman" w:hAnsi="Times New Roman" w:eastAsia="宋体"/>
+        <w:ind w:firstLineChars="200" w:firstLine="480"/>
+        <w:rPr>
+          <w:rFonts w:ascii="Times New Roman" w:eastAsia="宋体" w:hAnsi="Times New Roman"/>
+          <w:sz w:val="24"/>
+          <w:szCs w:val="24"/>
+        </w:rPr>
+      </w:pPr>
+      <w:r>
+        <w:rPr>
+          <w:rFonts w:ascii="Times New Roman" w:eastAsia="宋体" w:hAnsi="Times New Roman" w:hint="eastAsia"/>
           <w:sz w:val="24"/>
           <w:szCs w:val="24"/>
         </w:rPr>
@@ -2653,16 +2796,16 @@
     <w:p>
       <w:pPr>
         <w:spacing w:line="300" w:lineRule="auto"/>
-        <w:ind w:firstLine="480" w:firstLineChars="200"/>
-        <w:rPr>
-          <w:rFonts w:ascii="Times New Roman" w:hAnsi="Times New Roman" w:eastAsia="宋体"/>
-          <w:sz w:val="24"/>
-          <w:szCs w:val="24"/>
-        </w:rPr>
-      </w:pPr>
-      <w:r>
-        <w:rPr>
-          <w:rFonts w:ascii="Times New Roman" w:hAnsi="Times New Roman" w:eastAsia="宋体"/>
+        <w:ind w:firstLineChars="200" w:firstLine="480"/>
+        <w:rPr>
+          <w:rFonts w:ascii="Times New Roman" w:eastAsia="宋体" w:hAnsi="Times New Roman"/>
+          <w:sz w:val="24"/>
+          <w:szCs w:val="24"/>
+        </w:rPr>
+      </w:pPr>
+      <w:r>
+        <w:rPr>
+          <w:rFonts w:ascii="Times New Roman" w:eastAsia="宋体" w:hAnsi="Times New Roman"/>
           <w:sz w:val="24"/>
           <w:szCs w:val="24"/>
         </w:rPr>
@@ -2672,35 +2815,83 @@
     <w:p>
       <w:pPr>
         <w:spacing w:line="300" w:lineRule="auto"/>
-        <w:ind w:firstLine="480" w:firstLineChars="200"/>
-        <w:rPr>
-          <w:rFonts w:ascii="Times New Roman" w:hAnsi="Times New Roman" w:eastAsia="宋体"/>
-          <w:sz w:val="24"/>
-          <w:szCs w:val="24"/>
-        </w:rPr>
-      </w:pPr>
-      <w:r>
-        <w:rPr>
-          <w:rFonts w:ascii="Times New Roman" w:hAnsi="Times New Roman" w:eastAsia="宋体"/>
-          <w:sz w:val="24"/>
-          <w:szCs w:val="24"/>
-        </w:rPr>
-        <w:t>[5] 李明, “面向对象编程教学研究,” 计算机教育, no. 8, pp. 45–48, 2023.</w:t>
+        <w:ind w:firstLineChars="200" w:firstLine="480"/>
+        <w:rPr>
+          <w:rFonts w:ascii="Times New Roman" w:eastAsia="宋体" w:hAnsi="Times New Roman"/>
+          <w:sz w:val="24"/>
+          <w:szCs w:val="24"/>
+        </w:rPr>
+      </w:pPr>
+      <w:r>
+        <w:rPr>
+          <w:rFonts w:ascii="Times New Roman" w:eastAsia="宋体" w:hAnsi="Times New Roman"/>
+          <w:sz w:val="24"/>
+          <w:szCs w:val="24"/>
+        </w:rPr>
+        <w:t xml:space="preserve">[5] </w:t>
+      </w:r>
+      <w:r>
+        <w:rPr>
+          <w:rFonts w:ascii="Times New Roman" w:eastAsia="宋体" w:hAnsi="Times New Roman"/>
+          <w:sz w:val="24"/>
+          <w:szCs w:val="24"/>
+        </w:rPr>
+        <w:t>李明</w:t>
+      </w:r>
+      <w:r>
+        <w:rPr>
+          <w:rFonts w:ascii="Times New Roman" w:eastAsia="宋体" w:hAnsi="Times New Roman"/>
+          <w:sz w:val="24"/>
+          <w:szCs w:val="24"/>
+        </w:rPr>
+        <w:t>, “</w:t>
+      </w:r>
+      <w:r>
+        <w:rPr>
+          <w:rFonts w:ascii="Times New Roman" w:eastAsia="宋体" w:hAnsi="Times New Roman"/>
+          <w:sz w:val="24"/>
+          <w:szCs w:val="24"/>
+        </w:rPr>
+        <w:t>面向对象编程教学研究</w:t>
+      </w:r>
+      <w:r>
+        <w:rPr>
+          <w:rFonts w:ascii="Times New Roman" w:eastAsia="宋体" w:hAnsi="Times New Roman"/>
+          <w:sz w:val="24"/>
+          <w:szCs w:val="24"/>
+        </w:rPr>
+        <w:t xml:space="preserve">,” </w:t>
+      </w:r>
+      <w:r>
+        <w:rPr>
+          <w:rFonts w:ascii="Times New Roman" w:eastAsia="宋体" w:hAnsi="Times New Roman"/>
+          <w:sz w:val="24"/>
+          <w:szCs w:val="24"/>
+        </w:rPr>
+        <w:t>计算机教育</w:t>
+      </w:r>
+      <w:r>
+        <w:rPr>
+          <w:rFonts w:ascii="Times New Roman" w:eastAsia="宋体" w:hAnsi="Times New Roman"/>
+          <w:sz w:val="24"/>
+          <w:szCs w:val="24"/>
+        </w:rPr>
+        <w:t>, no. 8, pp. 45–48, 2023.</w:t>
       </w:r>
     </w:p>
     <w:p>
       <w:pPr>
         <w:spacing w:line="300" w:lineRule="auto"/>
-        <w:ind w:firstLine="480" w:firstLineChars="200"/>
-        <w:rPr>
-          <w:rFonts w:ascii="Times New Roman" w:hAnsi="Times New Roman" w:eastAsia="宋体"/>
-          <w:sz w:val="24"/>
-          <w:szCs w:val="24"/>
-        </w:rPr>
-      </w:pPr>
-      <w:r>
-        <w:rPr>
-          <w:rFonts w:hint="eastAsia" w:ascii="Times New Roman" w:hAnsi="Times New Roman" w:eastAsia="宋体"/>
+        <w:ind w:firstLineChars="200" w:firstLine="480"/>
+        <w:rPr>
+          <w:rFonts w:ascii="Times New Roman" w:eastAsia="宋体" w:hAnsi="Times New Roman"/>
+          <w:sz w:val="24"/>
+          <w:szCs w:val="24"/>
+        </w:rPr>
+      </w:pPr>
+      <w:r>
+        <w:rPr>
+          <w:rFonts w:ascii="Times New Roman" w:eastAsia="宋体" w:hAnsi="Times New Roman" w:hint="eastAsia"/>
           <w:sz w:val="24"/>
           <w:szCs w:val="24"/>
         </w:rPr>
@@ -2710,16 +2901,16 @@
     <w:p>
       <w:pPr>
         <w:spacing w:line="300" w:lineRule="auto"/>
-        <w:ind w:firstLine="480" w:firstLineChars="200"/>
-        <w:rPr>
-          <w:rFonts w:ascii="Times New Roman" w:hAnsi="Times New Roman" w:eastAsia="宋体"/>
-          <w:sz w:val="24"/>
-          <w:szCs w:val="24"/>
-        </w:rPr>
-      </w:pPr>
-      <w:r>
-        <w:rPr>
-          <w:rFonts w:ascii="Times New Roman" w:hAnsi="Times New Roman" w:eastAsia="宋体"/>
+        <w:ind w:firstLineChars="200" w:firstLine="480"/>
+        <w:rPr>
+          <w:rFonts w:ascii="Times New Roman" w:eastAsia="宋体" w:hAnsi="Times New Roman"/>
+          <w:sz w:val="24"/>
+          <w:szCs w:val="24"/>
+        </w:rPr>
+      </w:pPr>
+      <w:r>
+        <w:rPr>
+          <w:rFonts w:ascii="Times New Roman" w:eastAsia="宋体" w:hAnsi="Times New Roman"/>
           <w:sz w:val="24"/>
           <w:szCs w:val="24"/>
         </w:rPr>
@@ -2729,35 +2920,115 @@
     <w:p>
       <w:pPr>
         <w:spacing w:line="300" w:lineRule="auto"/>
-        <w:ind w:firstLine="480" w:firstLineChars="200"/>
-        <w:rPr>
-          <w:rFonts w:ascii="Times New Roman" w:hAnsi="Times New Roman" w:eastAsia="宋体"/>
-          <w:sz w:val="24"/>
-          <w:szCs w:val="24"/>
-        </w:rPr>
-      </w:pPr>
-      <w:r>
-        <w:rPr>
-          <w:rFonts w:ascii="Times New Roman" w:hAnsi="Times New Roman" w:eastAsia="宋体"/>
-          <w:sz w:val="24"/>
-          <w:szCs w:val="24"/>
-        </w:rPr>
-        <w:t>[7] 刘强, 王芳, “基于C++的图书馆管理系统设计与实现,” 全国高校计算机教育研讨会论文集, 2022, pp. 112–117.</w:t>
+        <w:ind w:firstLineChars="200" w:firstLine="480"/>
+        <w:rPr>
+          <w:rFonts w:ascii="Times New Roman" w:eastAsia="宋体" w:hAnsi="Times New Roman"/>
+          <w:sz w:val="24"/>
+          <w:szCs w:val="24"/>
+        </w:rPr>
+      </w:pPr>
+      <w:r>
+        <w:rPr>
+          <w:rFonts w:ascii="Times New Roman" w:eastAsia="宋体" w:hAnsi="Times New Roman"/>
+          <w:sz w:val="24"/>
+          <w:szCs w:val="24"/>
+        </w:rPr>
+        <w:t xml:space="preserve">[7] </w:t>
+      </w:r>
+      <w:r>
+        <w:rPr>
+          <w:rFonts w:ascii="Times New Roman" w:eastAsia="宋体" w:hAnsi="Times New Roman"/>
+          <w:sz w:val="24"/>
+          <w:szCs w:val="24"/>
+        </w:rPr>
+        <w:t>刘强</w:t>
+      </w:r>
+      <w:r>
+        <w:rPr>
+          <w:rFonts w:ascii="Times New Roman" w:eastAsia="宋体" w:hAnsi="Times New Roman"/>
+          <w:sz w:val="24"/>
+          <w:szCs w:val="24"/>
+        </w:rPr>
+        <w:t xml:space="preserve">, </w:t>
+      </w:r>
+      <w:r>
+        <w:rPr>
+          <w:rFonts w:ascii="Times New Roman" w:eastAsia="宋体" w:hAnsi="Times New Roman"/>
+          <w:sz w:val="24"/>
+          <w:szCs w:val="24"/>
+        </w:rPr>
+        <w:t>王芳</w:t>
+      </w:r>
+      <w:r>
+        <w:rPr>
+          <w:rFonts w:ascii="Times New Roman" w:eastAsia="宋体" w:hAnsi="Times New Roman"/>
+          <w:sz w:val="24"/>
+          <w:szCs w:val="24"/>
+        </w:rPr>
+        <w:t>, “</w:t>
+      </w:r>
+      <w:r>
+        <w:rPr>
+          <w:rFonts w:ascii="Times New Roman" w:eastAsia="宋体" w:hAnsi="Times New Roman"/>
+          <w:sz w:val="24"/>
+          <w:szCs w:val="24"/>
+        </w:rPr>
+        <w:t>基于</w:t>
+      </w:r>
+      <w:r>
+        <w:rPr>
+          <w:rFonts w:ascii="Times New Roman" w:eastAsia="宋体" w:hAnsi="Times New Roman"/>
+          <w:sz w:val="24"/>
+          <w:szCs w:val="24"/>
+        </w:rPr>
+        <w:t>C++</w:t>
+      </w:r>
+      <w:r>
+        <w:rPr>
+          <w:rFonts w:ascii="Times New Roman" w:eastAsia="宋体" w:hAnsi="Times New Roman"/>
+          <w:sz w:val="24"/>
+          <w:szCs w:val="24"/>
+        </w:rPr>
+        <w:t>的图书馆管理系统设计与实现</w:t>
+      </w:r>
+      <w:r>
+        <w:rPr>
+          <w:rFonts w:ascii="Times New Roman" w:eastAsia="宋体" w:hAnsi="Times New Roman"/>
+          <w:sz w:val="24"/>
+          <w:szCs w:val="24"/>
+        </w:rPr>
+        <w:t xml:space="preserve">,” </w:t>
+      </w:r>
+      <w:r>
+        <w:rPr>
+          <w:rFonts w:ascii="Times New Roman" w:eastAsia="宋体" w:hAnsi="Times New Roman"/>
+          <w:sz w:val="24"/>
+          <w:szCs w:val="24"/>
+        </w:rPr>
+        <w:t>全国高校计算机教育研讨会论文集</w:t>
+      </w:r>
+      <w:r>
+        <w:rPr>
+          <w:rFonts w:ascii="Times New Roman" w:eastAsia="宋体" w:hAnsi="Times New Roman"/>
+          <w:sz w:val="24"/>
+          <w:szCs w:val="24"/>
+        </w:rPr>
+        <w:t>, 2022, pp. 112–117.</w:t>
       </w:r>
     </w:p>
     <w:p>
       <w:pPr>
         <w:spacing w:line="300" w:lineRule="auto"/>
-        <w:ind w:firstLine="480" w:firstLineChars="200"/>
-        <w:rPr>
-          <w:rFonts w:ascii="Times New Roman" w:hAnsi="Times New Roman" w:eastAsia="宋体"/>
-          <w:sz w:val="24"/>
-          <w:szCs w:val="24"/>
-        </w:rPr>
-      </w:pPr>
-      <w:r>
-        <w:rPr>
-          <w:rFonts w:hint="eastAsia" w:ascii="Times New Roman" w:hAnsi="Times New Roman" w:eastAsia="宋体"/>
+        <w:ind w:firstLineChars="200" w:firstLine="480"/>
+        <w:rPr>
+          <w:rFonts w:ascii="Times New Roman" w:eastAsia="宋体" w:hAnsi="Times New Roman"/>
+          <w:sz w:val="24"/>
+          <w:szCs w:val="24"/>
+        </w:rPr>
+      </w:pPr>
+      <w:r>
+        <w:rPr>
+          <w:rFonts w:ascii="Times New Roman" w:eastAsia="宋体" w:hAnsi="Times New Roman" w:hint="eastAsia"/>
           <w:sz w:val="24"/>
           <w:szCs w:val="24"/>
         </w:rPr>
@@ -2767,16 +3038,16 @@
     <w:p>
       <w:pPr>
         <w:spacing w:line="300" w:lineRule="auto"/>
-        <w:ind w:firstLine="480" w:firstLineChars="200"/>
-        <w:rPr>
-          <w:rFonts w:ascii="Times New Roman" w:hAnsi="Times New Roman" w:eastAsia="宋体"/>
-          <w:sz w:val="24"/>
-          <w:szCs w:val="24"/>
-        </w:rPr>
-      </w:pPr>
-      <w:r>
-        <w:rPr>
-          <w:rFonts w:ascii="Times New Roman" w:hAnsi="Times New Roman" w:eastAsia="宋体"/>
+        <w:ind w:firstLineChars="200" w:firstLine="480"/>
+        <w:rPr>
+          <w:rFonts w:ascii="Times New Roman" w:eastAsia="宋体" w:hAnsi="Times New Roman"/>
+          <w:sz w:val="24"/>
+          <w:szCs w:val="24"/>
+        </w:rPr>
+      </w:pPr>
+      <w:r>
+        <w:rPr>
+          <w:rFonts w:ascii="Times New Roman" w:eastAsia="宋体" w:hAnsi="Times New Roman"/>
           <w:sz w:val="24"/>
           <w:szCs w:val="24"/>
         </w:rPr>
@@ -2786,16 +3057,16 @@
     <w:p>
       <w:pPr>
         <w:spacing w:line="300" w:lineRule="auto"/>
-        <w:ind w:firstLine="480" w:firstLineChars="200"/>
-        <w:rPr>
-          <w:rFonts w:ascii="Times New Roman" w:hAnsi="Times New Roman" w:eastAsia="宋体"/>
-          <w:sz w:val="24"/>
-          <w:szCs w:val="24"/>
-        </w:rPr>
-      </w:pPr>
-      <w:r>
-        <w:rPr>
-          <w:rFonts w:ascii="Times New Roman" w:hAnsi="Times New Roman" w:eastAsia="宋体"/>
+        <w:ind w:firstLineChars="200" w:firstLine="480"/>
+        <w:rPr>
+          <w:rFonts w:ascii="Times New Roman" w:eastAsia="宋体" w:hAnsi="Times New Roman"/>
+          <w:sz w:val="24"/>
+          <w:szCs w:val="24"/>
+        </w:rPr>
+      </w:pPr>
+      <w:r>
+        <w:rPr>
+          <w:rFonts w:ascii="Times New Roman" w:eastAsia="宋体" w:hAnsi="Times New Roman"/>
           <w:sz w:val="24"/>
           <w:szCs w:val="24"/>
         </w:rPr>
@@ -2805,16 +3076,16 @@
     <w:p>
       <w:pPr>
         <w:spacing w:line="300" w:lineRule="auto"/>
-        <w:ind w:firstLine="480" w:firstLineChars="200"/>
-        <w:rPr>
-          <w:rFonts w:hint="eastAsia" w:ascii="Times New Roman" w:hAnsi="Times New Roman" w:eastAsia="宋体"/>
-          <w:sz w:val="24"/>
-          <w:szCs w:val="24"/>
-        </w:rPr>
-      </w:pPr>
-      <w:r>
-        <w:rPr>
-          <w:rFonts w:ascii="Times New Roman" w:hAnsi="Times New Roman" w:eastAsia="宋体"/>
+        <w:ind w:firstLineChars="200" w:firstLine="480"/>
+        <w:rPr>
+          <w:rFonts w:ascii="Times New Roman" w:eastAsia="宋体" w:hAnsi="Times New Roman"/>
+          <w:sz w:val="24"/>
+          <w:szCs w:val="24"/>
+        </w:rPr>
+      </w:pPr>
+      <w:r>
+        <w:rPr>
+          <w:rFonts w:ascii="Times New Roman" w:eastAsia="宋体" w:hAnsi="Times New Roman"/>
           <w:sz w:val="24"/>
           <w:szCs w:val="24"/>
         </w:rPr>
@@ -2822,54 +3093,70 @@
       </w:r>
     </w:p>
     <w:sectPr>
-      <w:headerReference r:id="rId4" w:type="default"/>
-      <w:footerReference r:id="rId5" w:type="default"/>
+      <w:headerReference w:type="default" r:id="rId12"/>
+      <w:footerReference w:type="default" r:id="rId13"/>
       <w:pgSz w:w="11906" w:h="16838"/>
       <w:pgMar w:top="1440" w:right="1800" w:bottom="1440" w:left="1800" w:header="851" w:footer="992" w:gutter="0"/>
       <w:pgNumType w:start="1"/>
-      <w:cols w:space="425" w:num="1"/>
-      <w:docGrid w:type="lines" w:linePitch="312" w:charSpace="0"/>
+      <w:cols w:space="425"/>
+      <w:docGrid w:type="lines" w:linePitch="312"/>
     </w:sectPr>
   </w:body>
 </w:document>
 </file>
 
+<file path=word/endnotes.xml><?xml version="1.0" encoding="utf-8"?>
+<w:endnotes xmlns:wpc="http://schemas.microsoft.com/office/word/2010/wordprocessingCanvas" xmlns:cx="http://schemas.microsoft.com/office/drawing/2014/chartex" xmlns:cx1="http://schemas.microsoft.com/office/drawing/2015/9/8/chartex" xmlns:cx2="http://schemas.microsoft.com/office/drawing/2015/10/21/chartex" xmlns:cx3="http://schemas.microsoft.com/office/drawing/2016/5/9/chartex" xmlns:cx4="http://schemas.microsoft.com/office/drawing/2016/5/10/chartex" xmlns:cx5="http://schemas.microsoft.com/office/drawing/2016/5/11/chartex" xmlns:cx6="http://schemas.microsoft.com/office/drawing/2016/5/12/chartex" xmlns:cx7="http://schemas.microsoft.com/office/drawing/2016/5/13/chartex" xmlns:cx8="http://schemas.microsoft.com/office/drawing/2016/5/14/chartex" xmlns:mc="http://schemas.openxmlformats.org/markup-compatibility/2006" xmlns:aink="http://schemas.microsoft.com/office/drawing/2016/ink" xmlns:am3d="http://schemas.microsoft.com/office/drawing/2017/model3d" xmlns:o="urn:schemas-microsoft-com:office:office" xmlns:oel="http://schemas.microsoft.com/office/2019/extlst" xmlns:r="http://schemas.openxmlformats.org/officeDocument/2006/relationships" xmlns:m="http://schemas.openxmlformats.org/officeDocument/2006/math" xmlns:v="urn:schemas-microsoft-com:vml" xmlns:wp14="http://schemas.microsoft.com/office/word/2010/wordprocessingDrawing" xmlns:wp="http://schemas.openxmlformats.org/drawingml/2006/wordprocessingDrawing" xmlns:w10="urn:schemas-microsoft-com:office:word" xmlns:w="http://schemas.openxmlformats.org/wordprocessingml/2006/main" xmlns:w14="http://schemas.microsoft.com/office/word/2010/wordml" xmlns:w15="http://schemas.microsoft.com/office/word/2012/wordml" xmlns:w16cex="http://schemas.microsoft.com/office/word/2018/wordml/cex" xmlns:w16cid="http://schemas.microsoft.com/office/word/2016/wordml/cid" xmlns:w16="http://schemas.microsoft.com/office/word/2018/wordml" xmlns:w16du="http://schemas.microsoft.com/office/word/2023/wordml/word16du" xmlns:w16sdtdh="http://schemas.microsoft.com/office/word/2020/wordml/sdtdatahash" xmlns:w16sdtfl="http://schemas.microsoft.com/office/word/2024/wordml/sdtformatlock" xmlns:w16se="http://schemas.microsoft.com/office/word/2015/wordml/symex" xmlns:wpg="http://schemas.microsoft.com/office/word/2010/wordprocessingGroup" xmlns:wpi="http://schemas.microsoft.com/office/word/2010/wordprocessingInk" xmlns:wne="http://schemas.microsoft.com/office/word/2006/wordml" xmlns:wps="http://schemas.microsoft.com/office/word/2010/wordprocessingShape" mc:Ignorable="w14 w15 w16se w16cid w16 w16cex w16sdtdh w16sdtfl w16du wp14">
+  <w:endnote w:type="separator" w:id="-1">
+    <w:p>
+      <w:r>
+        <w:separator/>
+      </w:r>
+    </w:p>
+  </w:endnote>
+  <w:endnote w:type="continuationSeparator" w:id="0">
+    <w:p>
+      <w:r>
+        <w:continuationSeparator/>
+      </w:r>
+    </w:p>
+  </w:endnote>
+</w:endnotes>
+</file>
+
 <file path=word/footer1.xml><?xml version="1.0" encoding="utf-8"?>
-<w:ftr xmlns:wpc="http://schemas.microsoft.com/office/word/2010/wordprocessingCanvas" xmlns:mc="http://schemas.openxmlformats.org/markup-compatibility/2006" xmlns:o="urn:schemas-microsoft-com:office:office" xmlns:r="http://schemas.openxmlformats.org/officeDocument/2006/relationships" xmlns:m="http://schemas.openxmlformats.org/officeDocument/2006/math" xmlns:v="urn:schemas-microsoft-com:vml" xmlns:wp14="http://schemas.microsoft.com/office/word/2010/wordprocessingDrawing" xmlns:wp="http://schemas.openxmlformats.org/drawingml/2006/wordprocessingDrawing" xmlns:w10="urn:schemas-microsoft-com:office:word" xmlns:w="http://schemas.openxmlformats.org/wordprocessingml/2006/main" xmlns:w14="http://schemas.microsoft.com/office/word/2010/wordml" xmlns:w15="http://schemas.microsoft.com/office/word/2012/wordml" xmlns:wpg="http://schemas.microsoft.com/office/word/2010/wordprocessingGroup" xmlns:wpi="http://schemas.microsoft.com/office/word/2010/wordprocessingInk" xmlns:wne="http://schemas.microsoft.com/office/word/2006/wordml" xmlns:wps="http://schemas.microsoft.com/office/word/2010/wordprocessingShape" xmlns:wpsCustomData="http://www.wps.cn/officeDocument/2013/wpsCustomData" mc:Ignorable="w14 w15 wp14">
+<w:ftr xmlns:wpc="http://schemas.microsoft.com/office/word/2010/wordprocessingCanvas" xmlns:cx="http://schemas.microsoft.com/office/drawing/2014/chartex" xmlns:cx1="http://schemas.microsoft.com/office/drawing/2015/9/8/chartex" xmlns:cx2="http://schemas.microsoft.com/office/drawing/2015/10/21/chartex" xmlns:cx3="http://schemas.microsoft.com/office/drawing/2016/5/9/chartex" xmlns:cx4="http://schemas.microsoft.com/office/drawing/2016/5/10/chartex" xmlns:cx5="http://schemas.microsoft.com/office/drawing/2016/5/11/chartex" xmlns:cx6="http://schemas.microsoft.com/office/drawing/2016/5/12/chartex" xmlns:cx7="http://schemas.microsoft.com/office/drawing/2016/5/13/chartex" xmlns:cx8="http://schemas.microsoft.com/office/drawing/2016/5/14/chartex" xmlns:mc="http://schemas.openxmlformats.org/markup-compatibility/2006" xmlns:aink="http://schemas.microsoft.com/office/drawing/2016/ink" xmlns:am3d="http://schemas.microsoft.com/office/drawing/2017/model3d" xmlns:o="urn:schemas-microsoft-com:office:office" xmlns:oel="http://schemas.microsoft.com/office/2019/extlst" xmlns:r="http://schemas.openxmlformats.org/officeDocument/2006/relationships" xmlns:m="http://schemas.openxmlformats.org/officeDocument/2006/math" xmlns:v="urn:schemas-microsoft-com:vml" xmlns:wp14="http://schemas.microsoft.com/office/word/2010/wordprocessingDrawing" xmlns:wp="http://schemas.openxmlformats.org/drawingml/2006/wordprocessingDrawing" xmlns:w10="urn:schemas-microsoft-com:office:word" xmlns:w="http://schemas.openxmlformats.org/wordprocessingml/2006/main" xmlns:w14="http://schemas.microsoft.com/office/word/2010/wordml" xmlns:w15="http://schemas.microsoft.com/office/word/2012/wordml" xmlns:w16cex="http://schemas.microsoft.com/office/word/2018/wordml/cex" xmlns:w16cid="http://schemas.microsoft.com/office/word/2016/wordml/cid" xmlns:w16="http://schemas.microsoft.com/office/word/2018/wordml" xmlns:w16du="http://schemas.microsoft.com/office/word/2023/wordml/word16du" xmlns:w16sdtdh="http://schemas.microsoft.com/office/word/2020/wordml/sdtdatahash" xmlns:w16sdtfl="http://schemas.microsoft.com/office/word/2024/wordml/sdtformatlock" xmlns:w16se="http://schemas.microsoft.com/office/word/2015/wordml/symex" xmlns:wpg="http://schemas.microsoft.com/office/word/2010/wordprocessingGroup" xmlns:wpi="http://schemas.microsoft.com/office/word/2010/wordprocessingInk" xmlns:wne="http://schemas.microsoft.com/office/word/2006/wordml" xmlns:wps="http://schemas.microsoft.com/office/word/2010/wordprocessingShape" mc:Ignorable="w14 w15 w16se w16cid w16 w16cex w16sdtdh w16sdtfl w16du wp14">
   <w:p>
     <w:pPr>
-      <w:pStyle w:val="4"/>
+      <w:pStyle w:val="a4"/>
       <w:jc w:val="center"/>
     </w:pPr>
   </w:p>
   <w:p>
     <w:pPr>
-      <w:pStyle w:val="4"/>
+      <w:pStyle w:val="a4"/>
     </w:pPr>
   </w:p>
 </w:ftr>
 </file>
 
 <file path=word/footer2.xml><?xml version="1.0" encoding="utf-8"?>
-<w:ftr xmlns:wpc="http://schemas.microsoft.com/office/word/2010/wordprocessingCanvas" xmlns:mc="http://schemas.openxmlformats.org/markup-compatibility/2006" xmlns:o="urn:schemas-microsoft-com:office:office" xmlns:r="http://schemas.openxmlformats.org/officeDocument/2006/relationships" xmlns:m="http://schemas.openxmlformats.org/officeDocument/2006/math" xmlns:v="urn:schemas-microsoft-com:vml" xmlns:wp14="http://schemas.microsoft.com/office/word/2010/wordprocessingDrawing" xmlns:wp="http://schemas.openxmlformats.org/drawingml/2006/wordprocessingDrawing" xmlns:w10="urn:schemas-microsoft-com:office:word" xmlns:w="http://schemas.openxmlformats.org/wordprocessingml/2006/main" xmlns:w14="http://schemas.microsoft.com/office/word/2010/wordml" xmlns:w15="http://schemas.microsoft.com/office/word/2012/wordml" xmlns:wpg="http://schemas.microsoft.com/office/word/2010/wordprocessingGroup" xmlns:wpi="http://schemas.microsoft.com/office/word/2010/wordprocessingInk" xmlns:wne="http://schemas.microsoft.com/office/word/2006/wordml" xmlns:wps="http://schemas.microsoft.com/office/word/2010/wordprocessingShape" xmlns:wpsCustomData="http://www.wps.cn/officeDocument/2013/wpsCustomData" mc:Ignorable="w14 w15 wp14">
+<w:ftr xmlns:wpc="http://schemas.microsoft.com/office/word/2010/wordprocessingCanvas" xmlns:cx="http://schemas.microsoft.com/office/drawing/2014/chartex" xmlns:cx1="http://schemas.microsoft.com/office/drawing/2015/9/8/chartex" xmlns:cx2="http://schemas.microsoft.com/office/drawing/2015/10/21/chartex" xmlns:cx3="http://schemas.microsoft.com/office/drawing/2016/5/9/chartex" xmlns:cx4="http://schemas.microsoft.com/office/drawing/2016/5/10/chartex" xmlns:cx5="http://schemas.microsoft.com/office/drawing/2016/5/11/chartex" xmlns:cx6="http://schemas.microsoft.com/office/drawing/2016/5/12/chartex" xmlns:cx7="http://schemas.microsoft.com/office/drawing/2016/5/13/chartex" xmlns:cx8="http://schemas.microsoft.com/office/drawing/2016/5/14/chartex" xmlns:mc="http://schemas.openxmlformats.org/markup-compatibility/2006" xmlns:aink="http://schemas.microsoft.com/office/drawing/2016/ink" xmlns:am3d="http://schemas.microsoft.com/office/drawing/2017/model3d" xmlns:o="urn:schemas-microsoft-com:office:office" xmlns:oel="http://schemas.microsoft.com/office/2019/extlst" xmlns:r="http://schemas.openxmlformats.org/officeDocument/2006/relationships" xmlns:m="http://schemas.openxmlformats.org/officeDocument/2006/math" xmlns:v="urn:schemas-microsoft-com:vml" xmlns:wp14="http://schemas.microsoft.com/office/word/2010/wordprocessingDrawing" xmlns:wp="http://schemas.openxmlformats.org/drawingml/2006/wordprocessingDrawing" xmlns:w10="urn:schemas-microsoft-com:office:word" xmlns:w="http://schemas.openxmlformats.org/wordprocessingml/2006/main" xmlns:w14="http://schemas.microsoft.com/office/word/2010/wordml" xmlns:w15="http://schemas.microsoft.com/office/word/2012/wordml" xmlns:w16cex="http://schemas.microsoft.com/office/word/2018/wordml/cex" xmlns:w16cid="http://schemas.microsoft.com/office/word/2016/wordml/cid" xmlns:w16="http://schemas.microsoft.com/office/word/2018/wordml" xmlns:w16du="http://schemas.microsoft.com/office/word/2023/wordml/word16du" xmlns:w16sdtdh="http://schemas.microsoft.com/office/word/2020/wordml/sdtdatahash" xmlns:w16sdtfl="http://schemas.microsoft.com/office/word/2024/wordml/sdtformatlock" xmlns:w16se="http://schemas.microsoft.com/office/word/2015/wordml/symex" xmlns:wpg="http://schemas.microsoft.com/office/word/2010/wordprocessingGroup" xmlns:wpi="http://schemas.microsoft.com/office/word/2010/wordprocessingInk" xmlns:wne="http://schemas.microsoft.com/office/word/2006/wordml" xmlns:wps="http://schemas.microsoft.com/office/word/2010/wordprocessingShape" mc:Ignorable="w14 w15 w16se w16cid w16 w16cex w16sdtdh w16sdtfl w16du wp14">
   <w:sdt>
     <w:sdtPr>
       <w:id w:val="-1607726684"/>
-      <w:docPartObj>
-        <w:docPartGallery w:val="autotext"/>
-      </w:docPartObj>
     </w:sdtPr>
     <w:sdtContent>
       <w:p>
         <w:pPr>
-          <w:pStyle w:val="4"/>
+          <w:pStyle w:val="a4"/>
           <w:jc w:val="center"/>
         </w:pPr>
         <w:r>
           <w:fldChar w:fldCharType="begin"/>
         </w:r>
         <w:r>
-          <w:instrText xml:space="preserve">PAGE   \* MERGEFORMAT</w:instrText>
+          <w:instrText>PAGE   \* MERGEFORMAT</w:instrText>
         </w:r>
         <w:r>
           <w:fldChar w:fldCharType="separate"/>
@@ -2888,17 +3175,36 @@
   </w:sdt>
   <w:p>
     <w:pPr>
-      <w:pStyle w:val="4"/>
+      <w:pStyle w:val="a4"/>
     </w:pPr>
   </w:p>
 </w:ftr>
 </file>
 
+<file path=word/footnotes.xml><?xml version="1.0" encoding="utf-8"?>
+<w:footnotes xmlns:wpc="http://schemas.microsoft.com/office/word/2010/wordprocessingCanvas" xmlns:cx="http://schemas.microsoft.com/office/drawing/2014/chartex" xmlns:cx1="http://schemas.microsoft.com/office/drawing/2015/9/8/chartex" xmlns:cx2="http://schemas.microsoft.com/office/drawing/2015/10/21/chartex" xmlns:cx3="http://schemas.microsoft.com/office/drawing/2016/5/9/chartex" xmlns:cx4="http://schemas.microsoft.com/office/drawing/2016/5/10/chartex" xmlns:cx5="http://schemas.microsoft.com/office/drawing/2016/5/11/chartex" xmlns:cx6="http://schemas.microsoft.com/office/drawing/2016/5/12/chartex" xmlns:cx7="http://schemas.microsoft.com/office/drawing/2016/5/13/chartex" xmlns:cx8="http://schemas.microsoft.com/office/drawing/2016/5/14/chartex" xmlns:mc="http://schemas.openxmlformats.org/markup-compatibility/2006" xmlns:aink="http://schemas.microsoft.com/office/drawing/2016/ink" xmlns:am3d="http://schemas.microsoft.com/office/drawing/2017/model3d" xmlns:o="urn:schemas-microsoft-com:office:office" xmlns:oel="http://schemas.microsoft.com/office/2019/extlst" xmlns:r="http://schemas.openxmlformats.org/officeDocument/2006/relationships" xmlns:m="http://schemas.openxmlformats.org/officeDocument/2006/math" xmlns:v="urn:schemas-microsoft-com:vml" xmlns:wp14="http://schemas.microsoft.com/office/word/2010/wordprocessingDrawing" xmlns:wp="http://schemas.openxmlformats.org/drawingml/2006/wordprocessingDrawing" xmlns:w10="urn:schemas-microsoft-com:office:word" xmlns:w="http://schemas.openxmlformats.org/wordprocessingml/2006/main" xmlns:w14="http://schemas.microsoft.com/office/word/2010/wordml" xmlns:w15="http://schemas.microsoft.com/office/word/2012/wordml" xmlns:w16cex="http://schemas.microsoft.com/office/word/2018/wordml/cex" xmlns:w16cid="http://schemas.microsoft.com/office/word/2016/wordml/cid" xmlns:w16="http://schemas.microsoft.com/office/word/2018/wordml" xmlns:w16du="http://schemas.microsoft.com/office/word/2023/wordml/word16du" xmlns:w16sdtdh="http://schemas.microsoft.com/office/word/2020/wordml/sdtdatahash" xmlns:w16sdtfl="http://schemas.microsoft.com/office/word/2024/wordml/sdtformatlock" xmlns:w16se="http://schemas.microsoft.com/office/word/2015/wordml/symex" xmlns:wpg="http://schemas.microsoft.com/office/word/2010/wordprocessingGroup" xmlns:wpi="http://schemas.microsoft.com/office/word/2010/wordprocessingInk" xmlns:wne="http://schemas.microsoft.com/office/word/2006/wordml" xmlns:wps="http://schemas.microsoft.com/office/word/2010/wordprocessingShape" mc:Ignorable="w14 w15 w16se w16cid w16 w16cex w16sdtdh w16sdtfl w16du wp14">
+  <w:footnote w:type="separator" w:id="-1">
+    <w:p>
+      <w:r>
+        <w:separator/>
+      </w:r>
+    </w:p>
+  </w:footnote>
+  <w:footnote w:type="continuationSeparator" w:id="0">
+    <w:p>
+      <w:r>
+        <w:continuationSeparator/>
+      </w:r>
+    </w:p>
+  </w:footnote>
+</w:footnotes>
+</file>
+
 <file path=word/header1.xml><?xml version="1.0" encoding="utf-8"?>
-<w:hdr xmlns:wpc="http://schemas.microsoft.com/office/word/2010/wordprocessingCanvas" xmlns:mc="http://schemas.openxmlformats.org/markup-compatibility/2006" xmlns:o="urn:schemas-microsoft-com:office:office" xmlns:r="http://schemas.openxmlformats.org/officeDocument/2006/relationships" xmlns:m="http://schemas.openxmlformats.org/officeDocument/2006/math" xmlns:v="urn:schemas-microsoft-com:vml" xmlns:wp14="http://schemas.microsoft.com/office/word/2010/wordprocessingDrawing" xmlns:wp="http://schemas.openxmlformats.org/drawingml/2006/wordprocessingDrawing" xmlns:w10="urn:schemas-microsoft-com:office:word" xmlns:w="http://schemas.openxmlformats.org/wordprocessingml/2006/main" xmlns:w14="http://schemas.microsoft.com/office/word/2010/wordml" xmlns:w15="http://schemas.microsoft.com/office/word/2012/wordml" xmlns:wpg="http://schemas.microsoft.com/office/word/2010/wordprocessingGroup" xmlns:wpi="http://schemas.microsoft.com/office/word/2010/wordprocessingInk" xmlns:wne="http://schemas.microsoft.com/office/word/2006/wordml" xmlns:wps="http://schemas.microsoft.com/office/word/2010/wordprocessingShape" xmlns:wpsCustomData="http://www.wps.cn/officeDocument/2013/wpsCustomData" mc:Ignorable="w14 w15 wp14">
+<w:hdr xmlns:wpc="http://schemas.microsoft.com/office/word/2010/wordprocessingCanvas" xmlns:cx="http://schemas.microsoft.com/office/drawing/2014/chartex" xmlns:cx1="http://schemas.microsoft.com/office/drawing/2015/9/8/chartex" xmlns:cx2="http://schemas.microsoft.com/office/drawing/2015/10/21/chartex" xmlns:cx3="http://schemas.microsoft.com/office/drawing/2016/5/9/chartex" xmlns:cx4="http://schemas.microsoft.com/office/drawing/2016/5/10/chartex" xmlns:cx5="http://schemas.microsoft.com/office/drawing/2016/5/11/chartex" xmlns:cx6="http://schemas.microsoft.com/office/drawing/2016/5/12/chartex" xmlns:cx7="http://schemas.microsoft.com/office/drawing/2016/5/13/chartex" xmlns:cx8="http://schemas.microsoft.com/office/drawing/2016/5/14/chartex" xmlns:mc="http://schemas.openxmlformats.org/markup-compatibility/2006" xmlns:aink="http://schemas.microsoft.com/office/drawing/2016/ink" xmlns:am3d="http://schemas.microsoft.com/office/drawing/2017/model3d" xmlns:o="urn:schemas-microsoft-com:office:office" xmlns:oel="http://schemas.microsoft.com/office/2019/extlst" xmlns:r="http://schemas.openxmlformats.org/officeDocument/2006/relationships" xmlns:m="http://schemas.openxmlformats.org/officeDocument/2006/math" xmlns:v="urn:schemas-microsoft-com:vml" xmlns:wp14="http://schemas.microsoft.com/office/word/2010/wordprocessingDrawing" xmlns:wp="http://schemas.openxmlformats.org/drawingml/2006/wordprocessingDrawing" xmlns:w10="urn:schemas-microsoft-com:office:word" xmlns:w="http://schemas.openxmlformats.org/wordprocessingml/2006/main" xmlns:w14="http://schemas.microsoft.com/office/word/2010/wordml" xmlns:w15="http://schemas.microsoft.com/office/word/2012/wordml" xmlns:w16cex="http://schemas.microsoft.com/office/word/2018/wordml/cex" xmlns:w16cid="http://schemas.microsoft.com/office/word/2016/wordml/cid" xmlns:w16="http://schemas.microsoft.com/office/word/2018/wordml" xmlns:w16du="http://schemas.microsoft.com/office/word/2023/wordml/word16du" xmlns:w16sdtdh="http://schemas.microsoft.com/office/word/2020/wordml/sdtdatahash" xmlns:w16sdtfl="http://schemas.microsoft.com/office/word/2024/wordml/sdtformatlock" xmlns:w16se="http://schemas.microsoft.com/office/word/2015/wordml/symex" xmlns:wpg="http://schemas.microsoft.com/office/word/2010/wordprocessingGroup" xmlns:wpi="http://schemas.microsoft.com/office/word/2010/wordprocessingInk" xmlns:wne="http://schemas.microsoft.com/office/word/2006/wordml" xmlns:wps="http://schemas.microsoft.com/office/word/2010/wordprocessingShape" mc:Ignorable="w14 w15 w16se w16cid w16 w16cex w16sdtdh w16sdtfl w16du wp14">
   <w:p>
     <w:pPr>
-      <w:pStyle w:val="5"/>
+      <w:pStyle w:val="a6"/>
     </w:pPr>
     <w:r>
       <w:rPr>
@@ -2911,12 +3217,12 @@
 </file>
 
 <file path=word/numbering.xml><?xml version="1.0" encoding="utf-8"?>
-<w:numbering xmlns:wpc="http://schemas.microsoft.com/office/word/2010/wordprocessingCanvas" xmlns:mc="http://schemas.openxmlformats.org/markup-compatibility/2006" xmlns:o="urn:schemas-microsoft-com:office:office" xmlns:r="http://schemas.openxmlformats.org/officeDocument/2006/relationships" xmlns:m="http://schemas.openxmlformats.org/officeDocument/2006/math" xmlns:v="urn:schemas-microsoft-com:vml" xmlns:wp14="http://schemas.microsoft.com/office/word/2010/wordprocessingDrawing" xmlns:wp="http://schemas.openxmlformats.org/drawingml/2006/wordprocessingDrawing" xmlns:w10="urn:schemas-microsoft-com:office:word" xmlns:w="http://schemas.openxmlformats.org/wordprocessingml/2006/main" xmlns:w14="http://schemas.microsoft.com/office/word/2010/wordml" xmlns:wpg="http://schemas.microsoft.com/office/word/2010/wordprocessingGroup" xmlns:wpi="http://schemas.microsoft.com/office/word/2010/wordprocessingInk" xmlns:wne="http://schemas.microsoft.com/office/word/2006/wordml" xmlns:wps="http://schemas.microsoft.com/office/word/2010/wordprocessingShape" xmlns:wpsCustomData="http://www.wps.cn/officeDocument/2013/wpsCustomData" mc:Ignorable="w14 wp14">
-  <w:abstractNum w:abstractNumId="0">
+<w:numbering xmlns:wpc="http://schemas.microsoft.com/office/word/2010/wordprocessingCanvas" xmlns:cx="http://schemas.microsoft.com/office/drawing/2014/chartex" xmlns:cx1="http://schemas.microsoft.com/office/drawing/2015/9/8/chartex" xmlns:cx2="http://schemas.microsoft.com/office/drawing/2015/10/21/chartex" xmlns:cx3="http://schemas.microsoft.com/office/drawing/2016/5/9/chartex" xmlns:cx4="http://schemas.microsoft.com/office/drawing/2016/5/10/chartex" xmlns:cx5="http://schemas.microsoft.com/office/drawing/2016/5/11/chartex" xmlns:cx6="http://schemas.microsoft.com/office/drawing/2016/5/12/chartex" xmlns:cx7="http://schemas.microsoft.com/office/drawing/2016/5/13/chartex" xmlns:cx8="http://schemas.microsoft.com/office/drawing/2016/5/14/chartex" xmlns:mc="http://schemas.openxmlformats.org/markup-compatibility/2006" xmlns:aink="http://schemas.microsoft.com/office/drawing/2016/ink" xmlns:am3d="http://schemas.microsoft.com/office/drawing/2017/model3d" xmlns:o="urn:schemas-microsoft-com:office:office" xmlns:oel="http://schemas.microsoft.com/office/2019/extlst" xmlns:r="http://schemas.openxmlformats.org/officeDocument/2006/relationships" xmlns:m="http://schemas.openxmlformats.org/officeDocument/2006/math" xmlns:v="urn:schemas-microsoft-com:vml" xmlns:wp14="http://schemas.microsoft.com/office/word/2010/wordprocessingDrawing" xmlns:wp="http://schemas.openxmlformats.org/drawingml/2006/wordprocessingDrawing" xmlns:w10="urn:schemas-microsoft-com:office:word" xmlns:w="http://schemas.openxmlformats.org/wordprocessingml/2006/main" xmlns:w14="http://schemas.microsoft.com/office/word/2010/wordml" xmlns:w15="http://schemas.microsoft.com/office/word/2012/wordml" xmlns:w16cex="http://schemas.microsoft.com/office/word/2018/wordml/cex" xmlns:w16cid="http://schemas.microsoft.com/office/word/2016/wordml/cid" xmlns:w16="http://schemas.microsoft.com/office/word/2018/wordml" xmlns:w16du="http://schemas.microsoft.com/office/word/2023/wordml/word16du" xmlns:w16sdtdh="http://schemas.microsoft.com/office/word/2020/wordml/sdtdatahash" xmlns:w16sdtfl="http://schemas.microsoft.com/office/word/2024/wordml/sdtformatlock" xmlns:w16se="http://schemas.microsoft.com/office/word/2015/wordml/symex" xmlns:wpg="http://schemas.microsoft.com/office/word/2010/wordprocessingGroup" xmlns:wpi="http://schemas.microsoft.com/office/word/2010/wordprocessingInk" xmlns:wne="http://schemas.microsoft.com/office/word/2006/wordml" xmlns:wps="http://schemas.microsoft.com/office/word/2010/wordprocessingShape" mc:Ignorable="w14 w15 w16se w16cid w16 w16cex w16sdtdh w16sdtfl w16du wp14">
+  <w:abstractNum w:abstractNumId="0" w15:restartNumberingAfterBreak="0">
     <w:nsid w:val="08BB1082"/>
     <w:multiLevelType w:val="multilevel"/>
     <w:tmpl w:val="08BB1082"/>
-    <w:lvl w:ilvl="0" w:tentative="0">
+    <w:lvl w:ilvl="0">
       <w:start w:val="1"/>
       <w:numFmt w:val="chineseCountingThousand"/>
       <w:lvlText w:val="%1、"/>
@@ -2925,7 +3231,7 @@
         <w:ind w:left="420" w:hanging="420"/>
       </w:pPr>
     </w:lvl>
-    <w:lvl w:ilvl="1" w:tentative="0">
+    <w:lvl w:ilvl="1">
       <w:start w:val="1"/>
       <w:numFmt w:val="lowerLetter"/>
       <w:lvlText w:val="%2)"/>
@@ -2934,7 +3240,7 @@
         <w:ind w:left="840" w:hanging="420"/>
       </w:pPr>
     </w:lvl>
-    <w:lvl w:ilvl="2" w:tentative="0">
+    <w:lvl w:ilvl="2">
       <w:start w:val="1"/>
       <w:numFmt w:val="lowerRoman"/>
       <w:lvlText w:val="%3."/>
@@ -2943,7 +3249,7 @@
         <w:ind w:left="1260" w:hanging="420"/>
       </w:pPr>
     </w:lvl>
-    <w:lvl w:ilvl="3" w:tentative="0">
+    <w:lvl w:ilvl="3">
       <w:start w:val="1"/>
       <w:numFmt w:val="decimal"/>
       <w:lvlText w:val="%4."/>
@@ -2952,7 +3258,7 @@
         <w:ind w:left="1680" w:hanging="420"/>
       </w:pPr>
     </w:lvl>
-    <w:lvl w:ilvl="4" w:tentative="0">
+    <w:lvl w:ilvl="4">
       <w:start w:val="1"/>
       <w:numFmt w:val="lowerLetter"/>
       <w:lvlText w:val="%5)"/>
@@ -2961,7 +3267,7 @@
         <w:ind w:left="2100" w:hanging="420"/>
       </w:pPr>
     </w:lvl>
-    <w:lvl w:ilvl="5" w:tentative="0">
+    <w:lvl w:ilvl="5">
       <w:start w:val="1"/>
       <w:numFmt w:val="lowerRoman"/>
       <w:lvlText w:val="%6."/>
@@ -2970,7 +3276,7 @@
         <w:ind w:left="2520" w:hanging="420"/>
       </w:pPr>
     </w:lvl>
-    <w:lvl w:ilvl="6" w:tentative="0">
+    <w:lvl w:ilvl="6">
       <w:start w:val="1"/>
       <w:numFmt w:val="decimal"/>
       <w:lvlText w:val="%7."/>
@@ -2979,7 +3285,7 @@
         <w:ind w:left="2940" w:hanging="420"/>
       </w:pPr>
     </w:lvl>
-    <w:lvl w:ilvl="7" w:tentative="0">
+    <w:lvl w:ilvl="7">
       <w:start w:val="1"/>
       <w:numFmt w:val="lowerLetter"/>
       <w:lvlText w:val="%8)"/>
@@ -2988,7 +3294,7 @@
         <w:ind w:left="3360" w:hanging="420"/>
       </w:pPr>
     </w:lvl>
-    <w:lvl w:ilvl="8" w:tentative="0">
+    <w:lvl w:ilvl="8">
       <w:start w:val="1"/>
       <w:numFmt w:val="lowerRoman"/>
       <w:lvlText w:val="%9."/>
@@ -2998,296 +3304,420 @@
       </w:pPr>
     </w:lvl>
   </w:abstractNum>
-  <w:num w:numId="1">
+  <w:num w:numId="1" w16cid:durableId="1144736778">
     <w:abstractNumId w:val="0"/>
   </w:num>
 </w:numbering>
 </file>
 
 <file path=word/styles.xml><?xml version="1.0" encoding="utf-8"?>
-<w:styles xmlns:mc="http://schemas.openxmlformats.org/markup-compatibility/2006" xmlns:o="urn:schemas-microsoft-com:office:office" xmlns:r="http://schemas.openxmlformats.org/officeDocument/2006/relationships" xmlns:m="http://schemas.openxmlformats.org/officeDocument/2006/math" xmlns:v="urn:schemas-microsoft-com:vml" xmlns:w="http://schemas.openxmlformats.org/wordprocessingml/2006/main" xmlns:w14="http://schemas.microsoft.com/office/word/2010/wordml" xmlns:w10="urn:schemas-microsoft-com:office:word" xmlns:sl="http://schemas.openxmlformats.org/schemaLibrary/2006/main" xmlns:wpsCustomData="http://www.wps.cn/officeDocument/2013/wpsCustomData" mc:Ignorable="w14">
+<w:styles xmlns:mc="http://schemas.openxmlformats.org/markup-compatibility/2006" xmlns:r="http://schemas.openxmlformats.org/officeDocument/2006/relationships" xmlns:w="http://schemas.openxmlformats.org/wordprocessingml/2006/main" xmlns:w14="http://schemas.microsoft.com/office/word/2010/wordml" xmlns:w15="http://schemas.microsoft.com/office/word/2012/wordml" xmlns:w16cex="http://schemas.microsoft.com/office/word/2018/wordml/cex" xmlns:w16cid="http://schemas.microsoft.com/office/word/2016/wordml/cid" xmlns:w16="http://schemas.microsoft.com/office/word/2018/wordml" xmlns:w16du="http://schemas.microsoft.com/office/word/2023/wordml/word16du" xmlns:w16sdtdh="http://schemas.microsoft.com/office/word/2020/wordml/sdtdatahash" xmlns:w16sdtfl="http://schemas.microsoft.com/office/word/2024/wordml/sdtformatlock" xmlns:w16se="http://schemas.microsoft.com/office/word/2015/wordml/symex" mc:Ignorable="w14 w15 w16se w16cid w16 w16cex w16sdtdh w16sdtfl w16du">
   <w:docDefaults>
     <w:rPrDefault>
       <w:rPr>
-        <w:rFonts w:asciiTheme="minorHAnsi" w:hAnsiTheme="minorHAnsi" w:eastAsiaTheme="minorEastAsia" w:cstheme="minorBidi"/>
+        <w:rFonts w:asciiTheme="minorHAnsi" w:eastAsiaTheme="minorEastAsia" w:hAnsiTheme="minorHAnsi" w:cstheme="minorBidi"/>
+        <w:lang w:val="en-US" w:eastAsia="zh-CN" w:bidi="ar-SA"/>
       </w:rPr>
     </w:rPrDefault>
     <w:pPrDefault/>
   </w:docDefaults>
-  <w:latentStyles w:count="260" w:defQFormat="0" w:defUnhideWhenUsed="1" w:defSemiHidden="1" w:defUIPriority="99" w:defLockedState="0">
-    <w:lsdException w:qFormat="1" w:unhideWhenUsed="0" w:uiPriority="0" w:semiHidden="0" w:name="Normal"/>
-    <w:lsdException w:qFormat="1" w:unhideWhenUsed="0" w:uiPriority="9" w:semiHidden="0" w:name="heading 1"/>
-    <w:lsdException w:qFormat="1" w:unhideWhenUsed="0" w:uiPriority="0" w:semiHidden="0" w:name="heading 2"/>
-    <w:lsdException w:qFormat="1" w:uiPriority="9" w:name="heading 3"/>
-    <w:lsdException w:qFormat="1" w:uiPriority="9" w:name="heading 4"/>
-    <w:lsdException w:qFormat="1" w:uiPriority="9" w:name="heading 5"/>
-    <w:lsdException w:qFormat="1" w:uiPriority="9" w:name="heading 6"/>
-    <w:lsdException w:qFormat="1" w:uiPriority="9" w:name="heading 7"/>
-    <w:lsdException w:qFormat="1" w:uiPriority="9" w:name="heading 8"/>
-    <w:lsdException w:qFormat="1" w:uiPriority="9" w:name="heading 9"/>
-    <w:lsdException w:uiPriority="99" w:name="index 1"/>
-    <w:lsdException w:uiPriority="99" w:name="index 2"/>
-    <w:lsdException w:uiPriority="99" w:name="index 3"/>
-    <w:lsdException w:uiPriority="99" w:name="index 4"/>
-    <w:lsdException w:uiPriority="99" w:name="index 5"/>
-    <w:lsdException w:uiPriority="99" w:name="index 6"/>
-    <w:lsdException w:uiPriority="99" w:name="index 7"/>
-    <w:lsdException w:uiPriority="99" w:name="index 8"/>
-    <w:lsdException w:uiPriority="99" w:name="index 9"/>
-    <w:lsdException w:uiPriority="39" w:name="toc 1"/>
-    <w:lsdException w:uiPriority="39" w:name="toc 2"/>
-    <w:lsdException w:uiPriority="39" w:name="toc 3"/>
-    <w:lsdException w:uiPriority="39" w:name="toc 4"/>
-    <w:lsdException w:uiPriority="39" w:name="toc 5"/>
-    <w:lsdException w:uiPriority="39" w:name="toc 6"/>
-    <w:lsdException w:uiPriority="39" w:name="toc 7"/>
-    <w:lsdException w:uiPriority="39" w:name="toc 8"/>
-    <w:lsdException w:uiPriority="39" w:name="toc 9"/>
-    <w:lsdException w:uiPriority="99" w:name="Normal Indent"/>
-    <w:lsdException w:uiPriority="99" w:name="footnote text"/>
-    <w:lsdException w:uiPriority="99" w:name="annotation text"/>
-    <w:lsdException w:uiPriority="99" w:semiHidden="0" w:name="header"/>
-    <w:lsdException w:uiPriority="99" w:semiHidden="0" w:name="footer"/>
-    <w:lsdException w:uiPriority="99" w:name="index heading"/>
-    <w:lsdException w:qFormat="1" w:uiPriority="35" w:semiHidden="0" w:name="caption"/>
-    <w:lsdException w:uiPriority="99" w:name="table of figures"/>
-    <w:lsdException w:uiPriority="99" w:name="envelope address"/>
-    <w:lsdException w:uiPriority="99" w:name="envelope return"/>
-    <w:lsdException w:uiPriority="99" w:name="footnote reference"/>
-    <w:lsdException w:uiPriority="99" w:name="annotation reference"/>
-    <w:lsdException w:uiPriority="99" w:name="line number"/>
-    <w:lsdException w:uiPriority="99" w:name="page number"/>
-    <w:lsdException w:uiPriority="99" w:name="endnote reference"/>
-    <w:lsdException w:uiPriority="99" w:name="endnote text"/>
-    <w:lsdException w:uiPriority="99" w:name="table of authorities"/>
-    <w:lsdException w:uiPriority="99" w:name="macro"/>
-    <w:lsdException w:uiPriority="99" w:name="toa heading"/>
-    <w:lsdException w:uiPriority="99" w:name="List"/>
-    <w:lsdException w:uiPriority="99" w:name="List Bullet"/>
-    <w:lsdException w:uiPriority="99" w:name="List Number"/>
-    <w:lsdException w:uiPriority="99" w:name="List 2"/>
-    <w:lsdException w:uiPriority="99" w:name="List 3"/>
-    <w:lsdException w:uiPriority="99" w:name="List 4"/>
-    <w:lsdException w:uiPriority="99" w:name="List 5"/>
-    <w:lsdException w:uiPriority="99" w:name="List Bullet 2"/>
-    <w:lsdException w:uiPriority="99" w:name="List Bullet 3"/>
-    <w:lsdException w:uiPriority="99" w:name="List Bullet 4"/>
-    <w:lsdException w:uiPriority="99" w:name="List Bullet 5"/>
-    <w:lsdException w:uiPriority="99" w:name="List Number 2"/>
-    <w:lsdException w:uiPriority="99" w:name="List Number 3"/>
-    <w:lsdException w:uiPriority="99" w:name="List Number 4"/>
-    <w:lsdException w:uiPriority="99" w:name="List Number 5"/>
-    <w:lsdException w:qFormat="1" w:unhideWhenUsed="0" w:uiPriority="10" w:semiHidden="0" w:name="Title"/>
-    <w:lsdException w:uiPriority="99" w:name="Closing"/>
-    <w:lsdException w:uiPriority="99" w:name="Signature"/>
-    <w:lsdException w:uiPriority="1" w:name="Default Paragraph Font"/>
-    <w:lsdException w:uiPriority="99" w:name="Body Text"/>
-    <w:lsdException w:uiPriority="99" w:name="Body Text Indent"/>
-    <w:lsdException w:uiPriority="99" w:name="List Continue"/>
-    <w:lsdException w:uiPriority="99" w:name="List Continue 2"/>
-    <w:lsdException w:uiPriority="99" w:name="List Continue 3"/>
-    <w:lsdException w:uiPriority="99" w:name="List Continue 4"/>
-    <w:lsdException w:uiPriority="99" w:name="List Continue 5"/>
-    <w:lsdException w:uiPriority="99" w:name="Message Header"/>
-    <w:lsdException w:qFormat="1" w:unhideWhenUsed="0" w:uiPriority="11" w:semiHidden="0" w:name="Subtitle"/>
-    <w:lsdException w:uiPriority="99" w:name="Salutation"/>
-    <w:lsdException w:uiPriority="99" w:name="Date"/>
-    <w:lsdException w:uiPriority="99" w:name="Body Text First Indent"/>
-    <w:lsdException w:uiPriority="99" w:name="Body Text First Indent 2"/>
-    <w:lsdException w:uiPriority="99" w:name="Note Heading"/>
-    <w:lsdException w:uiPriority="99" w:name="Body Text 2"/>
-    <w:lsdException w:uiPriority="99" w:name="Body Text 3"/>
-    <w:lsdException w:uiPriority="99" w:name="Body Text Indent 2"/>
-    <w:lsdException w:uiPriority="99" w:name="Body Text Indent 3"/>
-    <w:lsdException w:uiPriority="99" w:name="Block Text"/>
-    <w:lsdException w:uiPriority="99" w:name="Hyperlink"/>
-    <w:lsdException w:uiPriority="99" w:name="FollowedHyperlink"/>
-    <w:lsdException w:qFormat="1" w:unhideWhenUsed="0" w:uiPriority="22" w:semiHidden="0" w:name="Strong"/>
-    <w:lsdException w:qFormat="1" w:unhideWhenUsed="0" w:uiPriority="20" w:semiHidden="0" w:name="Emphasis"/>
-    <w:lsdException w:uiPriority="99" w:name="Document Map"/>
-    <w:lsdException w:uiPriority="99" w:name="Plain Text"/>
-    <w:lsdException w:uiPriority="99" w:name="E-mail Signature"/>
-    <w:lsdException w:uiPriority="99" w:name="Normal (Web)"/>
-    <w:lsdException w:uiPriority="99" w:name="HTML Acronym"/>
-    <w:lsdException w:uiPriority="99" w:name="HTML Address"/>
-    <w:lsdException w:uiPriority="99" w:name="HTML Cite"/>
-    <w:lsdException w:uiPriority="99" w:name="HTML Code"/>
-    <w:lsdException w:uiPriority="99" w:name="HTML Definition"/>
-    <w:lsdException w:uiPriority="99" w:name="HTML Keyboard"/>
-    <w:lsdException w:uiPriority="99" w:name="HTML Preformatted"/>
-    <w:lsdException w:uiPriority="99" w:name="HTML Sample"/>
-    <w:lsdException w:uiPriority="99" w:name="HTML Typewriter"/>
-    <w:lsdException w:uiPriority="99" w:name="HTML Variable"/>
-    <w:lsdException w:uiPriority="99" w:name="Normal Table"/>
-    <w:lsdException w:uiPriority="99" w:name="annotation subject"/>
-    <w:lsdException w:uiPriority="99" w:name="Table Simple 1"/>
-    <w:lsdException w:uiPriority="99" w:name="Table Simple 2"/>
-    <w:lsdException w:uiPriority="99" w:name="Table Simple 3"/>
-    <w:lsdException w:uiPriority="99" w:name="Table Classic 1"/>
-    <w:lsdException w:uiPriority="99" w:name="Table Classic 2"/>
-    <w:lsdException w:uiPriority="99" w:name="Table Classic 3"/>
-    <w:lsdException w:uiPriority="99" w:name="Table Classic 4"/>
-    <w:lsdException w:uiPriority="99" w:name="Table Colorful 1"/>
-    <w:lsdException w:uiPriority="99" w:name="Table Colorful 2"/>
-    <w:lsdException w:uiPriority="99" w:name="Table Colorful 3"/>
-    <w:lsdException w:uiPriority="99" w:name="Table Columns 1"/>
-    <w:lsdException w:uiPriority="99" w:name="Table Columns 2"/>
-    <w:lsdException w:uiPriority="99" w:name="Table Columns 3"/>
-    <w:lsdException w:uiPriority="99" w:name="Table Columns 4"/>
-    <w:lsdException w:uiPriority="99" w:name="Table Columns 5"/>
-    <w:lsdException w:uiPriority="99" w:name="Table Grid 1"/>
-    <w:lsdException w:uiPriority="99" w:name="Table Grid 2"/>
-    <w:lsdException w:uiPriority="99" w:name="Table Grid 3"/>
-    <w:lsdException w:uiPriority="99" w:name="Table Grid 4"/>
-    <w:lsdException w:uiPriority="99" w:name="Table Grid 5"/>
-    <w:lsdException w:uiPriority="99" w:name="Table Grid 6"/>
-    <w:lsdException w:uiPriority="99" w:name="Table Grid 7"/>
-    <w:lsdException w:uiPriority="99" w:name="Table Grid 8"/>
-    <w:lsdException w:uiPriority="99" w:name="Table List 1"/>
-    <w:lsdException w:uiPriority="99" w:name="Table List 2"/>
-    <w:lsdException w:uiPriority="99" w:name="Table List 3"/>
-    <w:lsdException w:uiPriority="99" w:name="Table List 4"/>
-    <w:lsdException w:uiPriority="99" w:name="Table List 5"/>
-    <w:lsdException w:uiPriority="99" w:name="Table List 6"/>
-    <w:lsdException w:uiPriority="99" w:name="Table List 7"/>
-    <w:lsdException w:uiPriority="99" w:name="Table List 8"/>
-    <w:lsdException w:uiPriority="99" w:name="Table 3D effects 1"/>
-    <w:lsdException w:uiPriority="99" w:name="Table 3D effects 2"/>
-    <w:lsdException w:uiPriority="99" w:name="Table 3D effects 3"/>
-    <w:lsdException w:uiPriority="99" w:name="Table Contemporary"/>
-    <w:lsdException w:uiPriority="99" w:name="Table Elegant"/>
-    <w:lsdException w:uiPriority="99" w:name="Table Professional"/>
-    <w:lsdException w:uiPriority="99" w:name="Table Subtle 1"/>
-    <w:lsdException w:uiPriority="99" w:name="Table Subtle 2"/>
-    <w:lsdException w:uiPriority="99" w:name="Table Web 1"/>
-    <w:lsdException w:uiPriority="99" w:name="Table Web 2"/>
-    <w:lsdException w:uiPriority="99" w:name="Table Web 3"/>
-    <w:lsdException w:uiPriority="99" w:name="Balloon Text"/>
-    <w:lsdException w:qFormat="1" w:unhideWhenUsed="0" w:uiPriority="39" w:semiHidden="0" w:name="Table Grid"/>
-    <w:lsdException w:uiPriority="99" w:name="Table Theme"/>
-    <w:lsdException w:unhideWhenUsed="0" w:uiPriority="60" w:semiHidden="0" w:name="Light Shading"/>
-    <w:lsdException w:unhideWhenUsed="0" w:uiPriority="61" w:semiHidden="0" w:name="Light List"/>
-    <w:lsdException w:unhideWhenUsed="0" w:uiPriority="62" w:semiHidden="0" w:name="Light Grid"/>
-    <w:lsdException w:unhideWhenUsed="0" w:uiPriority="63" w:semiHidden="0" w:name="Medium Shading 1"/>
-    <w:lsdException w:unhideWhenUsed="0" w:uiPriority="64" w:semiHidden="0" w:name="Medium Shading 2"/>
-    <w:lsdException w:unhideWhenUsed="0" w:uiPriority="65" w:semiHidden="0" w:name="Medium List 1"/>
-    <w:lsdException w:unhideWhenUsed="0" w:uiPriority="66" w:semiHidden="0" w:name="Medium List 2"/>
-    <w:lsdException w:unhideWhenUsed="0" w:uiPriority="67" w:semiHidden="0" w:name="Medium Grid 1"/>
-    <w:lsdException w:unhideWhenUsed="0" w:uiPriority="68" w:semiHidden="0" w:name="Medium Grid 2"/>
-    <w:lsdException w:unhideWhenUsed="0" w:uiPriority="69" w:semiHidden="0" w:name="Medium Grid 3"/>
-    <w:lsdException w:unhideWhenUsed="0" w:uiPriority="70" w:semiHidden="0" w:name="Dark List"/>
-    <w:lsdException w:unhideWhenUsed="0" w:uiPriority="71" w:semiHidden="0" w:name="Colorful Shading"/>
-    <w:lsdException w:unhideWhenUsed="0" w:uiPriority="72" w:semiHidden="0" w:name="Colorful List"/>
-    <w:lsdException w:unhideWhenUsed="0" w:uiPriority="73" w:semiHidden="0" w:name="Colorful Grid"/>
-    <w:lsdException w:unhideWhenUsed="0" w:uiPriority="60" w:semiHidden="0" w:name="Light Shading Accent 1"/>
-    <w:lsdException w:unhideWhenUsed="0" w:uiPriority="61" w:semiHidden="0" w:name="Light List Accent 1"/>
-    <w:lsdException w:unhideWhenUsed="0" w:uiPriority="62" w:semiHidden="0" w:name="Light Grid Accent 1"/>
-    <w:lsdException w:unhideWhenUsed="0" w:uiPriority="63" w:semiHidden="0" w:name="Medium Shading 1 Accent 1"/>
-    <w:lsdException w:unhideWhenUsed="0" w:uiPriority="64" w:semiHidden="0" w:name="Medium Shading 2 Accent 1"/>
-    <w:lsdException w:unhideWhenUsed="0" w:uiPriority="65" w:semiHidden="0" w:name="Medium List 1 Accent 1"/>
-    <w:lsdException w:qFormat="1" w:unhideWhenUsed="0" w:uiPriority="34" w:semiHidden="0" w:name="List Paragraph"/>
-    <w:lsdException w:unhideWhenUsed="0" w:uiPriority="66" w:semiHidden="0" w:name="Medium List 2 Accent 1"/>
-    <w:lsdException w:unhideWhenUsed="0" w:uiPriority="67" w:semiHidden="0" w:name="Medium Grid 1 Accent 1"/>
-    <w:lsdException w:unhideWhenUsed="0" w:uiPriority="68" w:semiHidden="0" w:name="Medium Grid 2 Accent 1"/>
-    <w:lsdException w:unhideWhenUsed="0" w:uiPriority="69" w:semiHidden="0" w:name="Medium Grid 3 Accent 1"/>
-    <w:lsdException w:unhideWhenUsed="0" w:uiPriority="70" w:semiHidden="0" w:name="Dark List Accent 1"/>
-    <w:lsdException w:unhideWhenUsed="0" w:uiPriority="71" w:semiHidden="0" w:name="Colorful Shading Accent 1"/>
-    <w:lsdException w:unhideWhenUsed="0" w:uiPriority="72" w:semiHidden="0" w:name="Colorful List Accent 1"/>
-    <w:lsdException w:unhideWhenUsed="0" w:uiPriority="73" w:semiHidden="0" w:name="Colorful Grid Accent 1"/>
-    <w:lsdException w:unhideWhenUsed="0" w:uiPriority="60" w:semiHidden="0" w:name="Light Shading Accent 2"/>
-    <w:lsdException w:unhideWhenUsed="0" w:uiPriority="61" w:semiHidden="0" w:name="Light List Accent 2"/>
-    <w:lsdException w:unhideWhenUsed="0" w:uiPriority="62" w:semiHidden="0" w:name="Light Grid Accent 2"/>
-    <w:lsdException w:unhideWhenUsed="0" w:uiPriority="63" w:semiHidden="0" w:name="Medium Shading 1 Accent 2"/>
-    <w:lsdException w:unhideWhenUsed="0" w:uiPriority="64" w:semiHidden="0" w:name="Medium Shading 2 Accent 2"/>
-    <w:lsdException w:unhideWhenUsed="0" w:uiPriority="65" w:semiHidden="0" w:name="Medium List 1 Accent 2"/>
-    <w:lsdException w:unhideWhenUsed="0" w:uiPriority="66" w:semiHidden="0" w:name="Medium List 2 Accent 2"/>
-    <w:lsdException w:unhideWhenUsed="0" w:uiPriority="67" w:semiHidden="0" w:name="Medium Grid 1 Accent 2"/>
-    <w:lsdException w:unhideWhenUsed="0" w:uiPriority="68" w:semiHidden="0" w:name="Medium Grid 2 Accent 2"/>
-    <w:lsdException w:unhideWhenUsed="0" w:uiPriority="69" w:semiHidden="0" w:name="Medium Grid 3 Accent 2"/>
-    <w:lsdException w:unhideWhenUsed="0" w:uiPriority="70" w:semiHidden="0" w:name="Dark List Accent 2"/>
-    <w:lsdException w:unhideWhenUsed="0" w:uiPriority="71" w:semiHidden="0" w:name="Colorful Shading Accent 2"/>
-    <w:lsdException w:unhideWhenUsed="0" w:uiPriority="72" w:semiHidden="0" w:name="Colorful List Accent 2"/>
-    <w:lsdException w:unhideWhenUsed="0" w:uiPriority="73" w:semiHidden="0" w:name="Colorful Grid Accent 2"/>
-    <w:lsdException w:unhideWhenUsed="0" w:uiPriority="60" w:semiHidden="0" w:name="Light Shading Accent 3"/>
-    <w:lsdException w:unhideWhenUsed="0" w:uiPriority="61" w:semiHidden="0" w:name="Light List Accent 3"/>
-    <w:lsdException w:unhideWhenUsed="0" w:uiPriority="62" w:semiHidden="0" w:name="Light Grid Accent 3"/>
-    <w:lsdException w:unhideWhenUsed="0" w:uiPriority="63" w:semiHidden="0" w:name="Medium Shading 1 Accent 3"/>
-    <w:lsdException w:unhideWhenUsed="0" w:uiPriority="64" w:semiHidden="0" w:name="Medium Shading 2 Accent 3"/>
-    <w:lsdException w:unhideWhenUsed="0" w:uiPriority="65" w:semiHidden="0" w:name="Medium List 1 Accent 3"/>
-    <w:lsdException w:unhideWhenUsed="0" w:uiPriority="66" w:semiHidden="0" w:name="Medium List 2 Accent 3"/>
-    <w:lsdException w:unhideWhenUsed="0" w:uiPriority="67" w:semiHidden="0" w:name="Medium Grid 1 Accent 3"/>
-    <w:lsdException w:unhideWhenUsed="0" w:uiPriority="68" w:semiHidden="0" w:name="Medium Grid 2 Accent 3"/>
-    <w:lsdException w:unhideWhenUsed="0" w:uiPriority="69" w:semiHidden="0" w:name="Medium Grid 3 Accent 3"/>
-    <w:lsdException w:unhideWhenUsed="0" w:uiPriority="70" w:semiHidden="0" w:name="Dark List Accent 3"/>
-    <w:lsdException w:unhideWhenUsed="0" w:uiPriority="71" w:semiHidden="0" w:name="Colorful Shading Accent 3"/>
-    <w:lsdException w:unhideWhenUsed="0" w:uiPriority="72" w:semiHidden="0" w:name="Colorful List Accent 3"/>
-    <w:lsdException w:unhideWhenUsed="0" w:uiPriority="73" w:semiHidden="0" w:name="Colorful Grid Accent 3"/>
-    <w:lsdException w:unhideWhenUsed="0" w:uiPriority="60" w:semiHidden="0" w:name="Light Shading Accent 4"/>
-    <w:lsdException w:unhideWhenUsed="0" w:uiPriority="61" w:semiHidden="0" w:name="Light List Accent 4"/>
-    <w:lsdException w:unhideWhenUsed="0" w:uiPriority="62" w:semiHidden="0" w:name="Light Grid Accent 4"/>
-    <w:lsdException w:unhideWhenUsed="0" w:uiPriority="63" w:semiHidden="0" w:name="Medium Shading 1 Accent 4"/>
-    <w:lsdException w:unhideWhenUsed="0" w:uiPriority="64" w:semiHidden="0" w:name="Medium Shading 2 Accent 4"/>
-    <w:lsdException w:unhideWhenUsed="0" w:uiPriority="65" w:semiHidden="0" w:name="Medium List 1 Accent 4"/>
-    <w:lsdException w:unhideWhenUsed="0" w:uiPriority="66" w:semiHidden="0" w:name="Medium List 2 Accent 4"/>
-    <w:lsdException w:unhideWhenUsed="0" w:uiPriority="67" w:semiHidden="0" w:name="Medium Grid 1 Accent 4"/>
-    <w:lsdException w:unhideWhenUsed="0" w:uiPriority="68" w:semiHidden="0" w:name="Medium Grid 2 Accent 4"/>
-    <w:lsdException w:unhideWhenUsed="0" w:uiPriority="69" w:semiHidden="0" w:name="Medium Grid 3 Accent 4"/>
-    <w:lsdException w:unhideWhenUsed="0" w:uiPriority="70" w:semiHidden="0" w:name="Dark List Accent 4"/>
-    <w:lsdException w:unhideWhenUsed="0" w:uiPriority="71" w:semiHidden="0" w:name="Colorful Shading Accent 4"/>
-    <w:lsdException w:unhideWhenUsed="0" w:uiPriority="72" w:semiHidden="0" w:name="Colorful List Accent 4"/>
-    <w:lsdException w:unhideWhenUsed="0" w:uiPriority="73" w:semiHidden="0" w:name="Colorful Grid Accent 4"/>
-    <w:lsdException w:unhideWhenUsed="0" w:uiPriority="60" w:semiHidden="0" w:name="Light Shading Accent 5"/>
-    <w:lsdException w:unhideWhenUsed="0" w:uiPriority="61" w:semiHidden="0" w:name="Light List Accent 5"/>
-    <w:lsdException w:unhideWhenUsed="0" w:uiPriority="62" w:semiHidden="0" w:name="Light Grid Accent 5"/>
-    <w:lsdException w:unhideWhenUsed="0" w:uiPriority="63" w:semiHidden="0" w:name="Medium Shading 1 Accent 5"/>
-    <w:lsdException w:unhideWhenUsed="0" w:uiPriority="64" w:semiHidden="0" w:name="Medium Shading 2 Accent 5"/>
-    <w:lsdException w:unhideWhenUsed="0" w:uiPriority="65" w:semiHidden="0" w:name="Medium List 1 Accent 5"/>
-    <w:lsdException w:unhideWhenUsed="0" w:uiPriority="66" w:semiHidden="0" w:name="Medium List 2 Accent 5"/>
-    <w:lsdException w:unhideWhenUsed="0" w:uiPriority="67" w:semiHidden="0" w:name="Medium Grid 1 Accent 5"/>
-    <w:lsdException w:unhideWhenUsed="0" w:uiPriority="68" w:semiHidden="0" w:name="Medium Grid 2 Accent 5"/>
-    <w:lsdException w:unhideWhenUsed="0" w:uiPriority="69" w:semiHidden="0" w:name="Medium Grid 3 Accent 5"/>
-    <w:lsdException w:unhideWhenUsed="0" w:uiPriority="70" w:semiHidden="0" w:name="Dark List Accent 5"/>
-    <w:lsdException w:unhideWhenUsed="0" w:uiPriority="71" w:semiHidden="0" w:name="Colorful Shading Accent 5"/>
-    <w:lsdException w:unhideWhenUsed="0" w:uiPriority="72" w:semiHidden="0" w:name="Colorful List Accent 5"/>
-    <w:lsdException w:unhideWhenUsed="0" w:uiPriority="73" w:semiHidden="0" w:name="Colorful Grid Accent 5"/>
-    <w:lsdException w:unhideWhenUsed="0" w:uiPriority="60" w:semiHidden="0" w:name="Light Shading Accent 6"/>
-    <w:lsdException w:unhideWhenUsed="0" w:uiPriority="61" w:semiHidden="0" w:name="Light List Accent 6"/>
-    <w:lsdException w:unhideWhenUsed="0" w:uiPriority="62" w:semiHidden="0" w:name="Light Grid Accent 6"/>
-    <w:lsdException w:unhideWhenUsed="0" w:uiPriority="63" w:semiHidden="0" w:name="Medium Shading 1 Accent 6"/>
-    <w:lsdException w:unhideWhenUsed="0" w:uiPriority="64" w:semiHidden="0" w:name="Medium Shading 2 Accent 6"/>
-    <w:lsdException w:unhideWhenUsed="0" w:uiPriority="65" w:semiHidden="0" w:name="Medium List 1 Accent 6"/>
-    <w:lsdException w:unhideWhenUsed="0" w:uiPriority="66" w:semiHidden="0" w:name="Medium List 2 Accent 6"/>
-    <w:lsdException w:unhideWhenUsed="0" w:uiPriority="67" w:semiHidden="0" w:name="Medium Grid 1 Accent 6"/>
-    <w:lsdException w:unhideWhenUsed="0" w:uiPriority="68" w:semiHidden="0" w:name="Medium Grid 2 Accent 6"/>
-    <w:lsdException w:unhideWhenUsed="0" w:uiPriority="69" w:semiHidden="0" w:name="Medium Grid 3 Accent 6"/>
-    <w:lsdException w:unhideWhenUsed="0" w:uiPriority="70" w:semiHidden="0" w:name="Dark List Accent 6"/>
-    <w:lsdException w:unhideWhenUsed="0" w:uiPriority="71" w:semiHidden="0" w:name="Colorful Shading Accent 6"/>
-    <w:lsdException w:unhideWhenUsed="0" w:uiPriority="72" w:semiHidden="0" w:name="Colorful List Accent 6"/>
-    <w:lsdException w:unhideWhenUsed="0" w:uiPriority="73" w:semiHidden="0" w:name="Colorful Grid Accent 6"/>
+  <w:latentStyles w:defLockedState="0" w:defUIPriority="99" w:defSemiHidden="0" w:defUnhideWhenUsed="0" w:defQFormat="0" w:count="376">
+    <w:lsdException w:name="Normal" w:uiPriority="0" w:qFormat="1"/>
+    <w:lsdException w:name="heading 1" w:uiPriority="9" w:qFormat="1"/>
+    <w:lsdException w:name="heading 2" w:uiPriority="0" w:qFormat="1"/>
+    <w:lsdException w:name="heading 3" w:semiHidden="1" w:uiPriority="9" w:unhideWhenUsed="1" w:qFormat="1"/>
+    <w:lsdException w:name="heading 4" w:semiHidden="1" w:uiPriority="9" w:unhideWhenUsed="1" w:qFormat="1"/>
+    <w:lsdException w:name="heading 5" w:semiHidden="1" w:uiPriority="9" w:unhideWhenUsed="1" w:qFormat="1"/>
+    <w:lsdException w:name="heading 6" w:semiHidden="1" w:uiPriority="9" w:unhideWhenUsed="1" w:qFormat="1"/>
+    <w:lsdException w:name="heading 7" w:semiHidden="1" w:uiPriority="9" w:unhideWhenUsed="1" w:qFormat="1"/>
+    <w:lsdException w:name="heading 8" w:semiHidden="1" w:uiPriority="9" w:unhideWhenUsed="1" w:qFormat="1"/>
+    <w:lsdException w:name="heading 9" w:semiHidden="1" w:uiPriority="9" w:unhideWhenUsed="1" w:qFormat="1"/>
+    <w:lsdException w:name="index 1" w:semiHidden="1" w:unhideWhenUsed="1"/>
+    <w:lsdException w:name="index 2" w:semiHidden="1" w:unhideWhenUsed="1"/>
+    <w:lsdException w:name="index 3" w:semiHidden="1" w:unhideWhenUsed="1"/>
+    <w:lsdException w:name="index 4" w:semiHidden="1" w:unhideWhenUsed="1"/>
+    <w:lsdException w:name="index 5" w:semiHidden="1" w:unhideWhenUsed="1"/>
+    <w:lsdException w:name="index 6" w:semiHidden="1" w:unhideWhenUsed="1"/>
+    <w:lsdException w:name="index 7" w:semiHidden="1" w:unhideWhenUsed="1"/>
+    <w:lsdException w:name="index 8" w:semiHidden="1" w:unhideWhenUsed="1"/>
+    <w:lsdException w:name="index 9" w:semiHidden="1" w:unhideWhenUsed="1"/>
+    <w:lsdException w:name="toc 1" w:semiHidden="1" w:uiPriority="39" w:unhideWhenUsed="1"/>
+    <w:lsdException w:name="toc 2" w:semiHidden="1" w:uiPriority="39" w:unhideWhenUsed="1"/>
+    <w:lsdException w:name="toc 3" w:semiHidden="1" w:uiPriority="39" w:unhideWhenUsed="1"/>
+    <w:lsdException w:name="toc 4" w:semiHidden="1" w:uiPriority="39" w:unhideWhenUsed="1"/>
+    <w:lsdException w:name="toc 5" w:semiHidden="1" w:uiPriority="39" w:unhideWhenUsed="1"/>
+    <w:lsdException w:name="toc 6" w:semiHidden="1" w:uiPriority="39" w:unhideWhenUsed="1"/>
+    <w:lsdException w:name="toc 7" w:semiHidden="1" w:uiPriority="39" w:unhideWhenUsed="1"/>
+    <w:lsdException w:name="toc 8" w:semiHidden="1" w:uiPriority="39" w:unhideWhenUsed="1"/>
+    <w:lsdException w:name="toc 9" w:semiHidden="1" w:uiPriority="39" w:unhideWhenUsed="1"/>
+    <w:lsdException w:name="Normal Indent" w:semiHidden="1" w:unhideWhenUsed="1"/>
+    <w:lsdException w:name="footnote text" w:semiHidden="1" w:unhideWhenUsed="1"/>
+    <w:lsdException w:name="annotation text" w:semiHidden="1" w:unhideWhenUsed="1"/>
+    <w:lsdException w:name="header" w:unhideWhenUsed="1"/>
+    <w:lsdException w:name="footer" w:unhideWhenUsed="1"/>
+    <w:lsdException w:name="index heading" w:semiHidden="1" w:unhideWhenUsed="1"/>
+    <w:lsdException w:name="caption" w:uiPriority="35" w:unhideWhenUsed="1" w:qFormat="1"/>
+    <w:lsdException w:name="table of figures" w:semiHidden="1" w:unhideWhenUsed="1"/>
+    <w:lsdException w:name="envelope address" w:semiHidden="1" w:unhideWhenUsed="1"/>
+    <w:lsdException w:name="envelope return" w:semiHidden="1" w:unhideWhenUsed="1"/>
+    <w:lsdException w:name="footnote reference" w:semiHidden="1" w:unhideWhenUsed="1"/>
+    <w:lsdException w:name="annotation reference" w:semiHidden="1" w:unhideWhenUsed="1"/>
+    <w:lsdException w:name="line number" w:semiHidden="1" w:unhideWhenUsed="1"/>
+    <w:lsdException w:name="page number" w:semiHidden="1" w:unhideWhenUsed="1"/>
+    <w:lsdException w:name="endnote reference" w:semiHidden="1" w:unhideWhenUsed="1"/>
+    <w:lsdException w:name="endnote text" w:semiHidden="1" w:unhideWhenUsed="1"/>
+    <w:lsdException w:name="table of authorities" w:semiHidden="1" w:unhideWhenUsed="1"/>
+    <w:lsdException w:name="macro" w:semiHidden="1" w:unhideWhenUsed="1"/>
+    <w:lsdException w:name="toa heading" w:semiHidden="1" w:unhideWhenUsed="1"/>
+    <w:lsdException w:name="List" w:semiHidden="1" w:unhideWhenUsed="1"/>
+    <w:lsdException w:name="List Bullet" w:semiHidden="1" w:unhideWhenUsed="1"/>
+    <w:lsdException w:name="List Number" w:semiHidden="1" w:unhideWhenUsed="1"/>
+    <w:lsdException w:name="List 2" w:semiHidden="1" w:unhideWhenUsed="1"/>
+    <w:lsdException w:name="List 3" w:semiHidden="1" w:unhideWhenUsed="1"/>
+    <w:lsdException w:name="List 4" w:semiHidden="1" w:unhideWhenUsed="1"/>
+    <w:lsdException w:name="List 5" w:semiHidden="1" w:unhideWhenUsed="1"/>
+    <w:lsdException w:name="List Bullet 2" w:semiHidden="1" w:unhideWhenUsed="1"/>
+    <w:lsdException w:name="List Bullet 3" w:semiHidden="1" w:unhideWhenUsed="1"/>
+    <w:lsdException w:name="List Bullet 4" w:semiHidden="1" w:unhideWhenUsed="1"/>
+    <w:lsdException w:name="List Bullet 5" w:semiHidden="1" w:unhideWhenUsed="1"/>
+    <w:lsdException w:name="List Number 2" w:semiHidden="1" w:unhideWhenUsed="1"/>
+    <w:lsdException w:name="List Number 3" w:semiHidden="1" w:unhideWhenUsed="1"/>
+    <w:lsdException w:name="List Number 4" w:semiHidden="1" w:unhideWhenUsed="1"/>
+    <w:lsdException w:name="List Number 5" w:semiHidden="1" w:unhideWhenUsed="1"/>
+    <w:lsdException w:name="Title" w:uiPriority="10" w:qFormat="1"/>
+    <w:lsdException w:name="Closing" w:semiHidden="1" w:unhideWhenUsed="1"/>
+    <w:lsdException w:name="Signature" w:semiHidden="1" w:unhideWhenUsed="1"/>
+    <w:lsdException w:name="Default Paragraph Font" w:semiHidden="1" w:uiPriority="1" w:unhideWhenUsed="1"/>
+    <w:lsdException w:name="Body Text" w:semiHidden="1" w:unhideWhenUsed="1"/>
+    <w:lsdException w:name="Body Text Indent" w:semiHidden="1" w:unhideWhenUsed="1"/>
+    <w:lsdException w:name="List Continue" w:semiHidden="1" w:unhideWhenUsed="1"/>
+    <w:lsdException w:name="List Continue 2" w:semiHidden="1" w:unhideWhenUsed="1"/>
+    <w:lsdException w:name="List Continue 3" w:semiHidden="1" w:unhideWhenUsed="1"/>
+    <w:lsdException w:name="List Continue 4" w:semiHidden="1" w:unhideWhenUsed="1"/>
+    <w:lsdException w:name="List Continue 5" w:semiHidden="1" w:unhideWhenUsed="1"/>
+    <w:lsdException w:name="Message Header" w:semiHidden="1" w:unhideWhenUsed="1"/>
+    <w:lsdException w:name="Subtitle" w:uiPriority="11" w:qFormat="1"/>
+    <w:lsdException w:name="Salutation" w:semiHidden="1" w:unhideWhenUsed="1"/>
+    <w:lsdException w:name="Date" w:semiHidden="1" w:unhideWhenUsed="1"/>
+    <w:lsdException w:name="Body Text First Indent" w:semiHidden="1" w:unhideWhenUsed="1"/>
+    <w:lsdException w:name="Body Text First Indent 2" w:semiHidden="1" w:unhideWhenUsed="1"/>
+    <w:lsdException w:name="Note Heading" w:semiHidden="1" w:unhideWhenUsed="1"/>
+    <w:lsdException w:name="Body Text 2" w:semiHidden="1" w:unhideWhenUsed="1"/>
+    <w:lsdException w:name="Body Text 3" w:semiHidden="1" w:unhideWhenUsed="1"/>
+    <w:lsdException w:name="Body Text Indent 2" w:semiHidden="1" w:unhideWhenUsed="1"/>
+    <w:lsdException w:name="Body Text Indent 3" w:semiHidden="1" w:unhideWhenUsed="1"/>
+    <w:lsdException w:name="Block Text" w:semiHidden="1" w:unhideWhenUsed="1"/>
+    <w:lsdException w:name="Hyperlink" w:semiHidden="1" w:unhideWhenUsed="1"/>
+    <w:lsdException w:name="FollowedHyperlink" w:semiHidden="1" w:unhideWhenUsed="1"/>
+    <w:lsdException w:name="Strong" w:uiPriority="22" w:qFormat="1"/>
+    <w:lsdException w:name="Emphasis" w:uiPriority="20" w:qFormat="1"/>
+    <w:lsdException w:name="Document Map" w:semiHidden="1" w:unhideWhenUsed="1"/>
+    <w:lsdException w:name="Plain Text" w:semiHidden="1" w:unhideWhenUsed="1"/>
+    <w:lsdException w:name="E-mail Signature" w:semiHidden="1" w:unhideWhenUsed="1"/>
+    <w:lsdException w:name="HTML Top of Form" w:semiHidden="1" w:unhideWhenUsed="1"/>
+    <w:lsdException w:name="HTML Bottom of Form" w:semiHidden="1" w:unhideWhenUsed="1"/>
+    <w:lsdException w:name="Normal (Web)" w:semiHidden="1" w:unhideWhenUsed="1"/>
+    <w:lsdException w:name="HTML Acronym" w:semiHidden="1" w:unhideWhenUsed="1"/>
+    <w:lsdException w:name="HTML Address" w:semiHidden="1" w:unhideWhenUsed="1"/>
+    <w:lsdException w:name="HTML Cite" w:semiHidden="1" w:unhideWhenUsed="1"/>
+    <w:lsdException w:name="HTML Code" w:semiHidden="1" w:unhideWhenUsed="1"/>
+    <w:lsdException w:name="HTML Definition" w:semiHidden="1" w:unhideWhenUsed="1"/>
+    <w:lsdException w:name="HTML Keyboard" w:semiHidden="1" w:unhideWhenUsed="1"/>
+    <w:lsdException w:name="HTML Preformatted" w:semiHidden="1" w:unhideWhenUsed="1"/>
+    <w:lsdException w:name="HTML Sample" w:semiHidden="1" w:unhideWhenUsed="1"/>
+    <w:lsdException w:name="HTML Typewriter" w:semiHidden="1" w:unhideWhenUsed="1"/>
+    <w:lsdException w:name="HTML Variable" w:semiHidden="1" w:unhideWhenUsed="1"/>
+    <w:lsdException w:name="Normal Table" w:semiHidden="1" w:unhideWhenUsed="1"/>
+    <w:lsdException w:name="annotation subject" w:semiHidden="1" w:unhideWhenUsed="1"/>
+    <w:lsdException w:name="No List" w:semiHidden="1" w:unhideWhenUsed="1"/>
+    <w:lsdException w:name="Outline List 1" w:semiHidden="1" w:unhideWhenUsed="1"/>
+    <w:lsdException w:name="Outline List 2" w:semiHidden="1" w:unhideWhenUsed="1"/>
+    <w:lsdException w:name="Outline List 3" w:semiHidden="1" w:unhideWhenUsed="1"/>
+    <w:lsdException w:name="Table Simple 1" w:semiHidden="1" w:unhideWhenUsed="1"/>
+    <w:lsdException w:name="Table Simple 2" w:semiHidden="1" w:unhideWhenUsed="1"/>
+    <w:lsdException w:name="Table Simple 3" w:semiHidden="1" w:unhideWhenUsed="1"/>
+    <w:lsdException w:name="Table Classic 1" w:semiHidden="1" w:unhideWhenUsed="1"/>
+    <w:lsdException w:name="Table Classic 2" w:semiHidden="1" w:unhideWhenUsed="1"/>
+    <w:lsdException w:name="Table Classic 3" w:semiHidden="1" w:unhideWhenUsed="1"/>
+    <w:lsdException w:name="Table Classic 4" w:semiHidden="1" w:unhideWhenUsed="1"/>
+    <w:lsdException w:name="Table Colorful 1" w:semiHidden="1" w:unhideWhenUsed="1"/>
+    <w:lsdException w:name="Table Colorful 2" w:semiHidden="1" w:unhideWhenUsed="1"/>
+    <w:lsdException w:name="Table Colorful 3" w:semiHidden="1" w:unhideWhenUsed="1"/>
+    <w:lsdException w:name="Table Columns 1" w:semiHidden="1" w:unhideWhenUsed="1"/>
+    <w:lsdException w:name="Table Columns 2" w:semiHidden="1" w:unhideWhenUsed="1"/>
+    <w:lsdException w:name="Table Columns 3" w:semiHidden="1" w:unhideWhenUsed="1"/>
+    <w:lsdException w:name="Table Columns 4" w:semiHidden="1" w:unhideWhenUsed="1"/>
+    <w:lsdException w:name="Table Columns 5" w:semiHidden="1" w:unhideWhenUsed="1"/>
+    <w:lsdException w:name="Table Grid 1" w:semiHidden="1" w:unhideWhenUsed="1"/>
+    <w:lsdException w:name="Table Grid 2" w:semiHidden="1" w:unhideWhenUsed="1"/>
+    <w:lsdException w:name="Table Grid 3" w:semiHidden="1" w:unhideWhenUsed="1"/>
+    <w:lsdException w:name="Table Grid 4" w:semiHidden="1" w:unhideWhenUsed="1"/>
+    <w:lsdException w:name="Table Grid 5" w:semiHidden="1" w:unhideWhenUsed="1"/>
+    <w:lsdException w:name="Table Grid 6" w:semiHidden="1" w:unhideWhenUsed="1"/>
+    <w:lsdException w:name="Table Grid 7" w:semiHidden="1" w:unhideWhenUsed="1"/>
+    <w:lsdException w:name="Table Grid 8" w:semiHidden="1" w:unhideWhenUsed="1"/>
+    <w:lsdException w:name="Table List 1" w:semiHidden="1" w:unhideWhenUsed="1"/>
+    <w:lsdException w:name="Table List 2" w:semiHidden="1" w:unhideWhenUsed="1"/>
+    <w:lsdException w:name="Table List 3" w:semiHidden="1" w:unhideWhenUsed="1"/>
+    <w:lsdException w:name="Table List 4" w:semiHidden="1" w:unhideWhenUsed="1"/>
+    <w:lsdException w:name="Table List 5" w:semiHidden="1" w:unhideWhenUsed="1"/>
+    <w:lsdException w:name="Table List 6" w:semiHidden="1" w:unhideWhenUsed="1"/>
+    <w:lsdException w:name="Table List 7" w:semiHidden="1" w:unhideWhenUsed="1"/>
+    <w:lsdException w:name="Table List 8" w:semiHidden="1" w:unhideWhenUsed="1"/>
+    <w:lsdException w:name="Table 3D effects 1" w:semiHidden="1" w:unhideWhenUsed="1"/>
+    <w:lsdException w:name="Table 3D effects 2" w:semiHidden="1" w:unhideWhenUsed="1"/>
+    <w:lsdException w:name="Table 3D effects 3" w:semiHidden="1" w:unhideWhenUsed="1"/>
+    <w:lsdException w:name="Table Contemporary" w:semiHidden="1" w:unhideWhenUsed="1"/>
+    <w:lsdException w:name="Table Elegant" w:semiHidden="1" w:unhideWhenUsed="1"/>
+    <w:lsdException w:name="Table Professional" w:semiHidden="1" w:unhideWhenUsed="1"/>
+    <w:lsdException w:name="Table Subtle 1" w:semiHidden="1" w:unhideWhenUsed="1"/>
+    <w:lsdException w:name="Table Subtle 2" w:semiHidden="1" w:unhideWhenUsed="1"/>
+    <w:lsdException w:name="Table Web 1" w:semiHidden="1" w:unhideWhenUsed="1"/>
+    <w:lsdException w:name="Table Web 2" w:semiHidden="1" w:unhideWhenUsed="1"/>
+    <w:lsdException w:name="Table Web 3" w:semiHidden="1" w:unhideWhenUsed="1"/>
+    <w:lsdException w:name="Balloon Text" w:semiHidden="1" w:unhideWhenUsed="1"/>
+    <w:lsdException w:name="Table Grid" w:uiPriority="39" w:qFormat="1"/>
+    <w:lsdException w:name="Table Theme" w:semiHidden="1" w:unhideWhenUsed="1"/>
+    <w:lsdException w:name="Placeholder Text" w:semiHidden="1" w:unhideWhenUsed="1"/>
+    <w:lsdException w:name="No Spacing" w:semiHidden="1" w:unhideWhenUsed="1"/>
+    <w:lsdException w:name="Light Shading" w:uiPriority="60"/>
+    <w:lsdException w:name="Light List" w:uiPriority="61"/>
+    <w:lsdException w:name="Light Grid" w:uiPriority="62"/>
+    <w:lsdException w:name="Medium Shading 1" w:uiPriority="63"/>
+    <w:lsdException w:name="Medium Shading 2" w:uiPriority="64"/>
+    <w:lsdException w:name="Medium List 1" w:uiPriority="65"/>
+    <w:lsdException w:name="Medium List 2" w:uiPriority="66"/>
+    <w:lsdException w:name="Medium Grid 1" w:uiPriority="67"/>
+    <w:lsdException w:name="Medium Grid 2" w:uiPriority="68"/>
+    <w:lsdException w:name="Medium Grid 3" w:uiPriority="69"/>
+    <w:lsdException w:name="Dark List" w:uiPriority="70"/>
+    <w:lsdException w:name="Colorful Shading" w:uiPriority="71"/>
+    <w:lsdException w:name="Colorful List" w:uiPriority="72"/>
+    <w:lsdException w:name="Colorful Grid" w:uiPriority="73"/>
+    <w:lsdException w:name="Light Shading Accent 1" w:uiPriority="60"/>
+    <w:lsdException w:name="Light List Accent 1" w:uiPriority="61"/>
+    <w:lsdException w:name="Light Grid Accent 1" w:uiPriority="62"/>
+    <w:lsdException w:name="Medium Shading 1 Accent 1" w:uiPriority="63"/>
+    <w:lsdException w:name="Medium Shading 2 Accent 1" w:uiPriority="64"/>
+    <w:lsdException w:name="Medium List 1 Accent 1" w:uiPriority="65"/>
+    <w:lsdException w:name="Revision" w:semiHidden="1" w:unhideWhenUsed="1"/>
+    <w:lsdException w:name="List Paragraph" w:uiPriority="34" w:qFormat="1"/>
+    <w:lsdException w:name="Quote" w:semiHidden="1" w:unhideWhenUsed="1"/>
+    <w:lsdException w:name="Intense Quote" w:semiHidden="1" w:unhideWhenUsed="1"/>
+    <w:lsdException w:name="Medium List 2 Accent 1" w:uiPriority="66"/>
+    <w:lsdException w:name="Medium Grid 1 Accent 1" w:uiPriority="67"/>
+    <w:lsdException w:name="Medium Grid 2 Accent 1" w:uiPriority="68"/>
+    <w:lsdException w:name="Medium Grid 3 Accent 1" w:uiPriority="69"/>
+    <w:lsdException w:name="Dark List Accent 1" w:uiPriority="70"/>
+    <w:lsdException w:name="Colorful Shading Accent 1" w:uiPriority="71"/>
+    <w:lsdException w:name="Colorful List Accent 1" w:uiPriority="72"/>
+    <w:lsdException w:name="Colorful Grid Accent 1" w:uiPriority="73"/>
+    <w:lsdException w:name="Light Shading Accent 2" w:uiPriority="60"/>
+    <w:lsdException w:name="Light List Accent 2" w:uiPriority="61"/>
+    <w:lsdException w:name="Light Grid Accent 2" w:uiPriority="62"/>
+    <w:lsdException w:name="Medium Shading 1 Accent 2" w:uiPriority="63"/>
+    <w:lsdException w:name="Medium Shading 2 Accent 2" w:uiPriority="64"/>
+    <w:lsdException w:name="Medium List 1 Accent 2" w:uiPriority="65"/>
+    <w:lsdException w:name="Medium List 2 Accent 2" w:uiPriority="66"/>
+    <w:lsdException w:name="Medium Grid 1 Accent 2" w:uiPriority="67"/>
+    <w:lsdException w:name="Medium Grid 2 Accent 2" w:uiPriority="68"/>
+    <w:lsdException w:name="Medium Grid 3 Accent 2" w:uiPriority="69"/>
+    <w:lsdException w:name="Dark List Accent 2" w:uiPriority="70"/>
+    <w:lsdException w:name="Colorful Shading Accent 2" w:uiPriority="71"/>
+    <w:lsdException w:name="Colorful List Accent 2" w:uiPriority="72"/>
+    <w:lsdException w:name="Colorful Grid Accent 2" w:uiPriority="73"/>
+    <w:lsdException w:name="Light Shading Accent 3" w:uiPriority="60"/>
+    <w:lsdException w:name="Light List Accent 3" w:uiPriority="61"/>
+    <w:lsdException w:name="Light Grid Accent 3" w:uiPriority="62"/>
+    <w:lsdException w:name="Medium Shading 1 Accent 3" w:uiPriority="63"/>
+    <w:lsdException w:name="Medium Shading 2 Accent 3" w:uiPriority="64"/>
+    <w:lsdException w:name="Medium List 1 Accent 3" w:uiPriority="65"/>
+    <w:lsdException w:name="Medium List 2 Accent 3" w:uiPriority="66"/>
+    <w:lsdException w:name="Medium Grid 1 Accent 3" w:uiPriority="67"/>
+    <w:lsdException w:name="Medium Grid 2 Accent 3" w:uiPriority="68"/>
+    <w:lsdException w:name="Medium Grid 3 Accent 3" w:uiPriority="69"/>
+    <w:lsdException w:name="Dark List Accent 3" w:uiPriority="70"/>
+    <w:lsdException w:name="Colorful Shading Accent 3" w:uiPriority="71"/>
+    <w:lsdException w:name="Colorful List Accent 3" w:uiPriority="72"/>
+    <w:lsdException w:name="Colorful Grid Accent 3" w:uiPriority="73"/>
+    <w:lsdException w:name="Light Shading Accent 4" w:uiPriority="60"/>
+    <w:lsdException w:name="Light List Accent 4" w:uiPriority="61"/>
+    <w:lsdException w:name="Light Grid Accent 4" w:uiPriority="62"/>
+    <w:lsdException w:name="Medium Shading 1 Accent 4" w:uiPriority="63"/>
+    <w:lsdException w:name="Medium Shading 2 Accent 4" w:uiPriority="64"/>
+    <w:lsdException w:name="Medium List 1 Accent 4" w:uiPriority="65"/>
+    <w:lsdException w:name="Medium List 2 Accent 4" w:uiPriority="66"/>
+    <w:lsdException w:name="Medium Grid 1 Accent 4" w:uiPriority="67"/>
+    <w:lsdException w:name="Medium Grid 2 Accent 4" w:uiPriority="68"/>
+    <w:lsdException w:name="Medium Grid 3 Accent 4" w:uiPriority="69"/>
+    <w:lsdException w:name="Dark List Accent 4" w:uiPriority="70"/>
+    <w:lsdException w:name="Colorful Shading Accent 4" w:uiPriority="71"/>
+    <w:lsdException w:name="Colorful List Accent 4" w:uiPriority="72"/>
+    <w:lsdException w:name="Colorful Grid Accent 4" w:uiPriority="73"/>
+    <w:lsdException w:name="Light Shading Accent 5" w:uiPriority="60"/>
+    <w:lsdException w:name="Light List Accent 5" w:uiPriority="61"/>
+    <w:lsdException w:name="Light Grid Accent 5" w:uiPriority="62"/>
+    <w:lsdException w:name="Medium Shading 1 Accent 5" w:uiPriority="63"/>
+    <w:lsdException w:name="Medium Shading 2 Accent 5" w:uiPriority="64"/>
+    <w:lsdException w:name="Medium List 1 Accent 5" w:uiPriority="65"/>
+    <w:lsdException w:name="Medium List 2 Accent 5" w:uiPriority="66"/>
+    <w:lsdException w:name="Medium Grid 1 Accent 5" w:uiPriority="67"/>
+    <w:lsdException w:name="Medium Grid 2 Accent 5" w:uiPriority="68"/>
+    <w:lsdException w:name="Medium Grid 3 Accent 5" w:uiPriority="69"/>
+    <w:lsdException w:name="Dark List Accent 5" w:uiPriority="70"/>
+    <w:lsdException w:name="Colorful Shading Accent 5" w:uiPriority="71"/>
+    <w:lsdException w:name="Colorful List Accent 5" w:uiPriority="72"/>
+    <w:lsdException w:name="Colorful Grid Accent 5" w:uiPriority="73"/>
+    <w:lsdException w:name="Light Shading Accent 6" w:uiPriority="60"/>
+    <w:lsdException w:name="Light List Accent 6" w:uiPriority="61"/>
+    <w:lsdException w:name="Light Grid Accent 6" w:uiPriority="62"/>
+    <w:lsdException w:name="Medium Shading 1 Accent 6" w:uiPriority="63"/>
+    <w:lsdException w:name="Medium Shading 2 Accent 6" w:uiPriority="64"/>
+    <w:lsdException w:name="Medium List 1 Accent 6" w:uiPriority="65"/>
+    <w:lsdException w:name="Medium List 2 Accent 6" w:uiPriority="66"/>
+    <w:lsdException w:name="Medium Grid 1 Accent 6" w:uiPriority="67"/>
+    <w:lsdException w:name="Medium Grid 2 Accent 6" w:uiPriority="68"/>
+    <w:lsdException w:name="Medium Grid 3 Accent 6" w:uiPriority="69"/>
+    <w:lsdException w:name="Dark List Accent 6" w:uiPriority="70"/>
+    <w:lsdException w:name="Colorful Shading Accent 6" w:uiPriority="71"/>
+    <w:lsdException w:name="Colorful List Accent 6" w:uiPriority="72"/>
+    <w:lsdException w:name="Colorful Grid Accent 6" w:uiPriority="73"/>
+    <w:lsdException w:name="Subtle Emphasis" w:uiPriority="19" w:qFormat="1"/>
+    <w:lsdException w:name="Intense Emphasis" w:uiPriority="21" w:qFormat="1"/>
+    <w:lsdException w:name="Subtle Reference" w:uiPriority="31" w:qFormat="1"/>
+    <w:lsdException w:name="Intense Reference" w:uiPriority="32" w:qFormat="1"/>
+    <w:lsdException w:name="Book Title" w:uiPriority="33" w:qFormat="1"/>
+    <w:lsdException w:name="Bibliography" w:semiHidden="1" w:uiPriority="37" w:unhideWhenUsed="1"/>
+    <w:lsdException w:name="TOC Heading" w:semiHidden="1" w:uiPriority="39" w:unhideWhenUsed="1" w:qFormat="1"/>
+    <w:lsdException w:name="Plain Table 1" w:uiPriority="41"/>
+    <w:lsdException w:name="Plain Table 2" w:uiPriority="42"/>
+    <w:lsdException w:name="Plain Table 3" w:uiPriority="43"/>
+    <w:lsdException w:name="Plain Table 4" w:uiPriority="44"/>
+    <w:lsdException w:name="Plain Table 5" w:uiPriority="45"/>
+    <w:lsdException w:name="Grid Table Light" w:uiPriority="40"/>
+    <w:lsdException w:name="Grid Table 1 Light" w:uiPriority="46"/>
+    <w:lsdException w:name="Grid Table 2" w:uiPriority="47"/>
+    <w:lsdException w:name="Grid Table 3" w:uiPriority="48"/>
+    <w:lsdException w:name="Grid Table 4" w:uiPriority="49"/>
+    <w:lsdException w:name="Grid Table 5 Dark" w:uiPriority="50"/>
+    <w:lsdException w:name="Grid Table 6 Colorful" w:uiPriority="51"/>
+    <w:lsdException w:name="Grid Table 7 Colorful" w:uiPriority="52"/>
+    <w:lsdException w:name="Grid Table 1 Light Accent 1" w:uiPriority="46"/>
+    <w:lsdException w:name="Grid Table 2 Accent 1" w:uiPriority="47"/>
+    <w:lsdException w:name="Grid Table 3 Accent 1" w:uiPriority="48"/>
+    <w:lsdException w:name="Grid Table 4 Accent 1" w:uiPriority="49"/>
+    <w:lsdException w:name="Grid Table 5 Dark Accent 1" w:uiPriority="50"/>
+    <w:lsdException w:name="Grid Table 6 Colorful Accent 1" w:uiPriority="51"/>
+    <w:lsdException w:name="Grid Table 7 Colorful Accent 1" w:uiPriority="52"/>
+    <w:lsdException w:name="Grid Table 1 Light Accent 2" w:uiPriority="46"/>
+    <w:lsdException w:name="Grid Table 2 Accent 2" w:uiPriority="47"/>
+    <w:lsdException w:name="Grid Table 3 Accent 2" w:uiPriority="48"/>
+    <w:lsdException w:name="Grid Table 4 Accent 2" w:uiPriority="49"/>
+    <w:lsdException w:name="Grid Table 5 Dark Accent 2" w:uiPriority="50"/>
+    <w:lsdException w:name="Grid Table 6 Colorful Accent 2" w:uiPriority="51"/>
+    <w:lsdException w:name="Grid Table 7 Colorful Accent 2" w:uiPriority="52"/>
+    <w:lsdException w:name="Grid Table 1 Light Accent 3" w:uiPriority="46"/>
+    <w:lsdException w:name="Grid Table 2 Accent 3" w:uiPriority="47"/>
+    <w:lsdException w:name="Grid Table 3 Accent 3" w:uiPriority="48"/>
+    <w:lsdException w:name="Grid Table 4 Accent 3" w:uiPriority="49"/>
+    <w:lsdException w:name="Grid Table 5 Dark Accent 3" w:uiPriority="50"/>
+    <w:lsdException w:name="Grid Table 6 Colorful Accent 3" w:uiPriority="51"/>
+    <w:lsdException w:name="Grid Table 7 Colorful Accent 3" w:uiPriority="52"/>
+    <w:lsdException w:name="Grid Table 1 Light Accent 4" w:uiPriority="46"/>
+    <w:lsdException w:name="Grid Table 2 Accent 4" w:uiPriority="47"/>
+    <w:lsdException w:name="Grid Table 3 Accent 4" w:uiPriority="48"/>
+    <w:lsdException w:name="Grid Table 4 Accent 4" w:uiPriority="49"/>
+    <w:lsdException w:name="Grid Table 5 Dark Accent 4" w:uiPriority="50"/>
+    <w:lsdException w:name="Grid Table 6 Colorful Accent 4" w:uiPriority="51"/>
+    <w:lsdException w:name="Grid Table 7 Colorful Accent 4" w:uiPriority="52"/>
+    <w:lsdException w:name="Grid Table 1 Light Accent 5" w:uiPriority="46"/>
+    <w:lsdException w:name="Grid Table 2 Accent 5" w:uiPriority="47"/>
+    <w:lsdException w:name="Grid Table 3 Accent 5" w:uiPriority="48"/>
+    <w:lsdException w:name="Grid Table 4 Accent 5" w:uiPriority="49"/>
+    <w:lsdException w:name="Grid Table 5 Dark Accent 5" w:uiPriority="50"/>
+    <w:lsdException w:name="Grid Table 6 Colorful Accent 5" w:uiPriority="51"/>
+    <w:lsdException w:name="Grid Table 7 Colorful Accent 5" w:uiPriority="52"/>
+    <w:lsdException w:name="Grid Table 1 Light Accent 6" w:uiPriority="46"/>
+    <w:lsdException w:name="Grid Table 2 Accent 6" w:uiPriority="47"/>
+    <w:lsdException w:name="Grid Table 3 Accent 6" w:uiPriority="48"/>
+    <w:lsdException w:name="Grid Table 4 Accent 6" w:uiPriority="49"/>
+    <w:lsdException w:name="Grid Table 5 Dark Accent 6" w:uiPriority="50"/>
+    <w:lsdException w:name="Grid Table 6 Colorful Accent 6" w:uiPriority="51"/>
+    <w:lsdException w:name="Grid Table 7 Colorful Accent 6" w:uiPriority="52"/>
+    <w:lsdException w:name="List Table 1 Light" w:uiPriority="46"/>
+    <w:lsdException w:name="List Table 2" w:uiPriority="47"/>
+    <w:lsdException w:name="List Table 3" w:uiPriority="48"/>
+    <w:lsdException w:name="List Table 4" w:uiPriority="49"/>
+    <w:lsdException w:name="List Table 5 Dark" w:uiPriority="50"/>
+    <w:lsdException w:name="List Table 6 Colorful" w:uiPriority="51"/>
+    <w:lsdException w:name="List Table 7 Colorful" w:uiPriority="52"/>
+    <w:lsdException w:name="List Table 1 Light Accent 1" w:uiPriority="46"/>
+    <w:lsdException w:name="List Table 2 Accent 1" w:uiPriority="47"/>
+    <w:lsdException w:name="List Table 3 Accent 1" w:uiPriority="48"/>
+    <w:lsdException w:name="List Table 4 Accent 1" w:uiPriority="49"/>
+    <w:lsdException w:name="List Table 5 Dark Accent 1" w:uiPriority="50"/>
+    <w:lsdException w:name="List Table 6 Colorful Accent 1" w:uiPriority="51"/>
+    <w:lsdException w:name="List Table 7 Colorful Accent 1" w:uiPriority="52"/>
+    <w:lsdException w:name="List Table 1 Light Accent 2" w:uiPriority="46"/>
+    <w:lsdException w:name="List Table 2 Accent 2" w:uiPriority="47"/>
+    <w:lsdException w:name="List Table 3 Accent 2" w:uiPriority="48"/>
+    <w:lsdException w:name="List Table 4 Accent 2" w:uiPriority="49"/>
+    <w:lsdException w:name="List Table 5 Dark Accent 2" w:uiPriority="50"/>
+    <w:lsdException w:name="List Table 6 Colorful Accent 2" w:uiPriority="51"/>
+    <w:lsdException w:name="List Table 7 Colorful Accent 2" w:uiPriority="52"/>
+    <w:lsdException w:name="List Table 1 Light Accent 3" w:uiPriority="46"/>
+    <w:lsdException w:name="List Table 2 Accent 3" w:uiPriority="47"/>
+    <w:lsdException w:name="List Table 3 Accent 3" w:uiPriority="48"/>
+    <w:lsdException w:name="List Table 4 Accent 3" w:uiPriority="49"/>
+    <w:lsdException w:name="List Table 5 Dark Accent 3" w:uiPriority="50"/>
+    <w:lsdException w:name="List Table 6 Colorful Accent 3" w:uiPriority="51"/>
+    <w:lsdException w:name="List Table 7 Colorful Accent 3" w:uiPriority="52"/>
+    <w:lsdException w:name="List Table 1 Light Accent 4" w:uiPriority="46"/>
+    <w:lsdException w:name="List Table 2 Accent 4" w:uiPriority="47"/>
+    <w:lsdException w:name="List Table 3 Accent 4" w:uiPriority="48"/>
+    <w:lsdException w:name="List Table 4 Accent 4" w:uiPriority="49"/>
+    <w:lsdException w:name="List Table 5 Dark Accent 4" w:uiPriority="50"/>
+    <w:lsdException w:name="List Table 6 Colorful Accent 4" w:uiPriority="51"/>
+    <w:lsdException w:name="List Table 7 Colorful Accent 4" w:uiPriority="52"/>
+    <w:lsdException w:name="List Table 1 Light Accent 5" w:uiPriority="46"/>
+    <w:lsdException w:name="List Table 2 Accent 5" w:uiPriority="47"/>
+    <w:lsdException w:name="List Table 3 Accent 5" w:uiPriority="48"/>
+    <w:lsdException w:name="List Table 4 Accent 5" w:uiPriority="49"/>
+    <w:lsdException w:name="List Table 5 Dark Accent 5" w:uiPriority="50"/>
+    <w:lsdException w:name="List Table 6 Colorful Accent 5" w:uiPriority="51"/>
+    <w:lsdException w:name="List Table 7 Colorful Accent 5" w:uiPriority="52"/>
+    <w:lsdException w:name="List Table 1 Light Accent 6" w:uiPriority="46"/>
+    <w:lsdException w:name="List Table 2 Accent 6" w:uiPriority="47"/>
+    <w:lsdException w:name="List Table 3 Accent 6" w:uiPriority="48"/>
+    <w:lsdException w:name="List Table 4 Accent 6" w:uiPriority="49"/>
+    <w:lsdException w:name="List Table 5 Dark Accent 6" w:uiPriority="50"/>
+    <w:lsdException w:name="List Table 6 Colorful Accent 6" w:uiPriority="51"/>
+    <w:lsdException w:name="List Table 7 Colorful Accent 6" w:uiPriority="52"/>
+    <w:lsdException w:name="Mention" w:semiHidden="1" w:unhideWhenUsed="1"/>
+    <w:lsdException w:name="Smart Hyperlink" w:semiHidden="1" w:unhideWhenUsed="1"/>
+    <w:lsdException w:name="Hashtag" w:semiHidden="1" w:unhideWhenUsed="1"/>
+    <w:lsdException w:name="Unresolved Mention" w:semiHidden="1" w:unhideWhenUsed="1"/>
+    <w:lsdException w:name="Smart Link" w:semiHidden="1" w:unhideWhenUsed="1"/>
   </w:latentStyles>
-  <w:style w:type="paragraph" w:default="1" w:styleId="1">
+  <w:style w:type="paragraph" w:default="1" w:styleId="a">
     <w:name w:val="Normal"/>
     <w:qFormat/>
-    <w:uiPriority w:val="0"/>
     <w:pPr>
       <w:widowControl w:val="0"/>
       <w:jc w:val="both"/>
     </w:pPr>
     <w:rPr>
-      <w:rFonts w:asciiTheme="minorHAnsi" w:hAnsiTheme="minorHAnsi" w:eastAsiaTheme="minorEastAsia" w:cstheme="minorBidi"/>
       <w:kern w:val="2"/>
       <w:sz w:val="21"/>
       <w:szCs w:val="22"/>
-      <w:lang w:val="en-US" w:eastAsia="zh-CN" w:bidi="ar-SA"/>
     </w:rPr>
   </w:style>
   <w:style w:type="paragraph" w:styleId="2">
     <w:name w:val="heading 2"/>
-    <w:basedOn w:val="1"/>
-    <w:next w:val="1"/>
-    <w:link w:val="14"/>
+    <w:basedOn w:val="a"/>
+    <w:next w:val="a"/>
+    <w:link w:val="20"/>
     <w:qFormat/>
-    <w:uiPriority w:val="0"/>
     <w:pPr>
       <w:keepNext/>
       <w:keepLines/>
@@ -3295,25 +3725,26 @@
       <w:outlineLvl w:val="1"/>
     </w:pPr>
     <w:rPr>
-      <w:rFonts w:ascii="Arial" w:hAnsi="Arial" w:eastAsia="黑体" w:cs="Times New Roman"/>
+      <w:rFonts w:ascii="Arial" w:eastAsia="黑体" w:hAnsi="Arial" w:cs="Times New Roman"/>
       <w:b/>
       <w:bCs/>
       <w:sz w:val="32"/>
       <w:szCs w:val="32"/>
     </w:rPr>
   </w:style>
-  <w:style w:type="character" w:default="1" w:styleId="8">
+  <w:style w:type="character" w:default="1" w:styleId="a0">
     <w:name w:val="Default Paragraph Font"/>
+    <w:uiPriority w:val="1"/>
     <w:semiHidden/>
     <w:unhideWhenUsed/>
-    <w:uiPriority w:val="1"/>
   </w:style>
-  <w:style w:type="table" w:default="1" w:styleId="6">
+  <w:style w:type="table" w:default="1" w:styleId="a1">
     <w:name w:val="Normal Table"/>
+    <w:uiPriority w:val="99"/>
     <w:semiHidden/>
     <w:unhideWhenUsed/>
-    <w:uiPriority w:val="99"/>
     <w:tblPr>
+      <w:tblInd w:w="0" w:type="dxa"/>
       <w:tblCellMar>
         <w:top w:w="0" w:type="dxa"/>
         <w:left w:w="108" w:type="dxa"/>
@@ -3322,25 +3753,31 @@
       </w:tblCellMar>
     </w:tblPr>
   </w:style>
-  <w:style w:type="paragraph" w:styleId="3">
+  <w:style w:type="numbering" w:default="1" w:styleId="a2">
+    <w:name w:val="No List"/>
+    <w:uiPriority w:val="99"/>
+    <w:semiHidden/>
+    <w:unhideWhenUsed/>
+  </w:style>
+  <w:style w:type="paragraph" w:styleId="a3">
     <w:name w:val="caption"/>
-    <w:basedOn w:val="1"/>
-    <w:next w:val="1"/>
+    <w:basedOn w:val="a"/>
+    <w:next w:val="a"/>
+    <w:uiPriority w:val="35"/>
     <w:unhideWhenUsed/>
     <w:qFormat/>
-    <w:uiPriority w:val="35"/>
     <w:rPr>
-      <w:rFonts w:eastAsia="黑体" w:asciiTheme="majorHAnsi" w:hAnsiTheme="majorHAnsi" w:cstheme="majorBidi"/>
+      <w:rFonts w:asciiTheme="majorHAnsi" w:eastAsia="黑体" w:hAnsiTheme="majorHAnsi" w:cstheme="majorBidi"/>
       <w:sz w:val="20"/>
       <w:szCs w:val="20"/>
     </w:rPr>
   </w:style>
-  <w:style w:type="paragraph" w:styleId="4">
+  <w:style w:type="paragraph" w:styleId="a4">
     <w:name w:val="footer"/>
-    <w:basedOn w:val="1"/>
-    <w:link w:val="12"/>
+    <w:basedOn w:val="a"/>
+    <w:link w:val="a5"/>
+    <w:uiPriority w:val="99"/>
     <w:unhideWhenUsed/>
-    <w:uiPriority w:val="99"/>
     <w:pPr>
       <w:tabs>
         <w:tab w:val="center" w:pos="4153"/>
@@ -3354,15 +3791,15 @@
       <w:szCs w:val="18"/>
     </w:rPr>
   </w:style>
-  <w:style w:type="paragraph" w:styleId="5">
+  <w:style w:type="paragraph" w:styleId="a6">
     <w:name w:val="header"/>
-    <w:basedOn w:val="1"/>
-    <w:link w:val="11"/>
+    <w:basedOn w:val="a"/>
+    <w:link w:val="a7"/>
+    <w:uiPriority w:val="99"/>
     <w:unhideWhenUsed/>
-    <w:uiPriority w:val="99"/>
     <w:pPr>
       <w:pBdr>
-        <w:bottom w:val="single" w:color="auto" w:sz="6" w:space="1"/>
+        <w:bottom w:val="single" w:sz="6" w:space="1" w:color="auto"/>
       </w:pBdr>
       <w:tabs>
         <w:tab w:val="center" w:pos="4153"/>
@@ -3376,80 +3813,79 @@
       <w:szCs w:val="18"/>
     </w:rPr>
   </w:style>
-  <w:style w:type="table" w:styleId="7">
+  <w:style w:type="table" w:styleId="a8">
     <w:name w:val="Table Grid"/>
-    <w:basedOn w:val="6"/>
+    <w:basedOn w:val="a1"/>
+    <w:uiPriority w:val="39"/>
     <w:qFormat/>
-    <w:uiPriority w:val="39"/>
     <w:tblPr>
       <w:tblBorders>
-        <w:top w:val="single" w:color="auto" w:sz="4" w:space="0"/>
-        <w:left w:val="single" w:color="auto" w:sz="4" w:space="0"/>
-        <w:bottom w:val="single" w:color="auto" w:sz="4" w:space="0"/>
-        <w:right w:val="single" w:color="auto" w:sz="4" w:space="0"/>
-        <w:insideH w:val="single" w:color="auto" w:sz="4" w:space="0"/>
-        <w:insideV w:val="single" w:color="auto" w:sz="4" w:space="0"/>
+        <w:top w:val="single" w:sz="4" w:space="0" w:color="auto"/>
+        <w:left w:val="single" w:sz="4" w:space="0" w:color="auto"/>
+        <w:bottom w:val="single" w:sz="4" w:space="0" w:color="auto"/>
+        <w:right w:val="single" w:sz="4" w:space="0" w:color="auto"/>
+        <w:insideH w:val="single" w:sz="4" w:space="0" w:color="auto"/>
+        <w:insideV w:val="single" w:sz="4" w:space="0" w:color="auto"/>
       </w:tblBorders>
     </w:tblPr>
   </w:style>
-  <w:style w:type="character" w:styleId="9">
+  <w:style w:type="character" w:styleId="a9">
     <w:name w:val="Strong"/>
-    <w:basedOn w:val="8"/>
+    <w:basedOn w:val="a0"/>
+    <w:uiPriority w:val="22"/>
     <w:qFormat/>
-    <w:uiPriority w:val="22"/>
     <w:rPr>
       <w:b/>
       <w:bCs/>
     </w:rPr>
   </w:style>
-  <w:style w:type="character" w:styleId="10">
+  <w:style w:type="character" w:styleId="HTML">
     <w:name w:val="HTML Code"/>
-    <w:basedOn w:val="8"/>
+    <w:basedOn w:val="a0"/>
+    <w:uiPriority w:val="99"/>
     <w:semiHidden/>
     <w:unhideWhenUsed/>
-    <w:uiPriority w:val="99"/>
     <w:rPr>
-      <w:rFonts w:ascii="宋体" w:hAnsi="宋体" w:eastAsia="宋体" w:cs="宋体"/>
+      <w:rFonts w:ascii="宋体" w:eastAsia="宋体" w:hAnsi="宋体" w:cs="宋体"/>
       <w:sz w:val="24"/>
       <w:szCs w:val="24"/>
     </w:rPr>
   </w:style>
-  <w:style w:type="character" w:customStyle="1" w:styleId="11">
+  <w:style w:type="character" w:customStyle="1" w:styleId="a7">
     <w:name w:val="页眉 字符"/>
-    <w:basedOn w:val="8"/>
-    <w:link w:val="5"/>
+    <w:basedOn w:val="a0"/>
+    <w:link w:val="a6"/>
     <w:uiPriority w:val="99"/>
     <w:rPr>
       <w:sz w:val="18"/>
       <w:szCs w:val="18"/>
     </w:rPr>
   </w:style>
-  <w:style w:type="character" w:customStyle="1" w:styleId="12">
+  <w:style w:type="character" w:customStyle="1" w:styleId="a5">
     <w:name w:val="页脚 字符"/>
-    <w:basedOn w:val="8"/>
-    <w:link w:val="4"/>
+    <w:basedOn w:val="a0"/>
+    <w:link w:val="a4"/>
     <w:uiPriority w:val="99"/>
     <w:rPr>
       <w:sz w:val="18"/>
       <w:szCs w:val="18"/>
     </w:rPr>
   </w:style>
-  <w:style w:type="paragraph" w:styleId="13">
+  <w:style w:type="paragraph" w:styleId="aa">
     <w:name w:val="List Paragraph"/>
-    <w:basedOn w:val="1"/>
+    <w:basedOn w:val="a"/>
+    <w:uiPriority w:val="34"/>
     <w:qFormat/>
-    <w:uiPriority w:val="34"/>
     <w:pPr>
-      <w:ind w:firstLine="420" w:firstLineChars="200"/>
+      <w:ind w:firstLineChars="200" w:firstLine="420"/>
     </w:pPr>
   </w:style>
-  <w:style w:type="character" w:customStyle="1" w:styleId="14">
+  <w:style w:type="character" w:customStyle="1" w:styleId="20">
     <w:name w:val="标题 2 字符"/>
-    <w:basedOn w:val="8"/>
+    <w:basedOn w:val="a0"/>
     <w:link w:val="2"/>
-    <w:uiPriority w:val="0"/>
     <w:rPr>
-      <w:rFonts w:ascii="Arial" w:hAnsi="Arial" w:eastAsia="黑体" w:cs="Times New Roman"/>
+      <w:rFonts w:ascii="Arial" w:eastAsia="黑体" w:hAnsi="Arial" w:cs="Times New Roman"/>
       <w:b/>
       <w:bCs/>
       <w:sz w:val="32"/>
@@ -3711,6 +4147,7 @@
     </a:fmtScheme>
   </a:themeElements>
   <a:objectDefaults/>
+  <a:extraClrSchemeLst/>
 </a:theme>
 </file>
 
@@ -3720,6 +4157,8 @@
 
 <file path=customXml/itemProps1.xml><?xml version="1.0" encoding="utf-8"?>
 <ds:datastoreItem xmlns:ds="http://schemas.openxmlformats.org/officeDocument/2006/customXml" ds:itemID="{B1D8C0FB-7BF1-44D5-9F27-75219381D875}">
-  <ds:schemaRefs/>
+  <ds:schemaRefs>
+    <ds:schemaRef ds:uri="http://schemas.openxmlformats.org/officeDocument/2006/bibliography"/>
+  </ds:schemaRefs>
 </ds:datastoreItem>
 </file>
</xml_diff>

<commit_message>
refactor: remove deprecated utility functions and unused helper modules
</commit_message>
<xml_diff>
--- a/大作业文档.docx
+++ b/大作业文档.docx
@@ -309,6 +309,62 @@
       <w:r>
         <w:rPr>
           <w:rFonts w:ascii="Times New Roman" w:eastAsia="宋体" w:hAnsi="Times New Roman" w:cs="Times New Roman"/>
+          <w:szCs w:val="24"/>
+        </w:rPr>
+        <w:fldChar w:fldCharType="separate"/>
+      </w:r>
+      <w:r>
+        <w:rPr>
+          <w:rFonts w:ascii="Times New Roman" w:eastAsia="宋体" w:hAnsi="Times New Roman" w:cs="Times New Roman"/>
+          <w:noProof/>
+          <w:szCs w:val="24"/>
+        </w:rPr>
+        <w:fldChar w:fldCharType="begin"/>
+      </w:r>
+      <w:r>
+        <w:rPr>
+          <w:rFonts w:ascii="Times New Roman" w:eastAsia="宋体" w:hAnsi="Times New Roman" w:cs="Times New Roman"/>
+          <w:noProof/>
+          <w:szCs w:val="24"/>
+        </w:rPr>
+        <w:instrText xml:space="preserve"> </w:instrText>
+      </w:r>
+      <w:r>
+        <w:rPr>
+          <w:rFonts w:ascii="Times New Roman" w:eastAsia="宋体" w:hAnsi="Times New Roman" w:cs="Times New Roman" w:hint="eastAsia"/>
+          <w:noProof/>
+          <w:szCs w:val="24"/>
+        </w:rPr>
+        <w:instrText>INCLUDEPICTURE  "/Users/../</w:instrText>
+      </w:r>
+      <w:r>
+        <w:rPr>
+          <w:rFonts w:ascii="Times New Roman" w:eastAsia="宋体" w:hAnsi="Times New Roman" w:cs="Times New Roman" w:hint="eastAsia"/>
+          <w:noProof/>
+          <w:szCs w:val="24"/>
+        </w:rPr>
+        <w:instrText>实践管理科</w:instrText>
+      </w:r>
+      <w:r>
+        <w:rPr>
+          <w:rFonts w:ascii="Times New Roman" w:eastAsia="宋体" w:hAnsi="Times New Roman" w:cs="Times New Roman" w:hint="eastAsia"/>
+          <w:noProof/>
+          <w:szCs w:val="24"/>
+        </w:rPr>
+        <w:instrText>/JNDX_M.GIF" \* MERGEFORMATINET</w:instrText>
+      </w:r>
+      <w:r>
+        <w:rPr>
+          <w:rFonts w:ascii="Times New Roman" w:eastAsia="宋体" w:hAnsi="Times New Roman" w:cs="Times New Roman"/>
+          <w:noProof/>
+          <w:szCs w:val="24"/>
+        </w:rPr>
+        <w:instrText xml:space="preserve"> </w:instrText>
+      </w:r>
+      <w:r>
+        <w:rPr>
+          <w:rFonts w:ascii="Times New Roman" w:eastAsia="宋体" w:hAnsi="Times New Roman" w:cs="Times New Roman"/>
+          <w:noProof/>
           <w:szCs w:val="24"/>
         </w:rPr>
         <w:fldChar w:fldCharType="separate"/>
@@ -339,10 +395,18 @@
             <v:path o:extrusionok="f" gradientshapeok="t" o:connecttype="rect"/>
             <o:lock v:ext="edit" aspectratio="t"/>
           </v:shapetype>
-          <v:shape id="_x0000_i1025" type="#_x0000_t75" alt="" style="width:174.1pt;height:58.35pt;mso-width-percent:0;mso-height-percent:0;mso-width-percent:0;mso-height-percent:0">
+          <v:shape id="_x0000_i1025" type="#_x0000_t75" alt="" style="width:173.55pt;height:58.5pt;mso-width-percent:0;mso-height-percent:0;mso-width-percent:0;mso-height-percent:0">
             <v:imagedata r:id="rId8" r:href="rId9"/>
           </v:shape>
         </w:pict>
+      </w:r>
+      <w:r>
+        <w:rPr>
+          <w:rFonts w:ascii="Times New Roman" w:eastAsia="宋体" w:hAnsi="Times New Roman" w:cs="Times New Roman"/>
+          <w:noProof/>
+          <w:szCs w:val="24"/>
+        </w:rPr>
+        <w:fldChar w:fldCharType="end"/>
       </w:r>
       <w:r>
         <w:rPr>
@@ -1117,25 +1181,47 @@
     </w:p>
     <w:p>
       <w:pPr>
+        <w:wordWrap w:val="0"/>
         <w:spacing w:line="300" w:lineRule="auto"/>
         <w:ind w:firstLineChars="200" w:firstLine="480"/>
         <w:rPr>
-          <w:rFonts w:ascii="Times New Roman" w:eastAsia="宋体" w:hAnsi="Times New Roman"/>
-          <w:sz w:val="24"/>
-          <w:szCs w:val="24"/>
-        </w:rPr>
-      </w:pPr>
-    </w:p>
-    <w:p>
-      <w:pPr>
-        <w:spacing w:line="300" w:lineRule="auto"/>
-        <w:ind w:firstLineChars="200" w:firstLine="480"/>
-        <w:rPr>
-          <w:rFonts w:ascii="Times New Roman" w:eastAsia="宋体" w:hAnsi="Times New Roman"/>
-          <w:sz w:val="24"/>
-          <w:szCs w:val="24"/>
-        </w:rPr>
-      </w:pPr>
+          <w:rFonts w:ascii="Times New Roman" w:eastAsia="宋体" w:hAnsi="Times New Roman" w:hint="eastAsia"/>
+          <w:sz w:val="24"/>
+          <w:szCs w:val="24"/>
+        </w:rPr>
+      </w:pPr>
+      <w:r>
+        <w:rPr>
+          <w:rFonts w:ascii="Times New Roman" w:eastAsia="宋体" w:hAnsi="Times New Roman" w:hint="eastAsia"/>
+          <w:sz w:val="24"/>
+          <w:szCs w:val="24"/>
+        </w:rPr>
+        <w:t>项目</w:t>
+      </w:r>
+      <w:r>
+        <w:rPr>
+          <w:rFonts w:ascii="Times New Roman" w:eastAsia="宋体" w:hAnsi="Times New Roman" w:hint="eastAsia"/>
+          <w:sz w:val="24"/>
+          <w:szCs w:val="24"/>
+        </w:rPr>
+        <w:t>GitHub</w:t>
+      </w:r>
+      <w:r>
+        <w:rPr>
+          <w:rFonts w:ascii="Times New Roman" w:eastAsia="宋体" w:hAnsi="Times New Roman" w:hint="eastAsia"/>
+          <w:sz w:val="24"/>
+          <w:szCs w:val="24"/>
+        </w:rPr>
+        <w:t>地址：</w:t>
+      </w:r>
+      <w:r>
+        <w:rPr>
+          <w:rFonts w:ascii="Times New Roman" w:eastAsia="宋体" w:hAnsi="Times New Roman"/>
+          <w:sz w:val="24"/>
+          <w:szCs w:val="24"/>
+        </w:rPr>
+        <w:t>https://github.com/luqie0106/CampusRPG_Simultaneously</w:t>
+      </w:r>
     </w:p>
     <w:p>
       <w:pPr>
@@ -1158,6 +1244,14 @@
         </w:rPr>
         <w:t>项目特色与创新</w:t>
       </w:r>
+    </w:p>
+    <w:p/>
+    <w:p>
+      <w:pPr>
+        <w:rPr>
+          <w:rFonts w:hint="eastAsia"/>
+        </w:rPr>
+      </w:pPr>
     </w:p>
     <w:p>
       <w:pPr>
@@ -1588,6 +1682,15 @@
             <w:tcW w:w="1984" w:type="dxa"/>
             <w:vAlign w:val="center"/>
           </w:tcPr>
+          <w:p>
+            <w:pPr>
+              <w:spacing w:line="300" w:lineRule="auto"/>
+              <w:rPr>
+                <w:rFonts w:ascii="Times New Roman" w:eastAsia="宋体" w:hAnsi="Times New Roman" w:hint="eastAsia"/>
+                <w:sz w:val="24"/>
+              </w:rPr>
+            </w:pPr>
+          </w:p>
           <w:p>
             <w:pPr>
               <w:spacing w:line="300" w:lineRule="auto"/>
@@ -4033,15 +4136,6 @@
         </w:rPr>
         <w:t>则在界面上以图形化列表的形式动态展示当前的任务进展。</w:t>
       </w:r>
-    </w:p>
-    <w:p>
-      <w:pPr>
-        <w:spacing w:after="120" w:line="300" w:lineRule="auto"/>
-        <w:rPr>
-          <w:rFonts w:ascii="Times New Roman" w:eastAsia="宋体" w:hAnsi="Times New Roman"/>
-          <w:sz w:val="24"/>
-        </w:rPr>
-      </w:pPr>
     </w:p>
     <w:p>
       <w:pPr>
@@ -4104,6 +4198,30 @@
     <w:p>
       <w:pPr>
         <w:spacing w:after="120" w:line="300" w:lineRule="auto"/>
+        <w:jc w:val="center"/>
+        <w:rPr>
+          <w:rFonts w:ascii="Times New Roman" w:eastAsia="宋体" w:hAnsi="Times New Roman" w:hint="eastAsia"/>
+          <w:sz w:val="24"/>
+        </w:rPr>
+      </w:pPr>
+      <w:r>
+        <w:rPr>
+          <w:rFonts w:ascii="Times New Roman" w:eastAsia="宋体" w:hAnsi="Times New Roman" w:hint="eastAsia"/>
+          <w:sz w:val="24"/>
+        </w:rPr>
+        <w:t>UML</w:t>
+      </w:r>
+      <w:r>
+        <w:rPr>
+          <w:rFonts w:ascii="Times New Roman" w:eastAsia="宋体" w:hAnsi="Times New Roman" w:hint="eastAsia"/>
+          <w:sz w:val="24"/>
+        </w:rPr>
+        <w:t>类图</w:t>
+      </w:r>
+    </w:p>
+    <w:p>
+      <w:pPr>
+        <w:spacing w:after="120" w:line="300" w:lineRule="auto"/>
         <w:ind w:firstLine="480"/>
       </w:pPr>
       <w:r>
@@ -6946,6 +7064,7 @@
     </w:p>
     <w:p>
       <w:pPr>
+        <w:wordWrap w:val="0"/>
         <w:spacing w:line="300" w:lineRule="auto"/>
         <w:ind w:firstLineChars="200" w:firstLine="480"/>
         <w:rPr>
@@ -6960,7 +7079,7 @@
           <w:sz w:val="24"/>
           <w:szCs w:val="24"/>
         </w:rPr>
-        <w:t xml:space="preserve">[4] Tiled Map Editor. Tiled Documentation [EB/OL]. </w:t>
+        <w:t>[4] Tiled Map Editor. Tiled Documentation [EB/OL]. https://doc.mapeditor.o</w:t>
       </w:r>
       <w:r>
         <w:rPr>
@@ -6969,11 +7088,12 @@
           <w:szCs w:val="24"/>
         </w:rPr>
         <w:lastRenderedPageBreak/>
-        <w:t xml:space="preserve">https://doc.mapeditor.org/en/stable/, 2026. </w:t>
-      </w:r>
-    </w:p>
-    <w:p>
-      <w:pPr>
+        <w:t xml:space="preserve">rg/en/stable/, 2026. </w:t>
+      </w:r>
+    </w:p>
+    <w:p>
+      <w:pPr>
+        <w:wordWrap w:val="0"/>
         <w:spacing w:line="300" w:lineRule="auto"/>
         <w:ind w:firstLineChars="200" w:firstLine="480"/>
         <w:rPr>

</xml_diff>